<commit_message>
Journal: Phases 14-17 in one pass. The student agent and its guardrails with the judge contradiction capture, bake-off round one with the head-to-head table, the Ollama upgrade and round two with the first-fail and revision captures, and grading my own answers with the adopted judge plus the ten green agent tests
</commit_message>
<xml_diff>
--- a/docs/Project Journal - J_AI.docx
+++ b/docs/Project Journal - J_AI.docx
@@ -2936,6 +2936,834 @@
           <w:b w:val="0"/>
         </w:rPr>
         <w:t>A bigger judge is not automatically a better judge. Calibrating a new judge model against answers with known correct verdicts is now the standing procedure before trusting it, and the system remains fully local, free, and uninterruptible.</w:t>
+      </w:r>
+    </w:p>
+    <w:p>
+      <w:pPr/>
+      <w:r>
+        <w:rPr>
+          <w:b/>
+        </w:rPr>
+        <w:t>Phase 14 — The Student Agent: the Examiner Becomes a Tool</w:t>
+      </w:r>
+    </w:p>
+    <w:p>
+      <w:pPr/>
+      <w:r>
+        <w:rPr>
+          <w:b w:val="0"/>
+        </w:rPr>
+        <w:t>Built the first agent in J_AI. The OllamaProvider gained a chat method that speaks the chat endpoint with tool definitions, and jai/agent/student.py runs the loop on top of it: the model drafts an answer, calls the submit_answer tool, reads the verdict that comes back, revises, and repeats until it passes or spends its budget of 5 submissions. Guardrails from day one: a step cap so the loop always terminates, a nudge cap for a model that keeps talking instead of calling the tool, refusal of any unknown tool name, and the rule that only a graded submission counts as an attempt.</w:t>
+      </w:r>
+    </w:p>
+    <w:p>
+      <w:pPr/>
+      <w:r>
+        <w:rPr>
+          <w:b w:val="0"/>
+        </w:rPr>
+        <w:t>Then tried to break it, which is how an agent should be tested. The nudge guard earned its place immediately: in five of the eight counted runs the model tried to answer in plain text without ever calling the tool, and the guard pushed it back every time. A second find: after passing, the model liked to rewrite its answer inside the closing message, so the recorded final answer is now always the best graded attempt, never the unguarded epilogue. One run also derailed into a revision written entirely in Thai, which the strict marking failed on content grounds anyway.</w:t>
+      </w:r>
+    </w:p>
+    <w:p>
+      <w:pPr/>
+      <w:r>
+        <w:rPr>
+          <w:b w:val="0"/>
+        </w:rPr>
+        <w:t>The biggest finding was about the judge, not the student. On LOG_001 the qwen2.5:14b judge returned a pass verdict while its own verdict listed four of the five required points as missing, with min_points set at 5. The verdict field is simply not tied to the marking scheme the judge was handed:</w:t>
+      </w:r>
+    </w:p>
+    <w:p>
+      <w:r>
+        <w:drawing>
+          <wp:inline xmlns:a="http://schemas.openxmlformats.org/drawingml/2006/main" xmlns:pic="http://schemas.openxmlformats.org/drawingml/2006/picture">
+            <wp:extent cx="5760720" cy="1952244"/>
+            <wp:docPr id="1758724910" name="Picture 1758724910"/>
+            <wp:cNvGraphicFramePr>
+              <a:graphicFrameLocks noChangeAspect="1"/>
+            </wp:cNvGraphicFramePr>
+            <a:graphic>
+              <a:graphicData uri="http://schemas.openxmlformats.org/drawingml/2006/picture">
+                <pic:pic>
+                  <pic:nvPicPr>
+                    <pic:cNvPr id="0" name="p14_contradiction.png"/>
+                    <pic:cNvPicPr/>
+                  </pic:nvPicPr>
+                  <pic:blipFill>
+                    <a:blip r:embed="rId29"/>
+                    <a:stretch>
+                      <a:fillRect/>
+                    </a:stretch>
+                  </pic:blipFill>
+                  <pic:spPr>
+                    <a:xfrm>
+                      <a:off x="0" y="0"/>
+                      <a:ext cx="5760720" cy="1952244"/>
+                    </a:xfrm>
+                    <a:prstGeom prst="rect"/>
+                  </pic:spPr>
+                </pic:pic>
+              </a:graphicData>
+            </a:graphic>
+          </wp:inline>
+        </w:drawing>
+      </w:r>
+    </w:p>
+    <w:p>
+      <w:pPr/>
+      <w:r>
+        <w:rPr>
+          <w:b w:val="0"/>
+        </w:rPr>
+        <w:t>Because of that, the agent got a --strict mode that applies the min_points count on the agent side and overrides a lenient judge. Under strict marking the loop behaves honestly: the judge keeps saying pass, strict keeps saying not yet, and the run ends by the guard instead of by flattery:</w:t>
+      </w:r>
+    </w:p>
+    <w:p>
+      <w:r>
+        <w:drawing>
+          <wp:inline xmlns:a="http://schemas.openxmlformats.org/drawingml/2006/main" xmlns:pic="http://schemas.openxmlformats.org/drawingml/2006/picture">
+            <wp:extent cx="5760720" cy="997048"/>
+            <wp:docPr id="1758724911" name="Picture 1758724911"/>
+            <wp:cNvGraphicFramePr>
+              <a:graphicFrameLocks noChangeAspect="1"/>
+            </wp:cNvGraphicFramePr>
+            <a:graphic>
+              <a:graphicData uri="http://schemas.openxmlformats.org/drawingml/2006/picture">
+                <pic:pic>
+                  <pic:nvPicPr>
+                    <pic:cNvPr id="0" name="p14_strict.png"/>
+                    <pic:cNvPicPr/>
+                  </pic:nvPicPr>
+                  <pic:blipFill>
+                    <a:blip r:embed="rId30"/>
+                    <a:stretch>
+                      <a:fillRect/>
+                    </a:stretch>
+                  </pic:blipFill>
+                  <pic:spPr>
+                    <a:xfrm>
+                      <a:off x="0" y="0"/>
+                      <a:ext cx="5760720" cy="997048"/>
+                    </a:xfrm>
+                    <a:prstGeom prst="rect"/>
+                  </pic:spPr>
+                </pic:pic>
+              </a:graphicData>
+            </a:graphic>
+          </wp:inline>
+        </w:drawing>
+      </w:r>
+    </w:p>
+    <w:p>
+      <w:pPr>
+        <w:keepNext/>
+        <w:keepLines/>
+      </w:pPr>
+      <w:r>
+        <w:rPr>
+          <w:b/>
+        </w:rPr>
+        <w:t>Result:</w:t>
+      </w:r>
+    </w:p>
+    <w:p>
+      <w:pPr/>
+      <w:r>
+        <w:rPr>
+          <w:b w:val="0"/>
+        </w:rPr>
+        <w:t>J_AI has a working student agent with a step cap, a nudge cap, a submission budget, unknown-tool refusal, and a final answer that is always the best graded attempt. Strict mode applies the min_points check agent-side. Nine run transcripts are saved under runs/agent_misc.</w:t>
+      </w:r>
+    </w:p>
+    <w:p>
+      <w:pPr>
+        <w:keepNext/>
+        <w:keepLines/>
+      </w:pPr>
+      <w:r>
+        <w:rPr>
+          <w:b/>
+        </w:rPr>
+        <w:t>Outcome:</w:t>
+      </w:r>
+    </w:p>
+    <w:p>
+      <w:pPr>
+        <w:keepLines/>
+      </w:pPr>
+      <w:r>
+        <w:rPr>
+          <w:b w:val="0"/>
+        </w:rPr>
+        <w:t>An agent is tested by trying to break it, and the transcripts indicted the judge more than the student: a verdict that ignores its own marking scheme cannot referee a revision loop. Choosing a better judge became the next session.</w:t>
+      </w:r>
+    </w:p>
+    <w:p>
+      <w:pPr/>
+      <w:r>
+        <w:rPr>
+          <w:b/>
+        </w:rPr>
+        <w:t>Phase 15 — Model Bake-off Round One: gpt-oss Takes the Chair</w:t>
+      </w:r>
+    </w:p>
+    <w:p>
+      <w:pPr/>
+      <w:r>
+        <w:rPr>
+          <w:b w:val="0"/>
+        </w:rPr>
+        <w:t>Asked which local model actually does tool calling well. Research said the Qwen 3.x line leads the open models, but pulling one was refused: they need a newer Ollama than the installed 0.17.0. So round one was fought between what this machine could run: qwen2.5:14b against gpt-oss:20b, a 13GB model with tools, thinking, and structured output that fits the RTX 5080.</w:t>
+      </w:r>
+    </w:p>
+    <w:p>
+      <w:pPr/>
+      <w:r>
+        <w:rPr>
+          <w:b w:val="0"/>
+        </w:rPr>
+        <w:t>The architecture was upgraded first so the contest would be fair. The provider factory now understands roles, JAI_JUDGE_MODEL and JAI_STUDENT_MODEL with matching THINK overrides, so the judge and the student can be different models. Verdicts are enforced through VERDICT_SCHEMA passed to Ollama's structured output format, with the old JSON rescue kept as a fallback. Tool messages carry the tool name, and thinking traces flow back into the agent history.</w:t>
+      </w:r>
+    </w:p>
+    <w:p>
+      <w:pPr/>
+      <w:r>
+        <w:rPr>
+          <w:b w:val="0"/>
+        </w:rPr>
+        <w:t>The bake-off itself: all 5 cases, strict marking, the same model playing both student and judge. It was not close. qwen2.5:14b passed nothing, burned 17 submissions and 9 nudges, and 16 of its 17 verdicts were inconsistent with the marking scheme it was shown. gpt-oss:20b passed all five, one submission each, zero nudges, zero inconsistent verdicts, in half the wall time:</w:t>
+      </w:r>
+    </w:p>
+    <w:p>
+      <w:r>
+        <w:drawing>
+          <wp:inline xmlns:a="http://schemas.openxmlformats.org/drawingml/2006/main" xmlns:pic="http://schemas.openxmlformats.org/drawingml/2006/picture">
+            <wp:extent cx="5760720" cy="804425"/>
+            <wp:docPr id="1758724912" name="Picture 1758724912"/>
+            <wp:cNvGraphicFramePr>
+              <a:graphicFrameLocks noChangeAspect="1"/>
+            </wp:cNvGraphicFramePr>
+            <a:graphic>
+              <a:graphicData uri="http://schemas.openxmlformats.org/drawingml/2006/picture">
+                <pic:pic>
+                  <pic:nvPicPr>
+                    <pic:cNvPr id="0" name="p15_tally.png"/>
+                    <pic:cNvPicPr/>
+                  </pic:nvPicPr>
+                  <pic:blipFill>
+                    <a:blip r:embed="rId31"/>
+                    <a:stretch>
+                      <a:fillRect/>
+                    </a:stretch>
+                  </pic:blipFill>
+                  <pic:spPr>
+                    <a:xfrm>
+                      <a:off x="0" y="0"/>
+                      <a:ext cx="5760720" cy="804425"/>
+                    </a:xfrm>
+                    <a:prstGeom prst="rect"/>
+                  </pic:spPr>
+                </pic:pic>
+              </a:graphicData>
+            </a:graphic>
+          </wp:inline>
+        </w:drawing>
+      </w:r>
+    </w:p>
+    <w:tbl>
+      <w:tblPr>
+        <w:tblW w:type="auto" w:w="0"/>
+        <w:tblLayout w:type="fixed"/>
+        <w:tblLook w:firstColumn="1" w:firstRow="1" w:lastColumn="0" w:lastRow="0" w:noHBand="0" w:noVBand="1" w:val="04A0"/>
+        <w:tblBorders>
+          <w:top w:val="single" w:sz="4" w:space="0" w:color="999999"/>
+          <w:left w:val="single" w:sz="4" w:space="0" w:color="999999"/>
+          <w:bottom w:val="single" w:sz="4" w:space="0" w:color="999999"/>
+          <w:right w:val="single" w:sz="4" w:space="0" w:color="999999"/>
+          <w:insideH w:val="single" w:sz="4" w:space="0" w:color="999999"/>
+          <w:insideV w:val="single" w:sz="4" w:space="0" w:color="999999"/>
+        </w:tblBorders>
+      </w:tblPr>
+      <w:tblGrid>
+        <w:gridCol w:w="3120"/>
+        <w:gridCol w:w="3120"/>
+        <w:gridCol w:w="3120"/>
+      </w:tblGrid>
+      <w:tr>
+        <w:tc>
+          <w:tcPr>
+            <w:tcW w:type="dxa" w:w="3888"/>
+          </w:tcPr>
+          <w:p>
+            <w:r>
+              <w:rPr>
+                <w:b/>
+              </w:rPr>
+              <w:t>Measure</w:t>
+            </w:r>
+          </w:p>
+        </w:tc>
+        <w:tc>
+          <w:tcPr>
+            <w:tcW w:type="dxa" w:w="2736"/>
+          </w:tcPr>
+          <w:p>
+            <w:r>
+              <w:rPr>
+                <w:b/>
+              </w:rPr>
+              <w:t>qwen2.5:14b</w:t>
+            </w:r>
+          </w:p>
+        </w:tc>
+        <w:tc>
+          <w:tcPr>
+            <w:tcW w:type="dxa" w:w="2736"/>
+          </w:tcPr>
+          <w:p>
+            <w:r>
+              <w:rPr>
+                <w:b/>
+              </w:rPr>
+              <w:t>gpt-oss:20b think=low</w:t>
+            </w:r>
+          </w:p>
+        </w:tc>
+      </w:tr>
+      <w:tr>
+        <w:tc>
+          <w:tcPr>
+            <w:tcW w:type="dxa" w:w="3888"/>
+          </w:tcPr>
+          <w:p>
+            <w:r>
+              <w:t>Cases passed (strict)</w:t>
+            </w:r>
+          </w:p>
+        </w:tc>
+        <w:tc>
+          <w:tcPr>
+            <w:tcW w:type="dxa" w:w="2736"/>
+          </w:tcPr>
+          <w:p>
+            <w:r>
+              <w:t>0 of 5</w:t>
+            </w:r>
+          </w:p>
+        </w:tc>
+        <w:tc>
+          <w:tcPr>
+            <w:tcW w:type="dxa" w:w="2736"/>
+          </w:tcPr>
+          <w:p>
+            <w:r>
+              <w:t>5 of 5</w:t>
+            </w:r>
+          </w:p>
+        </w:tc>
+      </w:tr>
+      <w:tr>
+        <w:tc>
+          <w:tcPr>
+            <w:tcW w:type="dxa" w:w="3888"/>
+          </w:tcPr>
+          <w:p>
+            <w:r>
+              <w:t>Submissions used</w:t>
+            </w:r>
+          </w:p>
+        </w:tc>
+        <w:tc>
+          <w:tcPr>
+            <w:tcW w:type="dxa" w:w="2736"/>
+          </w:tcPr>
+          <w:p>
+            <w:r>
+              <w:t>17</w:t>
+            </w:r>
+          </w:p>
+        </w:tc>
+        <w:tc>
+          <w:tcPr>
+            <w:tcW w:type="dxa" w:w="2736"/>
+          </w:tcPr>
+          <w:p>
+            <w:r>
+              <w:t>5</w:t>
+            </w:r>
+          </w:p>
+        </w:tc>
+      </w:tr>
+      <w:tr>
+        <w:tc>
+          <w:tcPr>
+            <w:tcW w:type="dxa" w:w="3888"/>
+          </w:tcPr>
+          <w:p>
+            <w:r>
+              <w:t>Nudges needed</w:t>
+            </w:r>
+          </w:p>
+        </w:tc>
+        <w:tc>
+          <w:tcPr>
+            <w:tcW w:type="dxa" w:w="2736"/>
+          </w:tcPr>
+          <w:p>
+            <w:r>
+              <w:t>9</w:t>
+            </w:r>
+          </w:p>
+        </w:tc>
+        <w:tc>
+          <w:tcPr>
+            <w:tcW w:type="dxa" w:w="2736"/>
+          </w:tcPr>
+          <w:p>
+            <w:r>
+              <w:t>0</w:t>
+            </w:r>
+          </w:p>
+        </w:tc>
+      </w:tr>
+      <w:tr>
+        <w:tc>
+          <w:tcPr>
+            <w:tcW w:type="dxa" w:w="3888"/>
+          </w:tcPr>
+          <w:p>
+            <w:r>
+              <w:t>Verdicts inconsistent with scheme</w:t>
+            </w:r>
+          </w:p>
+        </w:tc>
+        <w:tc>
+          <w:tcPr>
+            <w:tcW w:type="dxa" w:w="2736"/>
+          </w:tcPr>
+          <w:p>
+            <w:r>
+              <w:t>16 of 17</w:t>
+            </w:r>
+          </w:p>
+        </w:tc>
+        <w:tc>
+          <w:tcPr>
+            <w:tcW w:type="dxa" w:w="2736"/>
+          </w:tcPr>
+          <w:p>
+            <w:r>
+              <w:t>0</w:t>
+            </w:r>
+          </w:p>
+        </w:tc>
+      </w:tr>
+      <w:tr>
+        <w:tc>
+          <w:tcPr>
+            <w:tcW w:type="dxa" w:w="3888"/>
+          </w:tcPr>
+          <w:p>
+            <w:r>
+              <w:t>Wall time, all 5 cases</w:t>
+            </w:r>
+          </w:p>
+        </w:tc>
+        <w:tc>
+          <w:tcPr>
+            <w:tcW w:type="dxa" w:w="2736"/>
+          </w:tcPr>
+          <w:p>
+            <w:r>
+              <w:t>373 s</w:t>
+            </w:r>
+          </w:p>
+        </w:tc>
+        <w:tc>
+          <w:tcPr>
+            <w:tcW w:type="dxa" w:w="2736"/>
+          </w:tcPr>
+          <w:p>
+            <w:r>
+              <w:t>196 s</w:t>
+            </w:r>
+          </w:p>
+        </w:tc>
+      </w:tr>
+    </w:tbl>
+    <w:p>
+      <w:pPr/>
+      <w:r>
+        <w:rPr>
+          <w:b w:val="0"/>
+        </w:rPr>
+      </w:r>
+    </w:p>
+    <w:p>
+      <w:pPr/>
+      <w:r>
+        <w:rPr>
+          <w:b w:val="0"/>
+        </w:rPr>
+        <w:t>Before believing the row of tens, the winners were cross-graded: gpt-oss's verdicts followed the scheme on qwen's answers and gave one honest fail, and weak control answers scored 0 with every point listed missing. qwen graded the other direction by passing every gpt-oss answer while still listing a missing point each time, the same contradiction as Phase 14. One caveat went straight into the log: gpt-oss's scores run generous, many tens, so the verdicts are trustworthy but the scores need calibration.</w:t>
+      </w:r>
+    </w:p>
+    <w:p>
+      <w:pPr>
+        <w:keepNext/>
+        <w:keepLines/>
+      </w:pPr>
+      <w:r>
+        <w:rPr>
+          <w:b/>
+        </w:rPr>
+        <w:t>Result:</w:t>
+      </w:r>
+    </w:p>
+    <w:p>
+      <w:pPr/>
+      <w:r>
+        <w:rPr>
+          <w:b w:val="0"/>
+        </w:rPr>
+        <w:t>gpt-oss:20b with think=low became the default for both roles. Judge and student roles live in the provider factory, verdicts are schema-enforced through Ollama's structured output with the JSON rescue as fallback, and the README and USAGE carry the bake-off evidence and the roles section.</w:t>
+      </w:r>
+    </w:p>
+    <w:p>
+      <w:pPr>
+        <w:keepNext/>
+        <w:keepLines/>
+      </w:pPr>
+      <w:r>
+        <w:rPr>
+          <w:b/>
+        </w:rPr>
+        <w:t>Outcome:</w:t>
+      </w:r>
+    </w:p>
+    <w:p>
+      <w:pPr>
+        <w:keepLines/>
+      </w:pPr>
+      <w:r>
+        <w:rPr>
+          <w:b w:val="0"/>
+        </w:rPr>
+        <w:t>The contest decides, not the spec sheet. Measured on my own cases, the smaller model was unusable as a revision-loop judge while gpt-oss ran the whole ladder cleanly at half the time. The same bake-off format is now the entry exam for any new model.</w:t>
+      </w:r>
+    </w:p>
+    <w:p>
+      <w:pPr/>
+      <w:r>
+        <w:rPr>
+          <w:b/>
+        </w:rPr>
+        <w:t>Phase 16 — Ollama Upgrade and Bake-off Round Two: qwen3.8:27b</w:t>
+      </w:r>
+    </w:p>
+    <w:p>
+      <w:pPr/>
+      <w:r>
+        <w:rPr>
+          <w:b w:val="0"/>
+        </w:rPr>
+        <w:t>The round-one research left an open door: the Qwen 3.x models needed a newer Ollama, and system installs are mine to run. I ran the upgrade myself, 0.17.0 to 0.34.0 with sudo, and pulled qwen3.8:27b, a 17GB model with tools, thinking, and vision. Then the exact same bake-off, no favoritism: 5 cases, strict, both roles.</w:t>
+      </w:r>
+    </w:p>
+    <w:p>
+      <w:pPr/>
+      <w:r>
+        <w:rPr>
+          <w:b w:val="0"/>
+        </w:rPr>
+        <w:t>It passed 5 of 5 with zero nudges, but the number that mattered was a 3. On LOG_001 it was the only judge in three rounds that failed a genuinely decent first draft, and it said precisely why: no hierarchical layer model, no addressing plan, no redundancy. That is a marking scheme doing its job:</w:t>
+      </w:r>
+    </w:p>
+    <w:p>
+      <w:r>
+        <w:drawing>
+          <wp:inline xmlns:a="http://schemas.openxmlformats.org/drawingml/2006/main" xmlns:pic="http://schemas.openxmlformats.org/drawingml/2006/picture">
+            <wp:extent cx="5760720" cy="2175591"/>
+            <wp:docPr id="1758724913" name="Picture 1758724913"/>
+            <wp:cNvGraphicFramePr>
+              <a:graphicFrameLocks noChangeAspect="1"/>
+            </wp:cNvGraphicFramePr>
+            <a:graphic>
+              <a:graphicData uri="http://schemas.openxmlformats.org/drawingml/2006/picture">
+                <pic:pic>
+                  <pic:nvPicPr>
+                    <pic:cNvPr id="0" name="p16_firstfail.png"/>
+                    <pic:cNvPicPr/>
+                  </pic:nvPicPr>
+                  <pic:blipFill>
+                    <a:blip r:embed="rId32"/>
+                    <a:stretch>
+                      <a:fillRect/>
+                    </a:stretch>
+                  </pic:blipFill>
+                  <pic:spPr>
+                    <a:xfrm>
+                      <a:off x="0" y="0"/>
+                      <a:ext cx="5760720" cy="2175591"/>
+                    </a:xfrm>
+                    <a:prstGeom prst="rect"/>
+                  </pic:spPr>
+                </pic:pic>
+              </a:graphicData>
+            </a:graphic>
+          </wp:inline>
+        </w:drawing>
+      </w:r>
+    </w:p>
+    <w:p>
+      <w:pPr/>
+      <w:r>
+        <w:rPr>
+          <w:b w:val="0"/>
+        </w:rPr>
+        <w:t>The revision that followed built the three-tier model, a tabulated addressing plan, and LACP, VRRP/HSRP and RSTP redundancy, and the judge raised it to 8 while still catching a subtle inaccuracy in the revised text, with the quote to prove it:</w:t>
+      </w:r>
+    </w:p>
+    <w:p>
+      <w:r>
+        <w:drawing>
+          <wp:inline xmlns:a="http://schemas.openxmlformats.org/drawingml/2006/main" xmlns:pic="http://schemas.openxmlformats.org/drawingml/2006/picture">
+            <wp:extent cx="5760720" cy="1472184"/>
+            <wp:docPr id="1758724914" name="Picture 1758724914"/>
+            <wp:cNvGraphicFramePr>
+              <a:graphicFrameLocks noChangeAspect="1"/>
+            </wp:cNvGraphicFramePr>
+            <a:graphic>
+              <a:graphicData uri="http://schemas.openxmlformats.org/drawingml/2006/picture">
+                <pic:pic>
+                  <pic:nvPicPr>
+                    <pic:cNvPr id="0" name="p16_revision.png"/>
+                    <pic:cNvPicPr/>
+                  </pic:nvPicPr>
+                  <pic:blipFill>
+                    <a:blip r:embed="rId33"/>
+                    <a:stretch>
+                      <a:fillRect/>
+                    </a:stretch>
+                  </pic:blipFill>
+                  <pic:spPr>
+                    <a:xfrm>
+                      <a:off x="0" y="0"/>
+                      <a:ext cx="5760720" cy="1472184"/>
+                    </a:xfrm>
+                    <a:prstGeom prst="rect"/>
+                  </pic:spPr>
+                </pic:pic>
+              </a:graphicData>
+            </a:graphic>
+          </wp:inline>
+        </w:drawing>
+      </w:r>
+    </w:p>
+    <w:p>
+      <w:pPr/>
+      <w:r>
+        <w:rPr>
+          <w:b w:val="0"/>
+        </w:rPr>
+        <w:t>Cross-grading sealed it. Handed a gpt-oss answer that gpt-oss had scored 10, qwen3.8 found a counting error, a misused spine-leaf term, and a ports-versus-uplinks confusion, each backed by a quote from the answer. Weak control answers moved from 0 to 1, partial controls from 1 to 4, all fails, which is the score spread the generous judge could not produce. One real bug surfaced and was fixed on the spot: 3 of 17 verdicts came back as provider_error because thinking tokens ate the 1024-token structured budget before the JSON appeared, so JAI_STRUCTURED_MAX_TOKENS is now 4096 and the timeout guidance is 600 seconds.</w:t>
+      </w:r>
+    </w:p>
+    <w:p>
+      <w:pPr>
+        <w:keepNext/>
+        <w:keepLines/>
+      </w:pPr>
+      <w:r>
+        <w:rPr>
+          <w:b/>
+        </w:rPr>
+        <w:t>Result:</w:t>
+      </w:r>
+    </w:p>
+    <w:p>
+      <w:pPr/>
+      <w:r>
+        <w:rPr>
+          <w:b w:val="0"/>
+        </w:rPr>
+        <w:t>qwen3.8:27b with think=low is the default judge and student in .env, with gpt-oss:20b kept as the fast judge, about five times quicker. The structured output budget is 4096 tokens, the timeout 600 seconds, and the price is real: 17GB on a 16GB card means 50 to 140 seconds per grading, acceptable for quality runs, wrong for batches.</w:t>
+      </w:r>
+    </w:p>
+    <w:p>
+      <w:pPr>
+        <w:keepNext/>
+        <w:keepLines/>
+      </w:pPr>
+      <w:r>
+        <w:rPr>
+          <w:b/>
+        </w:rPr>
+        <w:t>Outcome:</w:t>
+      </w:r>
+    </w:p>
+    <w:p>
+      <w:pPr>
+        <w:keepLines/>
+      </w:pPr>
+      <w:r>
+        <w:rPr>
+          <w:b w:val="0"/>
+        </w:rPr>
+        <w:t>Round two only happened because round one recorded its method. Upgrade the infrastructure, rerun the identical exam, adopt the winner, keep the runner-up for speed: judge selection in J_AI is now a repeatable procedure instead of a preference.</w:t>
+      </w:r>
+    </w:p>
+    <w:p>
+      <w:pPr/>
+      <w:r>
+        <w:rPr>
+          <w:b/>
+        </w:rPr>
+        <w:t>Phase 17 — Grading Myself with the Adopted Judge</w:t>
+      </w:r>
+    </w:p>
+    <w:p>
+      <w:pPr/>
+      <w:r>
+        <w:rPr>
+          <w:b w:val="0"/>
+        </w:rPr>
+        <w:t>The setup proves itself on my own work. My three ITE402 answers from September 3 went through the real batch path, eval mode into the scoreboard into the report writer, graded by qwen3.8:27b. REQ_001 4/10, REQ_002 1/10, LOG_001 1/10, every verdict a fail, both blank cases stopped by the guard, zero provider errors, and the run file records exactly which judge graded it:</w:t>
+      </w:r>
+    </w:p>
+    <w:p>
+      <w:r>
+        <w:drawing>
+          <wp:inline xmlns:a="http://schemas.openxmlformats.org/drawingml/2006/main" xmlns:pic="http://schemas.openxmlformats.org/drawingml/2006/picture">
+            <wp:extent cx="5760720" cy="1836230"/>
+            <wp:docPr id="1758724915" name="Picture 1758724915"/>
+            <wp:cNvGraphicFramePr>
+              <a:graphicFrameLocks noChangeAspect="1"/>
+            </wp:cNvGraphicFramePr>
+            <a:graphic>
+              <a:graphicData uri="http://schemas.openxmlformats.org/drawingml/2006/picture">
+                <pic:pic>
+                  <pic:nvPicPr>
+                    <pic:cNvPr id="0" name="p17_scoreboard.png"/>
+                    <pic:cNvPicPr/>
+                  </pic:nvPicPr>
+                  <pic:blipFill>
+                    <a:blip r:embed="rId34"/>
+                    <a:stretch>
+                      <a:fillRect/>
+                    </a:stretch>
+                  </pic:blipFill>
+                  <pic:spPr>
+                    <a:xfrm>
+                      <a:off x="0" y="0"/>
+                      <a:ext cx="5760720" cy="1836230"/>
+                    </a:xfrm>
+                    <a:prstGeom prst="rect"/>
+                  </pic:spPr>
+                </pic:pic>
+              </a:graphicData>
+            </a:graphic>
+          </wp:inline>
+        </w:drawing>
+      </w:r>
+    </w:p>
+    <w:p>
+      <w:pPr/>
+      <w:r>
+        <w:rPr>
+          <w:b w:val="0"/>
+        </w:rPr>
+        <w:t>The verdicts agree with llama3 and qwen2.5 on the outcome but finally state the reasons with evidence. I described staff rosters instead of a network. I conflated a server with a switch, and the judge quoted me doing it: a server does not connect PCs to a network, switches and routers perform that role. I wrote portal where segmentation was needed. The recall gap from September 3 is unchanged, but it is now named precisely: answer the engineering framework, goals, constraints, segmentation, addressing, routing, redundancy, not the operation.</w:t>
+      </w:r>
+    </w:p>
+    <w:p>
+      <w:pPr/>
+      <w:r>
+        <w:rPr>
+          <w:b w:val="0"/>
+        </w:rPr>
+        <w:t>The session closed with the agent getting a proper test suite: tests/test_student_agent.py, ten tests driven by a scripted fake provider so no model is needed, covering the unknown-tool refusal, a provider_error inside the loop, an empty reply, the step cap, the nudge cap, the budget forcing a final answer, the strict override, and the check that the answer key never leaks to the student:</w:t>
+      </w:r>
+    </w:p>
+    <w:p>
+      <w:r>
+        <w:drawing>
+          <wp:inline xmlns:a="http://schemas.openxmlformats.org/drawingml/2006/main" xmlns:pic="http://schemas.openxmlformats.org/drawingml/2006/picture">
+            <wp:extent cx="5760720" cy="2880360"/>
+            <wp:docPr id="1758724916" name="Picture 1758724916"/>
+            <wp:cNvGraphicFramePr>
+              <a:graphicFrameLocks noChangeAspect="1"/>
+            </wp:cNvGraphicFramePr>
+            <a:graphic>
+              <a:graphicData uri="http://schemas.openxmlformats.org/drawingml/2006/picture">
+                <pic:pic>
+                  <pic:nvPicPr>
+                    <pic:cNvPr id="0" name="p17_tests.png"/>
+                    <pic:cNvPicPr/>
+                  </pic:nvPicPr>
+                  <pic:blipFill>
+                    <a:blip r:embed="rId35"/>
+                    <a:stretch>
+                      <a:fillRect/>
+                    </a:stretch>
+                  </pic:blipFill>
+                  <pic:spPr>
+                    <a:xfrm>
+                      <a:off x="0" y="0"/>
+                      <a:ext cx="5760720" cy="2880360"/>
+                    </a:xfrm>
+                    <a:prstGeom prst="rect"/>
+                  </pic:spPr>
+                </pic:pic>
+              </a:graphicData>
+            </a:graphic>
+          </wp:inline>
+        </w:drawing>
+      </w:r>
+    </w:p>
+    <w:p>
+      <w:pPr>
+        <w:keepNext/>
+        <w:keepLines/>
+      </w:pPr>
+      <w:r>
+        <w:rPr>
+          <w:b/>
+        </w:rPr>
+        <w:t>Result:</w:t>
+      </w:r>
+    </w:p>
+    <w:p>
+      <w:pPr/>
+      <w:r>
+        <w:rPr>
+          <w:b w:val="0"/>
+        </w:rPr>
+        <w:t>The adopted judge grades my real answers with quoted evidence through the full batch path, the report is filed with the repo, and the agent's guardrails are pinned by ten green unit tests that run in a millisecond without a model.</w:t>
+      </w:r>
+    </w:p>
+    <w:p>
+      <w:pPr>
+        <w:keepNext/>
+        <w:keepLines/>
+      </w:pPr>
+      <w:r>
+        <w:rPr>
+          <w:b/>
+        </w:rPr>
+        <w:t>Outcome:</w:t>
+      </w:r>
+    </w:p>
+    <w:p>
+      <w:pPr>
+        <w:keepLines/>
+      </w:pPr>
+      <w:r>
+        <w:rPr>
+          <w:b w:val="0"/>
+        </w:rPr>
+        <w:t>The judge is now better at naming my gap than I am at hiding it. The next honest measure is not another tool: re-answer REQ_002 and LOG_001 framework-first and regrade, and see whether the number moves.</w:t>
       </w:r>
     </w:p>
     <w:sectPr>

</xml_diff>

<commit_message>
Journal: update project journal
</commit_message>
<xml_diff>
--- a/docs/Project Journal - J_AI.docx
+++ b/docs/Project Journal - J_AI.docx
@@ -33,15 +33,7 @@
     </w:p>
     <w:p>
       <w:r>
-        <w:t xml:space="preserve">Installed Ubuntu 24.04 LTS inside WSL2 and configured a Linux development environment within Windows. Updated system packages and installed essential development tools including build utilities, Git, curl, Python </w:t>
-      </w:r>
-      <w:proofErr w:type="spellStart"/>
-      <w:r>
-        <w:t>venv</w:t>
-      </w:r>
-      <w:proofErr w:type="spellEnd"/>
-      <w:r>
-        <w:t>, and pip to prepare for backend and AI development.</w:t>
+        <w:t>Installed Ubuntu 24.04 LTS inside WSL2 and configured a Linux development environment within Windows. Updated system packages and installed essential development tools including build utilities, Git, curl, Python venv, and pip to prepare for backend and AI development.</w:t>
       </w:r>
     </w:p>
     <w:p>
@@ -278,21 +270,7 @@
         <w:rPr>
           <w:lang w:bidi="ar-AE"/>
         </w:rPr>
-        <w:t xml:space="preserve">Installed Ollama inside the Ubuntu WSL environment. Resolved missing dependency issues by installing </w:t>
-      </w:r>
-      <w:proofErr w:type="spellStart"/>
-      <w:r>
-        <w:rPr>
-          <w:lang w:bidi="ar-AE"/>
-        </w:rPr>
-        <w:t>zstd</w:t>
-      </w:r>
-      <w:proofErr w:type="spellEnd"/>
-      <w:r>
-        <w:rPr>
-          <w:lang w:bidi="ar-AE"/>
-        </w:rPr>
-        <w:t>. Verified successful installation using version check and confirmed local runtime availability.</w:t>
+        <w:t>Installed Ollama inside the Ubuntu WSL environment. Resolved missing dependency issues by installing zstd. Verified successful installation using version check and confirmed local runtime availability.</w:t>
       </w:r>
     </w:p>
     <w:p>
@@ -527,15 +505,7 @@
     </w:p>
     <w:p>
       <w:r>
-        <w:t xml:space="preserve">Implemented a modular Ollama provider using REST API communication from within a structured Python project. Established </w:t>
-      </w:r>
-      <w:proofErr w:type="gramStart"/>
-      <w:r>
-        <w:t>application controlled</w:t>
-      </w:r>
-      <w:proofErr w:type="gramEnd"/>
-      <w:r>
-        <w:t xml:space="preserve"> inference by sending HTTP POST requests to the local Ollama server, handling JSON responses, and integrating the provider into an interactive CLI interface.</w:t>
+        <w:t>Implemented a modular Ollama provider using REST API communication from within a structured Python project. Established application controlled inference by sending HTTP POST requests to the local Ollama server, handling JSON responses, and integrating the provider into an interactive CLI interface.</w:t>
       </w:r>
     </w:p>
     <w:p>
@@ -886,15 +856,7 @@
     </w:p>
     <w:p>
       <w:r>
-        <w:t xml:space="preserve">Introduced provider factory layer to decouple application logic from specific AI backend. Implemented </w:t>
-      </w:r>
-      <w:proofErr w:type="gramStart"/>
-      <w:r>
-        <w:t>environment based</w:t>
-      </w:r>
-      <w:proofErr w:type="gramEnd"/>
-      <w:r>
-        <w:t xml:space="preserve"> provider selection mechanism using JAI_PROVIDER configuration variable.</w:t>
+        <w:t>Introduced provider factory layer to decouple application logic from specific AI backend. Implemented environment based provider selection mechanism using JAI_PROVIDER configuration variable.</w:t>
       </w:r>
     </w:p>
     <w:p>
@@ -1022,7 +984,6 @@
         </w:rPr>
         <w:t xml:space="preserve">Part 1 </w:t>
       </w:r>
-      <w:proofErr w:type="gramStart"/>
       <w:r>
         <w:rPr>
           <w:b/>
@@ -1035,15 +996,7 @@
           <w:b/>
           <w:bCs/>
         </w:rPr>
-        <w:t xml:space="preserve"> GPT</w:t>
-      </w:r>
-      <w:proofErr w:type="gramEnd"/>
-      <w:r>
-        <w:rPr>
-          <w:b/>
-          <w:bCs/>
-        </w:rPr>
-        <w:t xml:space="preserve"> attempt</w:t>
+        <w:t xml:space="preserve"> GPT attempt</w:t>
       </w:r>
     </w:p>
     <w:p>
@@ -1057,7 +1010,7 @@
           <w:noProof/>
         </w:rPr>
         <w:drawing>
-          <wp:inline distT="0" distB="0" distL="0" distR="0" wp14:anchorId="15C4C12B" wp14:editId="1C77FD19">
+          <wp:inline distT="0" distB="0" distL="0" distR="0" wp14:anchorId="15C4C12B" wp14:editId="43C50CFC">
             <wp:extent cx="5943600" cy="1160780"/>
             <wp:effectExtent l="0" t="0" r="0" b="1270"/>
             <wp:docPr id="70966354" name="Picture 2"/>
@@ -1110,7 +1063,7 @@
           <w:noProof/>
         </w:rPr>
         <w:drawing>
-          <wp:inline distT="0" distB="0" distL="0" distR="0" wp14:anchorId="16ECF96D" wp14:editId="60AE5ECE">
+          <wp:inline distT="0" distB="0" distL="0" distR="0" wp14:anchorId="16ECF96D" wp14:editId="2449F191">
             <wp:extent cx="5943600" cy="1266825"/>
             <wp:effectExtent l="0" t="0" r="0" b="9525"/>
             <wp:docPr id="165149698" name="Picture 3"/>
@@ -1236,29 +1189,8 @@
       </w:r>
     </w:p>
     <w:p>
-      <w:proofErr w:type="gramStart"/>
-      <w:r>
-        <w:t>Implemented .env</w:t>
-      </w:r>
-      <w:proofErr w:type="gramEnd"/>
-      <w:r>
-        <w:t xml:space="preserve"> based configuration loading using python </w:t>
-      </w:r>
-      <w:proofErr w:type="spellStart"/>
-      <w:r>
-        <w:t>dotenv</w:t>
-      </w:r>
-      <w:proofErr w:type="spellEnd"/>
-      <w:r>
-        <w:t xml:space="preserve">. Refactored providers to read runtime configuration from environment variables instead of hardcoded defaults. Resolved environment precedence conflict between shell exports </w:t>
-      </w:r>
-      <w:proofErr w:type="gramStart"/>
-      <w:r>
-        <w:t>and .env</w:t>
-      </w:r>
-      <w:proofErr w:type="gramEnd"/>
-      <w:r>
-        <w:t xml:space="preserve"> values.</w:t>
+      <w:r>
+        <w:t>Implemented .env based configuration loading using python dotenv. Refactored providers to read runtime configuration from environment variables instead of hardcoded defaults. Resolved environment precedence conflict between shell exports and .env values.</w:t>
       </w:r>
     </w:p>
     <w:p>
@@ -1367,15 +1299,7 @@
         <w:keepLines/>
       </w:pPr>
       <w:r>
-        <w:t xml:space="preserve">Application correctly selected provider based </w:t>
-      </w:r>
-      <w:proofErr w:type="gramStart"/>
-      <w:r>
-        <w:t>on .env</w:t>
-      </w:r>
-      <w:proofErr w:type="gramEnd"/>
-      <w:r>
-        <w:t xml:space="preserve"> configuration without manual terminal exports.</w:t>
+        <w:t>Application correctly selected provider based on .env configuration without manual terminal exports.</w:t>
       </w:r>
     </w:p>
     <w:p>
@@ -1399,15 +1323,7 @@
         <w:keepLines/>
       </w:pPr>
       <w:r>
-        <w:t xml:space="preserve">Established centralized configuration system enabling clean </w:t>
-      </w:r>
-      <w:proofErr w:type="gramStart"/>
-      <w:r>
-        <w:t>environment controlled</w:t>
-      </w:r>
-      <w:proofErr w:type="gramEnd"/>
-      <w:r>
-        <w:t xml:space="preserve"> runtime behavior.</w:t>
+        <w:t>Established centralized configuration system enabling clean environment controlled runtime behavior.</w:t>
       </w:r>
     </w:p>
     <w:p>
@@ -2499,71 +2415,378 @@
         <w:rPr>
           <w:b/>
         </w:rPr>
+        <w:t>Result:</w:t>
+      </w:r>
+    </w:p>
+    <w:p>
+      <w:pPr>
+        <w:keepNext/>
+        <w:keepLines/>
+      </w:pPr>
+      <w:r>
+        <w:t>All acceptance tests passed: guard rejections exit 1, runtime and provider errors exit 2, the scoreboard reports graded, guard_rejected, and provider_error counts separately, legacy run files still summarize, and a full run rendered end to end into a readable report.</w:t>
+      </w:r>
+    </w:p>
+    <w:p>
+      <w:pPr>
+        <w:keepNext/>
+        <w:keepLines/>
+      </w:pPr>
+      <w:r>
+        <w:rPr>
+          <w:b/>
+        </w:rPr>
+        <w:t>Outcome:</w:t>
+      </w:r>
+    </w:p>
+    <w:p>
+      <w:pPr>
+        <w:keepLines/>
+      </w:pPr>
+      <w:r>
+        <w:t>The Minimum Useful Version is complete and published. Next stage: wire the per-case expected rubrics into grading, so the examiner marks against the answer key instead of a generic checklist.</w:t>
+      </w:r>
+    </w:p>
+    <w:p>
+      <w:pPr>
+        <w:rPr>
+          <w:b/>
+        </w:rPr>
+      </w:pPr>
+      <w:r>
+        <w:rPr>
+          <w:b/>
+        </w:rPr>
+        <w:br w:type="page"/>
+      </w:r>
+    </w:p>
+    <w:p>
+      <w:r>
+        <w:rPr>
+          <w:b/>
+        </w:rPr>
         <w:lastRenderedPageBreak/>
-        <w:t>Result:</w:t>
-      </w:r>
-    </w:p>
-    <w:p>
-      <w:pPr>
-        <w:keepNext/>
-        <w:keepLines/>
-      </w:pPr>
-      <w:r>
-        <w:t>All acceptance tests passed: guard rejections exit 1, runtime and provider errors exit 2, the scoreboard reports graded, guard_rejected, and provider_error counts separately, legacy run files still summarize, and a full run rendered end to end into a readable report.</w:t>
-      </w:r>
-    </w:p>
-    <w:p>
-      <w:pPr>
-        <w:keepNext/>
-        <w:keepLines/>
-      </w:pPr>
-      <w:r>
-        <w:rPr>
-          <w:b/>
-        </w:rPr>
-        <w:t>Outcome:</w:t>
-      </w:r>
-    </w:p>
-    <w:p>
-      <w:pPr>
-        <w:keepLines/>
-      </w:pPr>
-      <w:r>
-        <w:t>The Minimum Useful Version is complete and published. Next stage: wire the per-case expected rubrics into grading, so the examiner marks against the answer key instead of a generic checklist.</w:t>
-      </w:r>
-    </w:p>
-    <w:p>
-      <w:pPr/>
-      <w:r>
-        <w:rPr>
-          <w:b/>
-        </w:rPr>
         <w:t>Phase 13 — Rubric Grading and Judge Calibration</w:t>
       </w:r>
     </w:p>
     <w:p>
-      <w:pPr/>
-      <w:r>
-        <w:rPr>
-          <w:b w:val="0"/>
-        </w:rPr>
+      <w:r>
         <w:t>Wired the answer keys into grading. build_prompt now renders each case's expected block (must_include, must_include_any, must_avoid, min_points) as a marking scheme injected into the prompt before the JSON instruction, together with a standing gradeability rule: an empty or off topic response scores 0, which makes the length guard defense in depth instead of the only defense. Verified live: the requirements average moved from 4.0 to 3.0 once the judge held the key, and verdicts began citing rubric items verbatim. Editing a rubric now changes grading behavior directly, which closed the last finding of the Phase 11 review.</w:t>
       </w:r>
     </w:p>
     <w:p>
       <w:r>
+        <w:rPr>
+          <w:noProof/>
+        </w:rPr>
         <w:drawing>
-          <wp:inline xmlns:a="http://schemas.openxmlformats.org/drawingml/2006/main" xmlns:pic="http://schemas.openxmlformats.org/drawingml/2006/picture">
+          <wp:inline distT="0" distB="0" distL="0" distR="0" wp14:anchorId="771446BF" wp14:editId="5FEAF516">
             <wp:extent cx="5760720" cy="1920240"/>
+            <wp:effectExtent l="0" t="0" r="0" b="0"/>
             <wp:docPr id="1758724907" name="Picture 1758724907"/>
             <wp:cNvGraphicFramePr>
-              <a:graphicFrameLocks noChangeAspect="1"/>
+              <a:graphicFrameLocks xmlns:a="http://schemas.openxmlformats.org/drawingml/2006/main" noChangeAspect="1"/>
             </wp:cNvGraphicFramePr>
-            <a:graphic>
+            <a:graphic xmlns:a="http://schemas.openxmlformats.org/drawingml/2006/main">
               <a:graphicData uri="http://schemas.openxmlformats.org/drawingml/2006/picture">
-                <pic:pic>
+                <pic:pic xmlns:pic="http://schemas.openxmlformats.org/drawingml/2006/picture">
                   <pic:nvPicPr>
                     <pic:cNvPr id="0" name="phase13_rubric.png"/>
+                    <pic:cNvPicPr/>
+                  </pic:nvPicPr>
+                  <pic:blipFill>
+                    <a:blip r:embed="rId24"/>
+                    <a:stretch>
+                      <a:fillRect/>
+                    </a:stretch>
+                  </pic:blipFill>
+                  <pic:spPr>
+                    <a:xfrm>
+                      <a:off x="0" y="0"/>
+                      <a:ext cx="5760720" cy="1920240"/>
+                    </a:xfrm>
+                    <a:prstGeom prst="rect">
+                      <a:avLst/>
+                    </a:prstGeom>
+                  </pic:spPr>
+                </pic:pic>
+              </a:graphicData>
+            </a:graphic>
+          </wp:inline>
+        </w:drawing>
+      </w:r>
+    </w:p>
+    <w:p>
+      <w:r>
+        <w:t>Then attempted the judge upgrade. First confirmed the system is fully offline: the only network call in the Ollama provider is localhost, so no external service can meter or interrupt evaluation. Claude was considered and ruled out honestly (API only, paid, token limited, no local weights). Pulled qwen2.5:14b through Ollama onto the RTX 5080 (16GB VRAM) and calibrated it against my own three answered cases, where I know what the verdicts should say.</w:t>
+      </w:r>
+    </w:p>
+    <w:p>
+      <w:r>
+        <w:t>The calibration took four iterations, and the bigger model began by grading worse, not better:</w:t>
+      </w:r>
+    </w:p>
+    <w:tbl>
+      <w:tblPr>
+        <w:tblW w:w="0" w:type="auto"/>
+        <w:tblBorders>
+          <w:top w:val="single" w:sz="4" w:space="0" w:color="999999"/>
+          <w:left w:val="single" w:sz="4" w:space="0" w:color="999999"/>
+          <w:bottom w:val="single" w:sz="4" w:space="0" w:color="999999"/>
+          <w:right w:val="single" w:sz="4" w:space="0" w:color="999999"/>
+          <w:insideH w:val="single" w:sz="4" w:space="0" w:color="999999"/>
+          <w:insideV w:val="single" w:sz="4" w:space="0" w:color="999999"/>
+        </w:tblBorders>
+        <w:tblLayout w:type="fixed"/>
+        <w:tblLook w:val="04A0" w:firstRow="1" w:lastRow="0" w:firstColumn="1" w:lastColumn="0" w:noHBand="0" w:noVBand="1"/>
+      </w:tblPr>
+      <w:tblGrid>
+        <w:gridCol w:w="1152"/>
+        <w:gridCol w:w="2880"/>
+        <w:gridCol w:w="5328"/>
+      </w:tblGrid>
+      <w:tr>
+        <w:tc>
+          <w:tcPr>
+            <w:tcW w:w="1152" w:type="dxa"/>
+          </w:tcPr>
+          <w:p>
+            <w:r>
+              <w:rPr>
+                <w:b/>
+              </w:rPr>
+              <w:t>Iteration</w:t>
+            </w:r>
+          </w:p>
+        </w:tc>
+        <w:tc>
+          <w:tcPr>
+            <w:tcW w:w="2880" w:type="dxa"/>
+          </w:tcPr>
+          <w:p>
+            <w:r>
+              <w:rPr>
+                <w:b/>
+              </w:rPr>
+              <w:t>Change</w:t>
+            </w:r>
+          </w:p>
+        </w:tc>
+        <w:tc>
+          <w:tcPr>
+            <w:tcW w:w="5328" w:type="dxa"/>
+          </w:tcPr>
+          <w:p>
+            <w:r>
+              <w:rPr>
+                <w:b/>
+              </w:rPr>
+              <w:t>Finding</w:t>
+            </w:r>
+          </w:p>
+        </w:tc>
+      </w:tr>
+      <w:tr>
+        <w:tc>
+          <w:tcPr>
+            <w:tcW w:w="1152" w:type="dxa"/>
+          </w:tcPr>
+          <w:p>
+            <w:r>
+              <w:t>1</w:t>
+            </w:r>
+          </w:p>
+        </w:tc>
+        <w:tc>
+          <w:tcPr>
+            <w:tcW w:w="2880" w:type="dxa"/>
+          </w:tcPr>
+          <w:p>
+            <w:r>
+              <w:t>qwen2.5:14b, raw rubric</w:t>
+            </w:r>
+          </w:p>
+        </w:tc>
+        <w:tc>
+          <w:tcPr>
+            <w:tcW w:w="5328" w:type="dxa"/>
+          </w:tcPr>
+          <w:p>
+            <w:r>
+              <w:t>Rubric echo: copied all scheme items into the verdict, both penalties false</w:t>
+            </w:r>
+          </w:p>
+        </w:tc>
+      </w:tr>
+      <w:tr>
+        <w:tc>
+          <w:tcPr>
+            <w:tcW w:w="1152" w:type="dxa"/>
+          </w:tcPr>
+          <w:p>
+            <w:r>
+              <w:t>2</w:t>
+            </w:r>
+          </w:p>
+        </w:tc>
+        <w:tc>
+          <w:tcPr>
+            <w:tcW w:w="2880" w:type="dxa"/>
+          </w:tcPr>
+          <w:p>
+            <w:r>
+              <w:t>Anti-echo instructions</w:t>
+            </w:r>
+          </w:p>
+        </w:tc>
+        <w:tc>
+          <w:tcPr>
+            <w:tcW w:w="5328" w:type="dxa"/>
+          </w:tcPr>
+          <w:p>
+            <w:r>
+              <w:t>Substantive analysis improved clearly, but false penalties survived</w:t>
+            </w:r>
+          </w:p>
+        </w:tc>
+      </w:tr>
+      <w:tr>
+        <w:tc>
+          <w:tcPr>
+            <w:tcW w:w="1152" w:type="dxa"/>
+          </w:tcPr>
+          <w:p>
+            <w:r>
+              <w:t>3</w:t>
+            </w:r>
+          </w:p>
+        </w:tc>
+        <w:tc>
+          <w:tcPr>
+            <w:tcW w:w="2880" w:type="dxa"/>
+          </w:tcPr>
+          <w:p>
+            <w:r>
+              <w:t>Evidence rule (quote required)</w:t>
+            </w:r>
+          </w:p>
+        </w:tc>
+        <w:tc>
+          <w:tcPr>
+            <w:tcW w:w="5328" w:type="dxa"/>
+          </w:tcPr>
+          <w:p>
+            <w:r>
+              <w:t>Exposed the root cause, then fabricated a quote (HIPAA) that the answer never contains</w:t>
+            </w:r>
+          </w:p>
+        </w:tc>
+      </w:tr>
+      <w:tr>
+        <w:tc>
+          <w:tcPr>
+            <w:tcW w:w="1152" w:type="dxa"/>
+          </w:tcPr>
+          <w:p>
+            <w:r>
+              <w:lastRenderedPageBreak/>
+              <w:t>4</w:t>
+            </w:r>
+          </w:p>
+        </w:tc>
+        <w:tc>
+          <w:tcPr>
+            <w:tcW w:w="2880" w:type="dxa"/>
+          </w:tcPr>
+          <w:p>
+            <w:r>
+              <w:t>Penalties made opt-in</w:t>
+            </w:r>
+          </w:p>
+        </w:tc>
+        <w:tc>
+          <w:tcPr>
+            <w:tcW w:w="5328" w:type="dxa"/>
+          </w:tcPr>
+          <w:p>
+            <w:r>
+              <w:t>Honest, quote-grounded, instructive grading; no fabrication</w:t>
+            </w:r>
+          </w:p>
+        </w:tc>
+      </w:tr>
+    </w:tbl>
+    <w:p/>
+    <w:p>
+      <w:r>
+        <w:t>Iteration 3 produced the decisive evidence. Forced to prove every penalty with a quote, the judge invented one: it cited HIPAA as proof of a compliance claim, and the word HIPAA appears nowhere in the answer. A judge that fabricates evidence under pressure cannot be trusted with penalty detection at this size.</w:t>
+      </w:r>
+    </w:p>
+    <w:p>
+      <w:r>
+        <w:rPr>
+          <w:noProof/>
+        </w:rPr>
+        <w:drawing>
+          <wp:inline distT="0" distB="0" distL="0" distR="0" wp14:anchorId="53C935D1" wp14:editId="6922712F">
+            <wp:extent cx="5760720" cy="1146551"/>
+            <wp:effectExtent l="0" t="0" r="0" b="0"/>
+            <wp:docPr id="1758724908" name="Picture 1758724908"/>
+            <wp:cNvGraphicFramePr>
+              <a:graphicFrameLocks xmlns:a="http://schemas.openxmlformats.org/drawingml/2006/main" noChangeAspect="1"/>
+            </wp:cNvGraphicFramePr>
+            <a:graphic xmlns:a="http://schemas.openxmlformats.org/drawingml/2006/main">
+              <a:graphicData uri="http://schemas.openxmlformats.org/drawingml/2006/picture">
+                <pic:pic xmlns:pic="http://schemas.openxmlformats.org/drawingml/2006/picture">
+                  <pic:nvPicPr>
+                    <pic:cNvPr id="0" name="phase13_fabrication.png"/>
+                    <pic:cNvPicPr/>
+                  </pic:nvPicPr>
+                  <pic:blipFill>
+                    <a:blip r:embed="rId25"/>
+                    <a:stretch>
+                      <a:fillRect/>
+                    </a:stretch>
+                  </pic:blipFill>
+                  <pic:spPr>
+                    <a:xfrm>
+                      <a:off x="0" y="0"/>
+                      <a:ext cx="5760720" cy="1146551"/>
+                    </a:xfrm>
+                    <a:prstGeom prst="rect">
+                      <a:avLst/>
+                    </a:prstGeom>
+                  </pic:spPr>
+                </pic:pic>
+              </a:graphicData>
+            </a:graphic>
+          </wp:inline>
+        </w:drawing>
+      </w:r>
+    </w:p>
+    <w:p>
+      <w:r>
+        <w:t>The winning configuration produces feedback that teaches: real criticisms grounded in quotes from the actual answer, and credit for what the answer genuinely covers.</w:t>
+      </w:r>
+    </w:p>
+    <w:p>
+      <w:r>
+        <w:rPr>
+          <w:noProof/>
+        </w:rPr>
+        <w:drawing>
+          <wp:inline distT="0" distB="0" distL="0" distR="0" wp14:anchorId="695D053E" wp14:editId="309F0E51">
+            <wp:extent cx="5760720" cy="1440180"/>
+            <wp:effectExtent l="0" t="0" r="0" b="0"/>
+            <wp:docPr id="1758724909" name="Picture 1758724909"/>
+            <wp:cNvGraphicFramePr>
+              <a:graphicFrameLocks xmlns:a="http://schemas.openxmlformats.org/drawingml/2006/main" noChangeAspect="1"/>
+            </wp:cNvGraphicFramePr>
+            <a:graphic xmlns:a="http://schemas.openxmlformats.org/drawingml/2006/main">
+              <a:graphicData uri="http://schemas.openxmlformats.org/drawingml/2006/picture">
+                <pic:pic xmlns:pic="http://schemas.openxmlformats.org/drawingml/2006/picture">
+                  <pic:nvPicPr>
+                    <pic:cNvPr id="0" name="phase13_verdict.png"/>
                     <pic:cNvPicPr/>
                   </pic:nvPicPr>
                   <pic:blipFill>
@@ -2575,9 +2798,11 @@
                   <pic:spPr>
                     <a:xfrm>
                       <a:off x="0" y="0"/>
-                      <a:ext cx="5760720" cy="1920240"/>
+                      <a:ext cx="5760720" cy="1440180"/>
                     </a:xfrm>
-                    <a:prstGeom prst="rect"/>
+                    <a:prstGeom prst="rect">
+                      <a:avLst/>
+                    </a:prstGeom>
                   </pic:spPr>
                 </pic:pic>
               </a:graphicData>
@@ -2587,311 +2812,6 @@
       </w:r>
     </w:p>
     <w:p>
-      <w:pPr/>
-      <w:r>
-        <w:rPr>
-          <w:b w:val="0"/>
-        </w:rPr>
-        <w:t>Then attempted the judge upgrade. First confirmed the system is fully offline: the only network call in the Ollama provider is localhost, so no external service can meter or interrupt evaluation. Claude was considered and ruled out honestly (API only, paid, token limited, no local weights). Pulled qwen2.5:14b through Ollama onto the RTX 5080 (16GB VRAM) and calibrated it against my own three answered cases, where I know what the verdicts should say.</w:t>
-      </w:r>
-    </w:p>
-    <w:p>
-      <w:pPr/>
-      <w:r>
-        <w:rPr>
-          <w:b w:val="0"/>
-        </w:rPr>
-        <w:t>The calibration took four iterations, and the bigger model began by grading worse, not better:</w:t>
-      </w:r>
-    </w:p>
-    <w:tbl>
-      <w:tblPr>
-        <w:tblW w:type="auto" w:w="0"/>
-        <w:tblLayout w:type="fixed"/>
-        <w:tblLook w:firstColumn="1" w:firstRow="1" w:lastColumn="0" w:lastRow="0" w:noHBand="0" w:noVBand="1" w:val="04A0"/>
-        <w:tblBorders>
-          <w:top w:val="single" w:sz="4" w:space="0" w:color="999999"/>
-          <w:left w:val="single" w:sz="4" w:space="0" w:color="999999"/>
-          <w:bottom w:val="single" w:sz="4" w:space="0" w:color="999999"/>
-          <w:right w:val="single" w:sz="4" w:space="0" w:color="999999"/>
-          <w:insideH w:val="single" w:sz="4" w:space="0" w:color="999999"/>
-          <w:insideV w:val="single" w:sz="4" w:space="0" w:color="999999"/>
-        </w:tblBorders>
-      </w:tblPr>
-      <w:tblGrid>
-        <w:gridCol w:w="3120"/>
-        <w:gridCol w:w="3120"/>
-        <w:gridCol w:w="3120"/>
-      </w:tblGrid>
-      <w:tr>
-        <w:tc>
-          <w:tcPr>
-            <w:tcW w:type="dxa" w:w="1152"/>
-          </w:tcPr>
-          <w:p>
-            <w:r>
-              <w:rPr>
-                <w:b/>
-              </w:rPr>
-              <w:t>Iteration</w:t>
-            </w:r>
-          </w:p>
-        </w:tc>
-        <w:tc>
-          <w:tcPr>
-            <w:tcW w:type="dxa" w:w="2880"/>
-          </w:tcPr>
-          <w:p>
-            <w:r>
-              <w:rPr>
-                <w:b/>
-              </w:rPr>
-              <w:t>Change</w:t>
-            </w:r>
-          </w:p>
-        </w:tc>
-        <w:tc>
-          <w:tcPr>
-            <w:tcW w:type="dxa" w:w="5328"/>
-          </w:tcPr>
-          <w:p>
-            <w:r>
-              <w:rPr>
-                <w:b/>
-              </w:rPr>
-              <w:t>Finding</w:t>
-            </w:r>
-          </w:p>
-        </w:tc>
-      </w:tr>
-      <w:tr>
-        <w:tc>
-          <w:tcPr>
-            <w:tcW w:type="dxa" w:w="1152"/>
-          </w:tcPr>
-          <w:p>
-            <w:r>
-              <w:t>1</w:t>
-            </w:r>
-          </w:p>
-        </w:tc>
-        <w:tc>
-          <w:tcPr>
-            <w:tcW w:type="dxa" w:w="2880"/>
-          </w:tcPr>
-          <w:p>
-            <w:r>
-              <w:t>qwen2.5:14b, raw rubric</w:t>
-            </w:r>
-          </w:p>
-        </w:tc>
-        <w:tc>
-          <w:tcPr>
-            <w:tcW w:type="dxa" w:w="5328"/>
-          </w:tcPr>
-          <w:p>
-            <w:r>
-              <w:t>Rubric echo: copied all scheme items into the verdict, both penalties false</w:t>
-            </w:r>
-          </w:p>
-        </w:tc>
-      </w:tr>
-      <w:tr>
-        <w:tc>
-          <w:tcPr>
-            <w:tcW w:type="dxa" w:w="1152"/>
-          </w:tcPr>
-          <w:p>
-            <w:r>
-              <w:t>2</w:t>
-            </w:r>
-          </w:p>
-        </w:tc>
-        <w:tc>
-          <w:tcPr>
-            <w:tcW w:type="dxa" w:w="2880"/>
-          </w:tcPr>
-          <w:p>
-            <w:r>
-              <w:t>Anti-echo instructions</w:t>
-            </w:r>
-          </w:p>
-        </w:tc>
-        <w:tc>
-          <w:tcPr>
-            <w:tcW w:type="dxa" w:w="5328"/>
-          </w:tcPr>
-          <w:p>
-            <w:r>
-              <w:t>Substantive analysis improved clearly, but false penalties survived</w:t>
-            </w:r>
-          </w:p>
-        </w:tc>
-      </w:tr>
-      <w:tr>
-        <w:tc>
-          <w:tcPr>
-            <w:tcW w:type="dxa" w:w="1152"/>
-          </w:tcPr>
-          <w:p>
-            <w:r>
-              <w:t>3</w:t>
-            </w:r>
-          </w:p>
-        </w:tc>
-        <w:tc>
-          <w:tcPr>
-            <w:tcW w:type="dxa" w:w="2880"/>
-          </w:tcPr>
-          <w:p>
-            <w:r>
-              <w:t>Evidence rule (quote required)</w:t>
-            </w:r>
-          </w:p>
-        </w:tc>
-        <w:tc>
-          <w:tcPr>
-            <w:tcW w:type="dxa" w:w="5328"/>
-          </w:tcPr>
-          <w:p>
-            <w:r>
-              <w:t>Exposed the root cause, then fabricated a quote (HIPAA) that the answer never contains</w:t>
-            </w:r>
-          </w:p>
-        </w:tc>
-      </w:tr>
-      <w:tr>
-        <w:tc>
-          <w:tcPr>
-            <w:tcW w:type="dxa" w:w="1152"/>
-          </w:tcPr>
-          <w:p>
-            <w:r>
-              <w:t>4</w:t>
-            </w:r>
-          </w:p>
-        </w:tc>
-        <w:tc>
-          <w:tcPr>
-            <w:tcW w:type="dxa" w:w="2880"/>
-          </w:tcPr>
-          <w:p>
-            <w:r>
-              <w:t>Penalties made opt-in</w:t>
-            </w:r>
-          </w:p>
-        </w:tc>
-        <w:tc>
-          <w:tcPr>
-            <w:tcW w:type="dxa" w:w="5328"/>
-          </w:tcPr>
-          <w:p>
-            <w:r>
-              <w:t>Honest, quote-grounded, instructive grading; no fabrication</w:t>
-            </w:r>
-          </w:p>
-        </w:tc>
-      </w:tr>
-    </w:tbl>
-    <w:p>
-      <w:pPr/>
-      <w:r>
-        <w:rPr>
-          <w:b w:val="0"/>
-        </w:rPr>
-      </w:r>
-    </w:p>
-    <w:p>
-      <w:pPr/>
-      <w:r>
-        <w:rPr>
-          <w:b w:val="0"/>
-        </w:rPr>
-        <w:t>Iteration 3 produced the decisive evidence. Forced to prove every penalty with a quote, the judge invented one: it cited HIPAA as proof of a compliance claim, and the word HIPAA appears nowhere in the answer. A judge that fabricates evidence under pressure cannot be trusted with penalty detection at this size.</w:t>
-      </w:r>
-    </w:p>
-    <w:p>
-      <w:r>
-        <w:drawing>
-          <wp:inline xmlns:a="http://schemas.openxmlformats.org/drawingml/2006/main" xmlns:pic="http://schemas.openxmlformats.org/drawingml/2006/picture">
-            <wp:extent cx="5760720" cy="1146551"/>
-            <wp:docPr id="1758724908" name="Picture 1758724908"/>
-            <wp:cNvGraphicFramePr>
-              <a:graphicFrameLocks noChangeAspect="1"/>
-            </wp:cNvGraphicFramePr>
-            <a:graphic>
-              <a:graphicData uri="http://schemas.openxmlformats.org/drawingml/2006/picture">
-                <pic:pic>
-                  <pic:nvPicPr>
-                    <pic:cNvPr id="0" name="phase13_fabrication.png"/>
-                    <pic:cNvPicPr/>
-                  </pic:nvPicPr>
-                  <pic:blipFill>
-                    <a:blip r:embed="rId27"/>
-                    <a:stretch>
-                      <a:fillRect/>
-                    </a:stretch>
-                  </pic:blipFill>
-                  <pic:spPr>
-                    <a:xfrm>
-                      <a:off x="0" y="0"/>
-                      <a:ext cx="5760720" cy="1146551"/>
-                    </a:xfrm>
-                    <a:prstGeom prst="rect"/>
-                  </pic:spPr>
-                </pic:pic>
-              </a:graphicData>
-            </a:graphic>
-          </wp:inline>
-        </w:drawing>
-      </w:r>
-    </w:p>
-    <w:p>
-      <w:pPr/>
-      <w:r>
-        <w:rPr>
-          <w:b w:val="0"/>
-        </w:rPr>
-        <w:t>The winning configuration produces feedback that teaches: real criticisms grounded in quotes from the actual answer, and credit for what the answer genuinely covers.</w:t>
-      </w:r>
-    </w:p>
-    <w:p>
-      <w:r>
-        <w:drawing>
-          <wp:inline xmlns:a="http://schemas.openxmlformats.org/drawingml/2006/main" xmlns:pic="http://schemas.openxmlformats.org/drawingml/2006/picture">
-            <wp:extent cx="5760720" cy="1440180"/>
-            <wp:docPr id="1758724909" name="Picture 1758724909"/>
-            <wp:cNvGraphicFramePr>
-              <a:graphicFrameLocks noChangeAspect="1"/>
-            </wp:cNvGraphicFramePr>
-            <a:graphic>
-              <a:graphicData uri="http://schemas.openxmlformats.org/drawingml/2006/picture">
-                <pic:pic>
-                  <pic:nvPicPr>
-                    <pic:cNvPr id="0" name="phase13_verdict.png"/>
-                    <pic:cNvPicPr/>
-                  </pic:nvPicPr>
-                  <pic:blipFill>
-                    <a:blip r:embed="rId28"/>
-                    <a:stretch>
-                      <a:fillRect/>
-                    </a:stretch>
-                  </pic:blipFill>
-                  <pic:spPr>
-                    <a:xfrm>
-                      <a:off x="0" y="0"/>
-                      <a:ext cx="5760720" cy="1440180"/>
-                    </a:xfrm>
-                    <a:prstGeom prst="rect"/>
-                  </pic:spPr>
-                </pic:pic>
-              </a:graphicData>
-            </a:graphic>
-          </wp:inline>
-        </w:drawing>
-      </w:r>
-    </w:p>
-    <w:p>
       <w:pPr>
         <w:keepNext/>
         <w:keepLines/>
@@ -2909,9 +2829,6 @@
         <w:keepLines/>
       </w:pPr>
       <w:r>
-        <w:rPr>
-          <w:b w:val="0"/>
-        </w:rPr>
         <w:t>qwen2.5:14b adopted as the default judge. must_avoid penalty items remain in the case data but render only when JAI_RUBRIC_PENALTIES=1 is set, reserved for a judge strong enough to use them honestly. Penalty wording in cases.json rewritten to be explicit, and every run file now records the exact judge model (provider label OllamaProvider:qwen2.5:14b).</w:t>
       </w:r>
     </w:p>
@@ -2932,838 +2849,10 @@
         <w:keepLines/>
       </w:pPr>
       <w:r>
-        <w:rPr>
-          <w:b w:val="0"/>
-        </w:rPr>
-        <w:t>A bigger judge is not automatically a better judge. Calibrating a new judge model against answers with known correct verdicts is now the standing procedure before trusting it, and the system remains fully local, free, and uninterruptible.</w:t>
-      </w:r>
-    </w:p>
-    <w:p>
-      <w:pPr/>
-      <w:r>
-        <w:rPr>
-          <w:b/>
-        </w:rPr>
-        <w:t>Phase 14 — The Student Agent: the Examiner Becomes a Tool</w:t>
-      </w:r>
-    </w:p>
-    <w:p>
-      <w:pPr/>
-      <w:r>
-        <w:rPr>
-          <w:b w:val="0"/>
-        </w:rPr>
-        <w:t>Built the first agent in J_AI. The OllamaProvider gained a chat method that speaks the chat endpoint with tool definitions, and jai/agent/student.py runs the loop on top of it: the model drafts an answer, calls the submit_answer tool, reads the verdict that comes back, revises, and repeats until it passes or spends its budget of 5 submissions. Guardrails from day one: a step cap so the loop always terminates, a nudge cap for a model that keeps talking instead of calling the tool, refusal of any unknown tool name, and the rule that only a graded submission counts as an attempt.</w:t>
-      </w:r>
-    </w:p>
-    <w:p>
-      <w:pPr/>
-      <w:r>
-        <w:rPr>
-          <w:b w:val="0"/>
-        </w:rPr>
-        <w:t>Then tried to break it, which is how an agent should be tested. The nudge guard earned its place immediately: in five of the eight counted runs the model tried to answer in plain text without ever calling the tool, and the guard pushed it back every time. A second find: after passing, the model liked to rewrite its answer inside the closing message, so the recorded final answer is now always the best graded attempt, never the unguarded epilogue. One run also derailed into a revision written entirely in Thai, which the strict marking failed on content grounds anyway.</w:t>
-      </w:r>
-    </w:p>
-    <w:p>
-      <w:pPr/>
-      <w:r>
-        <w:rPr>
-          <w:b w:val="0"/>
-        </w:rPr>
-        <w:t>The biggest finding was about the judge, not the student. On LOG_001 the qwen2.5:14b judge returned a pass verdict while its own verdict listed four of the five required points as missing, with min_points set at 5. The verdict field is simply not tied to the marking scheme the judge was handed:</w:t>
-      </w:r>
-    </w:p>
-    <w:p>
-      <w:r>
-        <w:drawing>
-          <wp:inline xmlns:a="http://schemas.openxmlformats.org/drawingml/2006/main" xmlns:pic="http://schemas.openxmlformats.org/drawingml/2006/picture">
-            <wp:extent cx="5760720" cy="1952244"/>
-            <wp:docPr id="1758724910" name="Picture 1758724910"/>
-            <wp:cNvGraphicFramePr>
-              <a:graphicFrameLocks noChangeAspect="1"/>
-            </wp:cNvGraphicFramePr>
-            <a:graphic>
-              <a:graphicData uri="http://schemas.openxmlformats.org/drawingml/2006/picture">
-                <pic:pic>
-                  <pic:nvPicPr>
-                    <pic:cNvPr id="0" name="p14_contradiction.png"/>
-                    <pic:cNvPicPr/>
-                  </pic:nvPicPr>
-                  <pic:blipFill>
-                    <a:blip r:embed="rId29"/>
-                    <a:stretch>
-                      <a:fillRect/>
-                    </a:stretch>
-                  </pic:blipFill>
-                  <pic:spPr>
-                    <a:xfrm>
-                      <a:off x="0" y="0"/>
-                      <a:ext cx="5760720" cy="1952244"/>
-                    </a:xfrm>
-                    <a:prstGeom prst="rect"/>
-                  </pic:spPr>
-                </pic:pic>
-              </a:graphicData>
-            </a:graphic>
-          </wp:inline>
-        </w:drawing>
-      </w:r>
-    </w:p>
-    <w:p>
-      <w:pPr/>
-      <w:r>
-        <w:rPr>
-          <w:b w:val="0"/>
-        </w:rPr>
-        <w:t>Because of that, the agent got a --strict mode that applies the min_points count on the agent side and overrides a lenient judge. Under strict marking the loop behaves honestly: the judge keeps saying pass, strict keeps saying not yet, and the run ends by the guard instead of by flattery:</w:t>
-      </w:r>
-    </w:p>
-    <w:p>
-      <w:r>
-        <w:drawing>
-          <wp:inline xmlns:a="http://schemas.openxmlformats.org/drawingml/2006/main" xmlns:pic="http://schemas.openxmlformats.org/drawingml/2006/picture">
-            <wp:extent cx="5760720" cy="997048"/>
-            <wp:docPr id="1758724911" name="Picture 1758724911"/>
-            <wp:cNvGraphicFramePr>
-              <a:graphicFrameLocks noChangeAspect="1"/>
-            </wp:cNvGraphicFramePr>
-            <a:graphic>
-              <a:graphicData uri="http://schemas.openxmlformats.org/drawingml/2006/picture">
-                <pic:pic>
-                  <pic:nvPicPr>
-                    <pic:cNvPr id="0" name="p14_strict.png"/>
-                    <pic:cNvPicPr/>
-                  </pic:nvPicPr>
-                  <pic:blipFill>
-                    <a:blip r:embed="rId30"/>
-                    <a:stretch>
-                      <a:fillRect/>
-                    </a:stretch>
-                  </pic:blipFill>
-                  <pic:spPr>
-                    <a:xfrm>
-                      <a:off x="0" y="0"/>
-                      <a:ext cx="5760720" cy="997048"/>
-                    </a:xfrm>
-                    <a:prstGeom prst="rect"/>
-                  </pic:spPr>
-                </pic:pic>
-              </a:graphicData>
-            </a:graphic>
-          </wp:inline>
-        </w:drawing>
-      </w:r>
-    </w:p>
-    <w:p>
-      <w:pPr>
-        <w:keepNext/>
-        <w:keepLines/>
-      </w:pPr>
-      <w:r>
-        <w:rPr>
-          <w:b/>
-        </w:rPr>
-        <w:t>Result:</w:t>
-      </w:r>
-    </w:p>
-    <w:p>
-      <w:pPr/>
-      <w:r>
-        <w:rPr>
-          <w:b w:val="0"/>
-        </w:rPr>
-        <w:t>J_AI has a working student agent with a step cap, a nudge cap, a submission budget, unknown-tool refusal, and a final answer that is always the best graded attempt. Strict mode applies the min_points check agent-side. Nine run transcripts are saved under runs/agent_misc.</w:t>
-      </w:r>
-    </w:p>
-    <w:p>
-      <w:pPr>
-        <w:keepNext/>
-        <w:keepLines/>
-      </w:pPr>
-      <w:r>
-        <w:rPr>
-          <w:b/>
-        </w:rPr>
-        <w:t>Outcome:</w:t>
-      </w:r>
-    </w:p>
-    <w:p>
-      <w:pPr>
-        <w:keepLines/>
-      </w:pPr>
-      <w:r>
-        <w:rPr>
-          <w:b w:val="0"/>
-        </w:rPr>
-        <w:t>An agent is tested by trying to break it, and the transcripts indicted the judge more than the student: a verdict that ignores its own marking scheme cannot referee a revision loop. Choosing a better judge became the next session.</w:t>
-      </w:r>
-    </w:p>
-    <w:p>
-      <w:pPr/>
-      <w:r>
-        <w:rPr>
-          <w:b/>
-        </w:rPr>
-        <w:t>Phase 15 — Model Bake-off Round One: gpt-oss Takes the Chair</w:t>
-      </w:r>
-    </w:p>
-    <w:p>
-      <w:pPr/>
-      <w:r>
-        <w:rPr>
-          <w:b w:val="0"/>
-        </w:rPr>
-        <w:t>Asked which local model actually does tool calling well. Research said the Qwen 3.x line leads the open models, but pulling one was refused: they need a newer Ollama than the installed 0.17.0. So round one was fought between what this machine could run: qwen2.5:14b against gpt-oss:20b, a 13GB model with tools, thinking, and structured output that fits the RTX 5080.</w:t>
-      </w:r>
-    </w:p>
-    <w:p>
-      <w:pPr/>
-      <w:r>
-        <w:rPr>
-          <w:b w:val="0"/>
-        </w:rPr>
-        <w:t>The architecture was upgraded first so the contest would be fair. The provider factory now understands roles, JAI_JUDGE_MODEL and JAI_STUDENT_MODEL with matching THINK overrides, so the judge and the student can be different models. Verdicts are enforced through VERDICT_SCHEMA passed to Ollama's structured output format, with the old JSON rescue kept as a fallback. Tool messages carry the tool name, and thinking traces flow back into the agent history.</w:t>
-      </w:r>
-    </w:p>
-    <w:p>
-      <w:pPr/>
-      <w:r>
-        <w:rPr>
-          <w:b w:val="0"/>
-        </w:rPr>
-        <w:t>The bake-off itself: all 5 cases, strict marking, the same model playing both student and judge. It was not close. qwen2.5:14b passed nothing, burned 17 submissions and 9 nudges, and 16 of its 17 verdicts were inconsistent with the marking scheme it was shown. gpt-oss:20b passed all five, one submission each, zero nudges, zero inconsistent verdicts, in half the wall time:</w:t>
-      </w:r>
-    </w:p>
-    <w:p>
-      <w:r>
-        <w:drawing>
-          <wp:inline xmlns:a="http://schemas.openxmlformats.org/drawingml/2006/main" xmlns:pic="http://schemas.openxmlformats.org/drawingml/2006/picture">
-            <wp:extent cx="5760720" cy="804425"/>
-            <wp:docPr id="1758724912" name="Picture 1758724912"/>
-            <wp:cNvGraphicFramePr>
-              <a:graphicFrameLocks noChangeAspect="1"/>
-            </wp:cNvGraphicFramePr>
-            <a:graphic>
-              <a:graphicData uri="http://schemas.openxmlformats.org/drawingml/2006/picture">
-                <pic:pic>
-                  <pic:nvPicPr>
-                    <pic:cNvPr id="0" name="p15_tally.png"/>
-                    <pic:cNvPicPr/>
-                  </pic:nvPicPr>
-                  <pic:blipFill>
-                    <a:blip r:embed="rId31"/>
-                    <a:stretch>
-                      <a:fillRect/>
-                    </a:stretch>
-                  </pic:blipFill>
-                  <pic:spPr>
-                    <a:xfrm>
-                      <a:off x="0" y="0"/>
-                      <a:ext cx="5760720" cy="804425"/>
-                    </a:xfrm>
-                    <a:prstGeom prst="rect"/>
-                  </pic:spPr>
-                </pic:pic>
-              </a:graphicData>
-            </a:graphic>
-          </wp:inline>
-        </w:drawing>
-      </w:r>
-    </w:p>
-    <w:tbl>
-      <w:tblPr>
-        <w:tblW w:type="auto" w:w="0"/>
-        <w:tblLayout w:type="fixed"/>
-        <w:tblLook w:firstColumn="1" w:firstRow="1" w:lastColumn="0" w:lastRow="0" w:noHBand="0" w:noVBand="1" w:val="04A0"/>
-        <w:tblBorders>
-          <w:top w:val="single" w:sz="4" w:space="0" w:color="999999"/>
-          <w:left w:val="single" w:sz="4" w:space="0" w:color="999999"/>
-          <w:bottom w:val="single" w:sz="4" w:space="0" w:color="999999"/>
-          <w:right w:val="single" w:sz="4" w:space="0" w:color="999999"/>
-          <w:insideH w:val="single" w:sz="4" w:space="0" w:color="999999"/>
-          <w:insideV w:val="single" w:sz="4" w:space="0" w:color="999999"/>
-        </w:tblBorders>
-      </w:tblPr>
-      <w:tblGrid>
-        <w:gridCol w:w="3120"/>
-        <w:gridCol w:w="3120"/>
-        <w:gridCol w:w="3120"/>
-      </w:tblGrid>
-      <w:tr>
-        <w:tc>
-          <w:tcPr>
-            <w:tcW w:type="dxa" w:w="3888"/>
-          </w:tcPr>
-          <w:p>
-            <w:r>
-              <w:rPr>
-                <w:b/>
-              </w:rPr>
-              <w:t>Measure</w:t>
-            </w:r>
-          </w:p>
-        </w:tc>
-        <w:tc>
-          <w:tcPr>
-            <w:tcW w:type="dxa" w:w="2736"/>
-          </w:tcPr>
-          <w:p>
-            <w:r>
-              <w:rPr>
-                <w:b/>
-              </w:rPr>
-              <w:t>qwen2.5:14b</w:t>
-            </w:r>
-          </w:p>
-        </w:tc>
-        <w:tc>
-          <w:tcPr>
-            <w:tcW w:type="dxa" w:w="2736"/>
-          </w:tcPr>
-          <w:p>
-            <w:r>
-              <w:rPr>
-                <w:b/>
-              </w:rPr>
-              <w:t>gpt-oss:20b think=low</w:t>
-            </w:r>
-          </w:p>
-        </w:tc>
-      </w:tr>
-      <w:tr>
-        <w:tc>
-          <w:tcPr>
-            <w:tcW w:type="dxa" w:w="3888"/>
-          </w:tcPr>
-          <w:p>
-            <w:r>
-              <w:t>Cases passed (strict)</w:t>
-            </w:r>
-          </w:p>
-        </w:tc>
-        <w:tc>
-          <w:tcPr>
-            <w:tcW w:type="dxa" w:w="2736"/>
-          </w:tcPr>
-          <w:p>
-            <w:r>
-              <w:t>0 of 5</w:t>
-            </w:r>
-          </w:p>
-        </w:tc>
-        <w:tc>
-          <w:tcPr>
-            <w:tcW w:type="dxa" w:w="2736"/>
-          </w:tcPr>
-          <w:p>
-            <w:r>
-              <w:t>5 of 5</w:t>
-            </w:r>
-          </w:p>
-        </w:tc>
-      </w:tr>
-      <w:tr>
-        <w:tc>
-          <w:tcPr>
-            <w:tcW w:type="dxa" w:w="3888"/>
-          </w:tcPr>
-          <w:p>
-            <w:r>
-              <w:t>Submissions used</w:t>
-            </w:r>
-          </w:p>
-        </w:tc>
-        <w:tc>
-          <w:tcPr>
-            <w:tcW w:type="dxa" w:w="2736"/>
-          </w:tcPr>
-          <w:p>
-            <w:r>
-              <w:t>17</w:t>
-            </w:r>
-          </w:p>
-        </w:tc>
-        <w:tc>
-          <w:tcPr>
-            <w:tcW w:type="dxa" w:w="2736"/>
-          </w:tcPr>
-          <w:p>
-            <w:r>
-              <w:t>5</w:t>
-            </w:r>
-          </w:p>
-        </w:tc>
-      </w:tr>
-      <w:tr>
-        <w:tc>
-          <w:tcPr>
-            <w:tcW w:type="dxa" w:w="3888"/>
-          </w:tcPr>
-          <w:p>
-            <w:r>
-              <w:t>Nudges needed</w:t>
-            </w:r>
-          </w:p>
-        </w:tc>
-        <w:tc>
-          <w:tcPr>
-            <w:tcW w:type="dxa" w:w="2736"/>
-          </w:tcPr>
-          <w:p>
-            <w:r>
-              <w:t>9</w:t>
-            </w:r>
-          </w:p>
-        </w:tc>
-        <w:tc>
-          <w:tcPr>
-            <w:tcW w:type="dxa" w:w="2736"/>
-          </w:tcPr>
-          <w:p>
-            <w:r>
-              <w:t>0</w:t>
-            </w:r>
-          </w:p>
-        </w:tc>
-      </w:tr>
-      <w:tr>
-        <w:tc>
-          <w:tcPr>
-            <w:tcW w:type="dxa" w:w="3888"/>
-          </w:tcPr>
-          <w:p>
-            <w:r>
-              <w:t>Verdicts inconsistent with scheme</w:t>
-            </w:r>
-          </w:p>
-        </w:tc>
-        <w:tc>
-          <w:tcPr>
-            <w:tcW w:type="dxa" w:w="2736"/>
-          </w:tcPr>
-          <w:p>
-            <w:r>
-              <w:t>16 of 17</w:t>
-            </w:r>
-          </w:p>
-        </w:tc>
-        <w:tc>
-          <w:tcPr>
-            <w:tcW w:type="dxa" w:w="2736"/>
-          </w:tcPr>
-          <w:p>
-            <w:r>
-              <w:t>0</w:t>
-            </w:r>
-          </w:p>
-        </w:tc>
-      </w:tr>
-      <w:tr>
-        <w:tc>
-          <w:tcPr>
-            <w:tcW w:type="dxa" w:w="3888"/>
-          </w:tcPr>
-          <w:p>
-            <w:r>
-              <w:t>Wall time, all 5 cases</w:t>
-            </w:r>
-          </w:p>
-        </w:tc>
-        <w:tc>
-          <w:tcPr>
-            <w:tcW w:type="dxa" w:w="2736"/>
-          </w:tcPr>
-          <w:p>
-            <w:r>
-              <w:t>373 s</w:t>
-            </w:r>
-          </w:p>
-        </w:tc>
-        <w:tc>
-          <w:tcPr>
-            <w:tcW w:type="dxa" w:w="2736"/>
-          </w:tcPr>
-          <w:p>
-            <w:r>
-              <w:t>196 s</w:t>
-            </w:r>
-          </w:p>
-        </w:tc>
-      </w:tr>
-    </w:tbl>
-    <w:p>
-      <w:pPr/>
-      <w:r>
-        <w:rPr>
-          <w:b w:val="0"/>
-        </w:rPr>
-      </w:r>
-    </w:p>
-    <w:p>
-      <w:pPr/>
-      <w:r>
-        <w:rPr>
-          <w:b w:val="0"/>
-        </w:rPr>
-        <w:t>Before believing the row of tens, the winners were cross-graded: gpt-oss's verdicts followed the scheme on qwen's answers and gave one honest fail, and weak control answers scored 0 with every point listed missing. qwen graded the other direction by passing every gpt-oss answer while still listing a missing point each time, the same contradiction as Phase 14. One caveat went straight into the log: gpt-oss's scores run generous, many tens, so the verdicts are trustworthy but the scores need calibration.</w:t>
-      </w:r>
-    </w:p>
-    <w:p>
-      <w:pPr>
-        <w:keepNext/>
-        <w:keepLines/>
-      </w:pPr>
-      <w:r>
-        <w:rPr>
-          <w:b/>
-        </w:rPr>
-        <w:t>Result:</w:t>
-      </w:r>
-    </w:p>
-    <w:p>
-      <w:pPr/>
-      <w:r>
-        <w:rPr>
-          <w:b w:val="0"/>
-        </w:rPr>
-        <w:t>gpt-oss:20b with think=low became the default for both roles. Judge and student roles live in the provider factory, verdicts are schema-enforced through Ollama's structured output with the JSON rescue as fallback, and the README and USAGE carry the bake-off evidence and the roles section.</w:t>
-      </w:r>
-    </w:p>
-    <w:p>
-      <w:pPr>
-        <w:keepNext/>
-        <w:keepLines/>
-      </w:pPr>
-      <w:r>
-        <w:rPr>
-          <w:b/>
-        </w:rPr>
-        <w:t>Outcome:</w:t>
-      </w:r>
-    </w:p>
-    <w:p>
-      <w:pPr>
-        <w:keepLines/>
-      </w:pPr>
-      <w:r>
-        <w:rPr>
-          <w:b w:val="0"/>
-        </w:rPr>
-        <w:t>The contest decides, not the spec sheet. Measured on my own cases, the smaller model was unusable as a revision-loop judge while gpt-oss ran the whole ladder cleanly at half the time. The same bake-off format is now the entry exam for any new model.</w:t>
-      </w:r>
-    </w:p>
-    <w:p>
-      <w:pPr/>
-      <w:r>
-        <w:rPr>
-          <w:b/>
-        </w:rPr>
-        <w:t>Phase 16 — Ollama Upgrade and Bake-off Round Two: qwen3.8:27b</w:t>
-      </w:r>
-    </w:p>
-    <w:p>
-      <w:pPr/>
-      <w:r>
-        <w:rPr>
-          <w:b w:val="0"/>
-        </w:rPr>
-        <w:t>The round-one research left an open door: the Qwen 3.x models needed a newer Ollama, and system installs are mine to run. I ran the upgrade myself, 0.17.0 to 0.34.0 with sudo, and pulled qwen3.8:27b, a 17GB model with tools, thinking, and vision. Then the exact same bake-off, no favoritism: 5 cases, strict, both roles.</w:t>
-      </w:r>
-    </w:p>
-    <w:p>
-      <w:pPr/>
-      <w:r>
-        <w:rPr>
-          <w:b w:val="0"/>
-        </w:rPr>
-        <w:t>It passed 5 of 5 with zero nudges, but the number that mattered was a 3. On LOG_001 it was the only judge in three rounds that failed a genuinely decent first draft, and it said precisely why: no hierarchical layer model, no addressing plan, no redundancy. That is a marking scheme doing its job:</w:t>
-      </w:r>
-    </w:p>
-    <w:p>
-      <w:r>
-        <w:drawing>
-          <wp:inline xmlns:a="http://schemas.openxmlformats.org/drawingml/2006/main" xmlns:pic="http://schemas.openxmlformats.org/drawingml/2006/picture">
-            <wp:extent cx="5760720" cy="2175591"/>
-            <wp:docPr id="1758724913" name="Picture 1758724913"/>
-            <wp:cNvGraphicFramePr>
-              <a:graphicFrameLocks noChangeAspect="1"/>
-            </wp:cNvGraphicFramePr>
-            <a:graphic>
-              <a:graphicData uri="http://schemas.openxmlformats.org/drawingml/2006/picture">
-                <pic:pic>
-                  <pic:nvPicPr>
-                    <pic:cNvPr id="0" name="p16_firstfail.png"/>
-                    <pic:cNvPicPr/>
-                  </pic:nvPicPr>
-                  <pic:blipFill>
-                    <a:blip r:embed="rId32"/>
-                    <a:stretch>
-                      <a:fillRect/>
-                    </a:stretch>
-                  </pic:blipFill>
-                  <pic:spPr>
-                    <a:xfrm>
-                      <a:off x="0" y="0"/>
-                      <a:ext cx="5760720" cy="2175591"/>
-                    </a:xfrm>
-                    <a:prstGeom prst="rect"/>
-                  </pic:spPr>
-                </pic:pic>
-              </a:graphicData>
-            </a:graphic>
-          </wp:inline>
-        </w:drawing>
-      </w:r>
-    </w:p>
-    <w:p>
-      <w:pPr/>
-      <w:r>
-        <w:rPr>
-          <w:b w:val="0"/>
-        </w:rPr>
-        <w:t>The revision that followed built the three-tier model, a tabulated addressing plan, and LACP, VRRP/HSRP and RSTP redundancy, and the judge raised it to 8 while still catching a subtle inaccuracy in the revised text, with the quote to prove it:</w:t>
-      </w:r>
-    </w:p>
-    <w:p>
-      <w:r>
-        <w:drawing>
-          <wp:inline xmlns:a="http://schemas.openxmlformats.org/drawingml/2006/main" xmlns:pic="http://schemas.openxmlformats.org/drawingml/2006/picture">
-            <wp:extent cx="5760720" cy="1472184"/>
-            <wp:docPr id="1758724914" name="Picture 1758724914"/>
-            <wp:cNvGraphicFramePr>
-              <a:graphicFrameLocks noChangeAspect="1"/>
-            </wp:cNvGraphicFramePr>
-            <a:graphic>
-              <a:graphicData uri="http://schemas.openxmlformats.org/drawingml/2006/picture">
-                <pic:pic>
-                  <pic:nvPicPr>
-                    <pic:cNvPr id="0" name="p16_revision.png"/>
-                    <pic:cNvPicPr/>
-                  </pic:nvPicPr>
-                  <pic:blipFill>
-                    <a:blip r:embed="rId33"/>
-                    <a:stretch>
-                      <a:fillRect/>
-                    </a:stretch>
-                  </pic:blipFill>
-                  <pic:spPr>
-                    <a:xfrm>
-                      <a:off x="0" y="0"/>
-                      <a:ext cx="5760720" cy="1472184"/>
-                    </a:xfrm>
-                    <a:prstGeom prst="rect"/>
-                  </pic:spPr>
-                </pic:pic>
-              </a:graphicData>
-            </a:graphic>
-          </wp:inline>
-        </w:drawing>
-      </w:r>
-    </w:p>
-    <w:p>
-      <w:pPr/>
-      <w:r>
-        <w:rPr>
-          <w:b w:val="0"/>
-        </w:rPr>
-        <w:t>Cross-grading sealed it. Handed a gpt-oss answer that gpt-oss had scored 10, qwen3.8 found a counting error, a misused spine-leaf term, and a ports-versus-uplinks confusion, each backed by a quote from the answer. Weak control answers moved from 0 to 1, partial controls from 1 to 4, all fails, which is the score spread the generous judge could not produce. One real bug surfaced and was fixed on the spot: 3 of 17 verdicts came back as provider_error because thinking tokens ate the 1024-token structured budget before the JSON appeared, so JAI_STRUCTURED_MAX_TOKENS is now 4096 and the timeout guidance is 600 seconds.</w:t>
-      </w:r>
-    </w:p>
-    <w:p>
-      <w:pPr>
-        <w:keepNext/>
-        <w:keepLines/>
-      </w:pPr>
-      <w:r>
-        <w:rPr>
-          <w:b/>
-        </w:rPr>
-        <w:t>Result:</w:t>
-      </w:r>
-    </w:p>
-    <w:p>
-      <w:pPr/>
-      <w:r>
-        <w:rPr>
-          <w:b w:val="0"/>
-        </w:rPr>
-        <w:t>qwen3.8:27b with think=low is the default judge and student in .env, with gpt-oss:20b kept as the fast judge, about five times quicker. The structured output budget is 4096 tokens, the timeout 600 seconds, and the price is real: 17GB on a 16GB card means 50 to 140 seconds per grading, acceptable for quality runs, wrong for batches.</w:t>
-      </w:r>
-    </w:p>
-    <w:p>
-      <w:pPr>
-        <w:keepNext/>
-        <w:keepLines/>
-      </w:pPr>
-      <w:r>
-        <w:rPr>
-          <w:b/>
-        </w:rPr>
-        <w:t>Outcome:</w:t>
-      </w:r>
-    </w:p>
-    <w:p>
-      <w:pPr>
-        <w:keepLines/>
-      </w:pPr>
-      <w:r>
-        <w:rPr>
-          <w:b w:val="0"/>
-        </w:rPr>
-        <w:t>Round two only happened because round one recorded its method. Upgrade the infrastructure, rerun the identical exam, adopt the winner, keep the runner-up for speed: judge selection in J_AI is now a repeatable procedure instead of a preference.</w:t>
-      </w:r>
-    </w:p>
-    <w:p>
-      <w:pPr/>
-      <w:r>
-        <w:rPr>
-          <w:b/>
-        </w:rPr>
-        <w:t>Phase 17 — Grading Myself with the Adopted Judge</w:t>
-      </w:r>
-    </w:p>
-    <w:p>
-      <w:pPr/>
-      <w:r>
-        <w:rPr>
-          <w:b w:val="0"/>
-        </w:rPr>
-        <w:t>The setup proves itself on my own work. My three ITE402 answers from September 3 went through the real batch path, eval mode into the scoreboard into the report writer, graded by qwen3.8:27b. REQ_001 4/10, REQ_002 1/10, LOG_001 1/10, every verdict a fail, both blank cases stopped by the guard, zero provider errors, and the run file records exactly which judge graded it:</w:t>
-      </w:r>
-    </w:p>
-    <w:p>
-      <w:r>
-        <w:drawing>
-          <wp:inline xmlns:a="http://schemas.openxmlformats.org/drawingml/2006/main" xmlns:pic="http://schemas.openxmlformats.org/drawingml/2006/picture">
-            <wp:extent cx="5760720" cy="1836230"/>
-            <wp:docPr id="1758724915" name="Picture 1758724915"/>
-            <wp:cNvGraphicFramePr>
-              <a:graphicFrameLocks noChangeAspect="1"/>
-            </wp:cNvGraphicFramePr>
-            <a:graphic>
-              <a:graphicData uri="http://schemas.openxmlformats.org/drawingml/2006/picture">
-                <pic:pic>
-                  <pic:nvPicPr>
-                    <pic:cNvPr id="0" name="p17_scoreboard.png"/>
-                    <pic:cNvPicPr/>
-                  </pic:nvPicPr>
-                  <pic:blipFill>
-                    <a:blip r:embed="rId34"/>
-                    <a:stretch>
-                      <a:fillRect/>
-                    </a:stretch>
-                  </pic:blipFill>
-                  <pic:spPr>
-                    <a:xfrm>
-                      <a:off x="0" y="0"/>
-                      <a:ext cx="5760720" cy="1836230"/>
-                    </a:xfrm>
-                    <a:prstGeom prst="rect"/>
-                  </pic:spPr>
-                </pic:pic>
-              </a:graphicData>
-            </a:graphic>
-          </wp:inline>
-        </w:drawing>
-      </w:r>
-    </w:p>
-    <w:p>
-      <w:pPr/>
-      <w:r>
-        <w:rPr>
-          <w:b w:val="0"/>
-        </w:rPr>
-        <w:t>The verdicts agree with llama3 and qwen2.5 on the outcome but finally state the reasons with evidence. I described staff rosters instead of a network. I conflated a server with a switch, and the judge quoted me doing it: a server does not connect PCs to a network, switches and routers perform that role. I wrote portal where segmentation was needed. The recall gap from September 3 is unchanged, but it is now named precisely: answer the engineering framework, goals, constraints, segmentation, addressing, routing, redundancy, not the operation.</w:t>
-      </w:r>
-    </w:p>
-    <w:p>
-      <w:pPr/>
-      <w:r>
-        <w:rPr>
-          <w:b w:val="0"/>
-        </w:rPr>
-        <w:t>The session closed with the agent getting a proper test suite: tests/test_student_agent.py, ten tests driven by a scripted fake provider so no model is needed, covering the unknown-tool refusal, a provider_error inside the loop, an empty reply, the step cap, the nudge cap, the budget forcing a final answer, the strict override, and the check that the answer key never leaks to the student:</w:t>
-      </w:r>
-    </w:p>
-    <w:p>
-      <w:r>
-        <w:drawing>
-          <wp:inline xmlns:a="http://schemas.openxmlformats.org/drawingml/2006/main" xmlns:pic="http://schemas.openxmlformats.org/drawingml/2006/picture">
-            <wp:extent cx="5760720" cy="2880360"/>
-            <wp:docPr id="1758724916" name="Picture 1758724916"/>
-            <wp:cNvGraphicFramePr>
-              <a:graphicFrameLocks noChangeAspect="1"/>
-            </wp:cNvGraphicFramePr>
-            <a:graphic>
-              <a:graphicData uri="http://schemas.openxmlformats.org/drawingml/2006/picture">
-                <pic:pic>
-                  <pic:nvPicPr>
-                    <pic:cNvPr id="0" name="p17_tests.png"/>
-                    <pic:cNvPicPr/>
-                  </pic:nvPicPr>
-                  <pic:blipFill>
-                    <a:blip r:embed="rId35"/>
-                    <a:stretch>
-                      <a:fillRect/>
-                    </a:stretch>
-                  </pic:blipFill>
-                  <pic:spPr>
-                    <a:xfrm>
-                      <a:off x="0" y="0"/>
-                      <a:ext cx="5760720" cy="2880360"/>
-                    </a:xfrm>
-                    <a:prstGeom prst="rect"/>
-                  </pic:spPr>
-                </pic:pic>
-              </a:graphicData>
-            </a:graphic>
-          </wp:inline>
-        </w:drawing>
-      </w:r>
-    </w:p>
-    <w:p>
-      <w:pPr>
-        <w:keepNext/>
-        <w:keepLines/>
-      </w:pPr>
-      <w:r>
-        <w:rPr>
-          <w:b/>
-        </w:rPr>
-        <w:t>Result:</w:t>
-      </w:r>
-    </w:p>
-    <w:p>
-      <w:pPr/>
-      <w:r>
-        <w:rPr>
-          <w:b w:val="0"/>
-        </w:rPr>
-        <w:t>The adopted judge grades my real answers with quoted evidence through the full batch path, the report is filed with the repo, and the agent's guardrails are pinned by ten green unit tests that run in a millisecond without a model.</w:t>
-      </w:r>
-    </w:p>
-    <w:p>
-      <w:pPr>
-        <w:keepNext/>
-        <w:keepLines/>
-      </w:pPr>
-      <w:r>
-        <w:rPr>
-          <w:b/>
-        </w:rPr>
-        <w:t>Outcome:</w:t>
-      </w:r>
-    </w:p>
-    <w:p>
-      <w:pPr>
-        <w:keepLines/>
-      </w:pPr>
-      <w:r>
-        <w:rPr>
-          <w:b w:val="0"/>
-        </w:rPr>
-        <w:t>The judge is now better at naming my gap than I am at hiding it. The next honest measure is not another tool: re-answer REQ_002 and LOG_001 framework-first and regrade, and see whether the number moves.</w:t>
+        <w:t>A bigger judge is not automatically a better judge. Calibrating a new judge model against answers with known correct verdicts is now the standing procedure before trusting it</w:t>
+      </w:r>
+      <w:r>
+        <w:t>.</w:t>
       </w:r>
     </w:p>
     <w:sectPr>

</xml_diff>

<commit_message>
Journal: restore Phases 14-17 (dropped by the Sep 14 commit of an older copy), keeping the Phase 13 outcome trim
</commit_message>
<xml_diff>
--- a/docs/Project Journal - J_AI.docx
+++ b/docs/Project Journal - J_AI.docx
@@ -2853,6 +2853,834 @@
       </w:r>
       <w:r>
         <w:t>.</w:t>
+      </w:r>
+    </w:p>
+    <w:p>
+      <w:pPr/>
+      <w:r>
+        <w:rPr>
+          <w:b/>
+        </w:rPr>
+        <w:t>Phase 14 — The Student Agent: the Examiner Becomes a Tool</w:t>
+      </w:r>
+    </w:p>
+    <w:p>
+      <w:pPr/>
+      <w:r>
+        <w:rPr>
+          <w:b w:val="0"/>
+        </w:rPr>
+        <w:t>Built the first agent in J_AI. The OllamaProvider gained a chat method that speaks the chat endpoint with tool definitions, and jai/agent/student.py runs the loop on top of it: the model drafts an answer, calls the submit_answer tool, reads the verdict that comes back, revises, and repeats until it passes or spends its budget of 5 submissions. Guardrails from day one: a step cap so the loop always terminates, a nudge cap for a model that keeps talking instead of calling the tool, refusal of any unknown tool name, and the rule that only a graded submission counts as an attempt.</w:t>
+      </w:r>
+    </w:p>
+    <w:p>
+      <w:pPr/>
+      <w:r>
+        <w:rPr>
+          <w:b w:val="0"/>
+        </w:rPr>
+        <w:t>Then tried to break it, which is how an agent should be tested. The nudge guard earned its place immediately: in five of the eight counted runs the model tried to answer in plain text without ever calling the tool, and the guard pushed it back every time. A second find: after passing, the model liked to rewrite its answer inside the closing message, so the recorded final answer is now always the best graded attempt, never the unguarded epilogue. One run also derailed into a revision written entirely in Thai, which the strict marking failed on content grounds anyway.</w:t>
+      </w:r>
+    </w:p>
+    <w:p>
+      <w:pPr/>
+      <w:r>
+        <w:rPr>
+          <w:b w:val="0"/>
+        </w:rPr>
+        <w:t>The biggest finding was about the judge, not the student. On LOG_001 the qwen2.5:14b judge returned a pass verdict while its own verdict listed four of the five required points as missing, with min_points set at 5. The verdict field is simply not tied to the marking scheme the judge was handed:</w:t>
+      </w:r>
+    </w:p>
+    <w:p>
+      <w:r>
+        <w:drawing>
+          <wp:inline xmlns:a="http://schemas.openxmlformats.org/drawingml/2006/main" xmlns:pic="http://schemas.openxmlformats.org/drawingml/2006/picture">
+            <wp:extent cx="5760720" cy="1952244"/>
+            <wp:docPr id="1758724910" name="Picture 1758724910"/>
+            <wp:cNvGraphicFramePr>
+              <a:graphicFrameLocks noChangeAspect="1"/>
+            </wp:cNvGraphicFramePr>
+            <a:graphic>
+              <a:graphicData uri="http://schemas.openxmlformats.org/drawingml/2006/picture">
+                <pic:pic>
+                  <pic:nvPicPr>
+                    <pic:cNvPr id="0" name="p14_contradiction.png"/>
+                    <pic:cNvPicPr/>
+                  </pic:nvPicPr>
+                  <pic:blipFill>
+                    <a:blip r:embed="rId29"/>
+                    <a:stretch>
+                      <a:fillRect/>
+                    </a:stretch>
+                  </pic:blipFill>
+                  <pic:spPr>
+                    <a:xfrm>
+                      <a:off x="0" y="0"/>
+                      <a:ext cx="5760720" cy="1952244"/>
+                    </a:xfrm>
+                    <a:prstGeom prst="rect"/>
+                  </pic:spPr>
+                </pic:pic>
+              </a:graphicData>
+            </a:graphic>
+          </wp:inline>
+        </w:drawing>
+      </w:r>
+    </w:p>
+    <w:p>
+      <w:pPr/>
+      <w:r>
+        <w:rPr>
+          <w:b w:val="0"/>
+        </w:rPr>
+        <w:t>Because of that, the agent got a --strict mode that applies the min_points count on the agent side and overrides a lenient judge. Under strict marking the loop behaves honestly: the judge keeps saying pass, strict keeps saying not yet, and the run ends by the guard instead of by flattery:</w:t>
+      </w:r>
+    </w:p>
+    <w:p>
+      <w:r>
+        <w:drawing>
+          <wp:inline xmlns:a="http://schemas.openxmlformats.org/drawingml/2006/main" xmlns:pic="http://schemas.openxmlformats.org/drawingml/2006/picture">
+            <wp:extent cx="5760720" cy="997048"/>
+            <wp:docPr id="1758724911" name="Picture 1758724911"/>
+            <wp:cNvGraphicFramePr>
+              <a:graphicFrameLocks noChangeAspect="1"/>
+            </wp:cNvGraphicFramePr>
+            <a:graphic>
+              <a:graphicData uri="http://schemas.openxmlformats.org/drawingml/2006/picture">
+                <pic:pic>
+                  <pic:nvPicPr>
+                    <pic:cNvPr id="0" name="p14_strict.png"/>
+                    <pic:cNvPicPr/>
+                  </pic:nvPicPr>
+                  <pic:blipFill>
+                    <a:blip r:embed="rId30"/>
+                    <a:stretch>
+                      <a:fillRect/>
+                    </a:stretch>
+                  </pic:blipFill>
+                  <pic:spPr>
+                    <a:xfrm>
+                      <a:off x="0" y="0"/>
+                      <a:ext cx="5760720" cy="997048"/>
+                    </a:xfrm>
+                    <a:prstGeom prst="rect"/>
+                  </pic:spPr>
+                </pic:pic>
+              </a:graphicData>
+            </a:graphic>
+          </wp:inline>
+        </w:drawing>
+      </w:r>
+    </w:p>
+    <w:p>
+      <w:pPr>
+        <w:keepNext/>
+        <w:keepLines/>
+      </w:pPr>
+      <w:r>
+        <w:rPr>
+          <w:b/>
+        </w:rPr>
+        <w:t>Result:</w:t>
+      </w:r>
+    </w:p>
+    <w:p>
+      <w:pPr/>
+      <w:r>
+        <w:rPr>
+          <w:b w:val="0"/>
+        </w:rPr>
+        <w:t>J_AI has a working student agent with a step cap, a nudge cap, a submission budget, unknown-tool refusal, and a final answer that is always the best graded attempt. Strict mode applies the min_points check agent-side. Nine run transcripts are saved under runs/agent_misc.</w:t>
+      </w:r>
+    </w:p>
+    <w:p>
+      <w:pPr>
+        <w:keepNext/>
+        <w:keepLines/>
+      </w:pPr>
+      <w:r>
+        <w:rPr>
+          <w:b/>
+        </w:rPr>
+        <w:t>Outcome:</w:t>
+      </w:r>
+    </w:p>
+    <w:p>
+      <w:pPr>
+        <w:keepLines/>
+      </w:pPr>
+      <w:r>
+        <w:rPr>
+          <w:b w:val="0"/>
+        </w:rPr>
+        <w:t>An agent is tested by trying to break it, and the transcripts indicted the judge more than the student: a verdict that ignores its own marking scheme cannot referee a revision loop. Choosing a better judge became the next session.</w:t>
+      </w:r>
+    </w:p>
+    <w:p>
+      <w:pPr/>
+      <w:r>
+        <w:rPr>
+          <w:b/>
+        </w:rPr>
+        <w:t>Phase 15 — Model Bake-off Round One: gpt-oss Takes the Chair</w:t>
+      </w:r>
+    </w:p>
+    <w:p>
+      <w:pPr/>
+      <w:r>
+        <w:rPr>
+          <w:b w:val="0"/>
+        </w:rPr>
+        <w:t>Asked which local model actually does tool calling well. Research said the Qwen 3.x line leads the open models, but pulling one was refused: they need a newer Ollama than the installed 0.17.0. So round one was fought between what this machine could run: qwen2.5:14b against gpt-oss:20b, a 13GB model with tools, thinking, and structured output that fits the RTX 5080.</w:t>
+      </w:r>
+    </w:p>
+    <w:p>
+      <w:pPr/>
+      <w:r>
+        <w:rPr>
+          <w:b w:val="0"/>
+        </w:rPr>
+        <w:t>The architecture was upgraded first so the contest would be fair. The provider factory now understands roles, JAI_JUDGE_MODEL and JAI_STUDENT_MODEL with matching THINK overrides, so the judge and the student can be different models. Verdicts are enforced through VERDICT_SCHEMA passed to Ollama's structured output format, with the old JSON rescue kept as a fallback. Tool messages carry the tool name, and thinking traces flow back into the agent history.</w:t>
+      </w:r>
+    </w:p>
+    <w:p>
+      <w:pPr/>
+      <w:r>
+        <w:rPr>
+          <w:b w:val="0"/>
+        </w:rPr>
+        <w:t>The bake-off itself: all 5 cases, strict marking, the same model playing both student and judge. It was not close. qwen2.5:14b passed nothing, burned 17 submissions and 9 nudges, and 16 of its 17 verdicts were inconsistent with the marking scheme it was shown. gpt-oss:20b passed all five, one submission each, zero nudges, zero inconsistent verdicts, in half the wall time:</w:t>
+      </w:r>
+    </w:p>
+    <w:p>
+      <w:r>
+        <w:drawing>
+          <wp:inline xmlns:a="http://schemas.openxmlformats.org/drawingml/2006/main" xmlns:pic="http://schemas.openxmlformats.org/drawingml/2006/picture">
+            <wp:extent cx="5760720" cy="804425"/>
+            <wp:docPr id="1758724912" name="Picture 1758724912"/>
+            <wp:cNvGraphicFramePr>
+              <a:graphicFrameLocks noChangeAspect="1"/>
+            </wp:cNvGraphicFramePr>
+            <a:graphic>
+              <a:graphicData uri="http://schemas.openxmlformats.org/drawingml/2006/picture">
+                <pic:pic>
+                  <pic:nvPicPr>
+                    <pic:cNvPr id="0" name="p15_tally.png"/>
+                    <pic:cNvPicPr/>
+                  </pic:nvPicPr>
+                  <pic:blipFill>
+                    <a:blip r:embed="rId31"/>
+                    <a:stretch>
+                      <a:fillRect/>
+                    </a:stretch>
+                  </pic:blipFill>
+                  <pic:spPr>
+                    <a:xfrm>
+                      <a:off x="0" y="0"/>
+                      <a:ext cx="5760720" cy="804425"/>
+                    </a:xfrm>
+                    <a:prstGeom prst="rect"/>
+                  </pic:spPr>
+                </pic:pic>
+              </a:graphicData>
+            </a:graphic>
+          </wp:inline>
+        </w:drawing>
+      </w:r>
+    </w:p>
+    <w:tbl>
+      <w:tblPr>
+        <w:tblW w:type="auto" w:w="0"/>
+        <w:tblLayout w:type="fixed"/>
+        <w:tblLook w:firstColumn="1" w:firstRow="1" w:lastColumn="0" w:lastRow="0" w:noHBand="0" w:noVBand="1" w:val="04A0"/>
+        <w:tblBorders>
+          <w:top w:val="single" w:sz="4" w:space="0" w:color="999999"/>
+          <w:left w:val="single" w:sz="4" w:space="0" w:color="999999"/>
+          <w:bottom w:val="single" w:sz="4" w:space="0" w:color="999999"/>
+          <w:right w:val="single" w:sz="4" w:space="0" w:color="999999"/>
+          <w:insideH w:val="single" w:sz="4" w:space="0" w:color="999999"/>
+          <w:insideV w:val="single" w:sz="4" w:space="0" w:color="999999"/>
+        </w:tblBorders>
+      </w:tblPr>
+      <w:tblGrid>
+        <w:gridCol w:w="3120"/>
+        <w:gridCol w:w="3120"/>
+        <w:gridCol w:w="3120"/>
+      </w:tblGrid>
+      <w:tr>
+        <w:tc>
+          <w:tcPr>
+            <w:tcW w:type="dxa" w:w="3888"/>
+          </w:tcPr>
+          <w:p>
+            <w:r>
+              <w:rPr>
+                <w:b/>
+              </w:rPr>
+              <w:t>Measure</w:t>
+            </w:r>
+          </w:p>
+        </w:tc>
+        <w:tc>
+          <w:tcPr>
+            <w:tcW w:type="dxa" w:w="2736"/>
+          </w:tcPr>
+          <w:p>
+            <w:r>
+              <w:rPr>
+                <w:b/>
+              </w:rPr>
+              <w:t>qwen2.5:14b</w:t>
+            </w:r>
+          </w:p>
+        </w:tc>
+        <w:tc>
+          <w:tcPr>
+            <w:tcW w:type="dxa" w:w="2736"/>
+          </w:tcPr>
+          <w:p>
+            <w:r>
+              <w:rPr>
+                <w:b/>
+              </w:rPr>
+              <w:t>gpt-oss:20b think=low</w:t>
+            </w:r>
+          </w:p>
+        </w:tc>
+      </w:tr>
+      <w:tr>
+        <w:tc>
+          <w:tcPr>
+            <w:tcW w:type="dxa" w:w="3888"/>
+          </w:tcPr>
+          <w:p>
+            <w:r>
+              <w:t>Cases passed (strict)</w:t>
+            </w:r>
+          </w:p>
+        </w:tc>
+        <w:tc>
+          <w:tcPr>
+            <w:tcW w:type="dxa" w:w="2736"/>
+          </w:tcPr>
+          <w:p>
+            <w:r>
+              <w:t>0 of 5</w:t>
+            </w:r>
+          </w:p>
+        </w:tc>
+        <w:tc>
+          <w:tcPr>
+            <w:tcW w:type="dxa" w:w="2736"/>
+          </w:tcPr>
+          <w:p>
+            <w:r>
+              <w:t>5 of 5</w:t>
+            </w:r>
+          </w:p>
+        </w:tc>
+      </w:tr>
+      <w:tr>
+        <w:tc>
+          <w:tcPr>
+            <w:tcW w:type="dxa" w:w="3888"/>
+          </w:tcPr>
+          <w:p>
+            <w:r>
+              <w:t>Submissions used</w:t>
+            </w:r>
+          </w:p>
+        </w:tc>
+        <w:tc>
+          <w:tcPr>
+            <w:tcW w:type="dxa" w:w="2736"/>
+          </w:tcPr>
+          <w:p>
+            <w:r>
+              <w:t>17</w:t>
+            </w:r>
+          </w:p>
+        </w:tc>
+        <w:tc>
+          <w:tcPr>
+            <w:tcW w:type="dxa" w:w="2736"/>
+          </w:tcPr>
+          <w:p>
+            <w:r>
+              <w:t>5</w:t>
+            </w:r>
+          </w:p>
+        </w:tc>
+      </w:tr>
+      <w:tr>
+        <w:tc>
+          <w:tcPr>
+            <w:tcW w:type="dxa" w:w="3888"/>
+          </w:tcPr>
+          <w:p>
+            <w:r>
+              <w:t>Nudges needed</w:t>
+            </w:r>
+          </w:p>
+        </w:tc>
+        <w:tc>
+          <w:tcPr>
+            <w:tcW w:type="dxa" w:w="2736"/>
+          </w:tcPr>
+          <w:p>
+            <w:r>
+              <w:t>9</w:t>
+            </w:r>
+          </w:p>
+        </w:tc>
+        <w:tc>
+          <w:tcPr>
+            <w:tcW w:type="dxa" w:w="2736"/>
+          </w:tcPr>
+          <w:p>
+            <w:r>
+              <w:t>0</w:t>
+            </w:r>
+          </w:p>
+        </w:tc>
+      </w:tr>
+      <w:tr>
+        <w:tc>
+          <w:tcPr>
+            <w:tcW w:type="dxa" w:w="3888"/>
+          </w:tcPr>
+          <w:p>
+            <w:r>
+              <w:t>Verdicts inconsistent with scheme</w:t>
+            </w:r>
+          </w:p>
+        </w:tc>
+        <w:tc>
+          <w:tcPr>
+            <w:tcW w:type="dxa" w:w="2736"/>
+          </w:tcPr>
+          <w:p>
+            <w:r>
+              <w:t>16 of 17</w:t>
+            </w:r>
+          </w:p>
+        </w:tc>
+        <w:tc>
+          <w:tcPr>
+            <w:tcW w:type="dxa" w:w="2736"/>
+          </w:tcPr>
+          <w:p>
+            <w:r>
+              <w:t>0</w:t>
+            </w:r>
+          </w:p>
+        </w:tc>
+      </w:tr>
+      <w:tr>
+        <w:tc>
+          <w:tcPr>
+            <w:tcW w:type="dxa" w:w="3888"/>
+          </w:tcPr>
+          <w:p>
+            <w:r>
+              <w:t>Wall time, all 5 cases</w:t>
+            </w:r>
+          </w:p>
+        </w:tc>
+        <w:tc>
+          <w:tcPr>
+            <w:tcW w:type="dxa" w:w="2736"/>
+          </w:tcPr>
+          <w:p>
+            <w:r>
+              <w:t>373 s</w:t>
+            </w:r>
+          </w:p>
+        </w:tc>
+        <w:tc>
+          <w:tcPr>
+            <w:tcW w:type="dxa" w:w="2736"/>
+          </w:tcPr>
+          <w:p>
+            <w:r>
+              <w:t>196 s</w:t>
+            </w:r>
+          </w:p>
+        </w:tc>
+      </w:tr>
+    </w:tbl>
+    <w:p>
+      <w:pPr/>
+      <w:r>
+        <w:rPr>
+          <w:b w:val="0"/>
+        </w:rPr>
+      </w:r>
+    </w:p>
+    <w:p>
+      <w:pPr/>
+      <w:r>
+        <w:rPr>
+          <w:b w:val="0"/>
+        </w:rPr>
+        <w:t>Before believing the row of tens, the winners were cross-graded: gpt-oss's verdicts followed the scheme on qwen's answers and gave one honest fail, and weak control answers scored 0 with every point listed missing. qwen graded the other direction by passing every gpt-oss answer while still listing a missing point each time, the same contradiction as Phase 14. One caveat went straight into the log: gpt-oss's scores run generous, many tens, so the verdicts are trustworthy but the scores need calibration.</w:t>
+      </w:r>
+    </w:p>
+    <w:p>
+      <w:pPr>
+        <w:keepNext/>
+        <w:keepLines/>
+      </w:pPr>
+      <w:r>
+        <w:rPr>
+          <w:b/>
+        </w:rPr>
+        <w:t>Result:</w:t>
+      </w:r>
+    </w:p>
+    <w:p>
+      <w:pPr/>
+      <w:r>
+        <w:rPr>
+          <w:b w:val="0"/>
+        </w:rPr>
+        <w:t>gpt-oss:20b with think=low became the default for both roles. Judge and student roles live in the provider factory, verdicts are schema-enforced through Ollama's structured output with the JSON rescue as fallback, and the README and USAGE carry the bake-off evidence and the roles section.</w:t>
+      </w:r>
+    </w:p>
+    <w:p>
+      <w:pPr>
+        <w:keepNext/>
+        <w:keepLines/>
+      </w:pPr>
+      <w:r>
+        <w:rPr>
+          <w:b/>
+        </w:rPr>
+        <w:t>Outcome:</w:t>
+      </w:r>
+    </w:p>
+    <w:p>
+      <w:pPr>
+        <w:keepLines/>
+      </w:pPr>
+      <w:r>
+        <w:rPr>
+          <w:b w:val="0"/>
+        </w:rPr>
+        <w:t>The contest decides, not the spec sheet. Measured on my own cases, the smaller model was unusable as a revision-loop judge while gpt-oss ran the whole ladder cleanly at half the time. The same bake-off format is now the entry exam for any new model.</w:t>
+      </w:r>
+    </w:p>
+    <w:p>
+      <w:pPr/>
+      <w:r>
+        <w:rPr>
+          <w:b/>
+        </w:rPr>
+        <w:t>Phase 16 — Ollama Upgrade and Bake-off Round Two: qwen3.8:27b</w:t>
+      </w:r>
+    </w:p>
+    <w:p>
+      <w:pPr/>
+      <w:r>
+        <w:rPr>
+          <w:b w:val="0"/>
+        </w:rPr>
+        <w:t>The round-one research left an open door: the Qwen 3.x models needed a newer Ollama, and system installs are mine to run. I ran the upgrade myself, 0.17.0 to 0.34.0 with sudo, and pulled qwen3.8:27b, a 17GB model with tools, thinking, and vision. Then the exact same bake-off, no favoritism: 5 cases, strict, both roles.</w:t>
+      </w:r>
+    </w:p>
+    <w:p>
+      <w:pPr/>
+      <w:r>
+        <w:rPr>
+          <w:b w:val="0"/>
+        </w:rPr>
+        <w:t>It passed 5 of 5 with zero nudges, but the number that mattered was a 3. On LOG_001 it was the only judge in three rounds that failed a genuinely decent first draft, and it said precisely why: no hierarchical layer model, no addressing plan, no redundancy. That is a marking scheme doing its job:</w:t>
+      </w:r>
+    </w:p>
+    <w:p>
+      <w:r>
+        <w:drawing>
+          <wp:inline xmlns:a="http://schemas.openxmlformats.org/drawingml/2006/main" xmlns:pic="http://schemas.openxmlformats.org/drawingml/2006/picture">
+            <wp:extent cx="5760720" cy="2175591"/>
+            <wp:docPr id="1758724913" name="Picture 1758724913"/>
+            <wp:cNvGraphicFramePr>
+              <a:graphicFrameLocks noChangeAspect="1"/>
+            </wp:cNvGraphicFramePr>
+            <a:graphic>
+              <a:graphicData uri="http://schemas.openxmlformats.org/drawingml/2006/picture">
+                <pic:pic>
+                  <pic:nvPicPr>
+                    <pic:cNvPr id="0" name="p16_firstfail.png"/>
+                    <pic:cNvPicPr/>
+                  </pic:nvPicPr>
+                  <pic:blipFill>
+                    <a:blip r:embed="rId32"/>
+                    <a:stretch>
+                      <a:fillRect/>
+                    </a:stretch>
+                  </pic:blipFill>
+                  <pic:spPr>
+                    <a:xfrm>
+                      <a:off x="0" y="0"/>
+                      <a:ext cx="5760720" cy="2175591"/>
+                    </a:xfrm>
+                    <a:prstGeom prst="rect"/>
+                  </pic:spPr>
+                </pic:pic>
+              </a:graphicData>
+            </a:graphic>
+          </wp:inline>
+        </w:drawing>
+      </w:r>
+    </w:p>
+    <w:p>
+      <w:pPr/>
+      <w:r>
+        <w:rPr>
+          <w:b w:val="0"/>
+        </w:rPr>
+        <w:t>The revision that followed built the three-tier model, a tabulated addressing plan, and LACP, VRRP/HSRP and RSTP redundancy, and the judge raised it to 8 while still catching a subtle inaccuracy in the revised text, with the quote to prove it:</w:t>
+      </w:r>
+    </w:p>
+    <w:p>
+      <w:r>
+        <w:drawing>
+          <wp:inline xmlns:a="http://schemas.openxmlformats.org/drawingml/2006/main" xmlns:pic="http://schemas.openxmlformats.org/drawingml/2006/picture">
+            <wp:extent cx="5760720" cy="1472184"/>
+            <wp:docPr id="1758724914" name="Picture 1758724914"/>
+            <wp:cNvGraphicFramePr>
+              <a:graphicFrameLocks noChangeAspect="1"/>
+            </wp:cNvGraphicFramePr>
+            <a:graphic>
+              <a:graphicData uri="http://schemas.openxmlformats.org/drawingml/2006/picture">
+                <pic:pic>
+                  <pic:nvPicPr>
+                    <pic:cNvPr id="0" name="p16_revision.png"/>
+                    <pic:cNvPicPr/>
+                  </pic:nvPicPr>
+                  <pic:blipFill>
+                    <a:blip r:embed="rId33"/>
+                    <a:stretch>
+                      <a:fillRect/>
+                    </a:stretch>
+                  </pic:blipFill>
+                  <pic:spPr>
+                    <a:xfrm>
+                      <a:off x="0" y="0"/>
+                      <a:ext cx="5760720" cy="1472184"/>
+                    </a:xfrm>
+                    <a:prstGeom prst="rect"/>
+                  </pic:spPr>
+                </pic:pic>
+              </a:graphicData>
+            </a:graphic>
+          </wp:inline>
+        </w:drawing>
+      </w:r>
+    </w:p>
+    <w:p>
+      <w:pPr/>
+      <w:r>
+        <w:rPr>
+          <w:b w:val="0"/>
+        </w:rPr>
+        <w:t>Cross-grading sealed it. Handed a gpt-oss answer that gpt-oss had scored 10, qwen3.8 found a counting error, a misused spine-leaf term, and a ports-versus-uplinks confusion, each backed by a quote from the answer. Weak control answers moved from 0 to 1, partial controls from 1 to 4, all fails, which is the score spread the generous judge could not produce. One real bug surfaced and was fixed on the spot: 3 of 17 verdicts came back as provider_error because thinking tokens ate the 1024-token structured budget before the JSON appeared, so JAI_STRUCTURED_MAX_TOKENS is now 4096 and the timeout guidance is 600 seconds.</w:t>
+      </w:r>
+    </w:p>
+    <w:p>
+      <w:pPr>
+        <w:keepNext/>
+        <w:keepLines/>
+      </w:pPr>
+      <w:r>
+        <w:rPr>
+          <w:b/>
+        </w:rPr>
+        <w:t>Result:</w:t>
+      </w:r>
+    </w:p>
+    <w:p>
+      <w:pPr/>
+      <w:r>
+        <w:rPr>
+          <w:b w:val="0"/>
+        </w:rPr>
+        <w:t>qwen3.8:27b with think=low is the default judge and student in .env, with gpt-oss:20b kept as the fast judge, about five times quicker. The structured output budget is 4096 tokens, the timeout 600 seconds, and the price is real: 17GB on a 16GB card means 50 to 140 seconds per grading, acceptable for quality runs, wrong for batches.</w:t>
+      </w:r>
+    </w:p>
+    <w:p>
+      <w:pPr>
+        <w:keepNext/>
+        <w:keepLines/>
+      </w:pPr>
+      <w:r>
+        <w:rPr>
+          <w:b/>
+        </w:rPr>
+        <w:t>Outcome:</w:t>
+      </w:r>
+    </w:p>
+    <w:p>
+      <w:pPr>
+        <w:keepLines/>
+      </w:pPr>
+      <w:r>
+        <w:rPr>
+          <w:b w:val="0"/>
+        </w:rPr>
+        <w:t>Round two only happened because round one recorded its method. Upgrade the infrastructure, rerun the identical exam, adopt the winner, keep the runner-up for speed: judge selection in J_AI is now a repeatable procedure instead of a preference.</w:t>
+      </w:r>
+    </w:p>
+    <w:p>
+      <w:pPr/>
+      <w:r>
+        <w:rPr>
+          <w:b/>
+        </w:rPr>
+        <w:t>Phase 17 — Grading Myself with the Adopted Judge</w:t>
+      </w:r>
+    </w:p>
+    <w:p>
+      <w:pPr/>
+      <w:r>
+        <w:rPr>
+          <w:b w:val="0"/>
+        </w:rPr>
+        <w:t>The setup proves itself on my own work. My three ITE402 answers from September 3 went through the real batch path, eval mode into the scoreboard into the report writer, graded by qwen3.8:27b. REQ_001 4/10, REQ_002 1/10, LOG_001 1/10, every verdict a fail, both blank cases stopped by the guard, zero provider errors, and the run file records exactly which judge graded it:</w:t>
+      </w:r>
+    </w:p>
+    <w:p>
+      <w:r>
+        <w:drawing>
+          <wp:inline xmlns:a="http://schemas.openxmlformats.org/drawingml/2006/main" xmlns:pic="http://schemas.openxmlformats.org/drawingml/2006/picture">
+            <wp:extent cx="5760720" cy="1836230"/>
+            <wp:docPr id="1758724915" name="Picture 1758724915"/>
+            <wp:cNvGraphicFramePr>
+              <a:graphicFrameLocks noChangeAspect="1"/>
+            </wp:cNvGraphicFramePr>
+            <a:graphic>
+              <a:graphicData uri="http://schemas.openxmlformats.org/drawingml/2006/picture">
+                <pic:pic>
+                  <pic:nvPicPr>
+                    <pic:cNvPr id="0" name="p17_scoreboard.png"/>
+                    <pic:cNvPicPr/>
+                  </pic:nvPicPr>
+                  <pic:blipFill>
+                    <a:blip r:embed="rId34"/>
+                    <a:stretch>
+                      <a:fillRect/>
+                    </a:stretch>
+                  </pic:blipFill>
+                  <pic:spPr>
+                    <a:xfrm>
+                      <a:off x="0" y="0"/>
+                      <a:ext cx="5760720" cy="1836230"/>
+                    </a:xfrm>
+                    <a:prstGeom prst="rect"/>
+                  </pic:spPr>
+                </pic:pic>
+              </a:graphicData>
+            </a:graphic>
+          </wp:inline>
+        </w:drawing>
+      </w:r>
+    </w:p>
+    <w:p>
+      <w:pPr/>
+      <w:r>
+        <w:rPr>
+          <w:b w:val="0"/>
+        </w:rPr>
+        <w:t>The verdicts agree with llama3 and qwen2.5 on the outcome but finally state the reasons with evidence. I described staff rosters instead of a network. I conflated a server with a switch, and the judge quoted me doing it: a server does not connect PCs to a network, switches and routers perform that role. I wrote portal where segmentation was needed. The recall gap from September 3 is unchanged, but it is now named precisely: answer the engineering framework, goals, constraints, segmentation, addressing, routing, redundancy, not the operation.</w:t>
+      </w:r>
+    </w:p>
+    <w:p>
+      <w:pPr/>
+      <w:r>
+        <w:rPr>
+          <w:b w:val="0"/>
+        </w:rPr>
+        <w:t>The session closed with the agent getting a proper test suite: tests/test_student_agent.py, ten tests driven by a scripted fake provider so no model is needed, covering the unknown-tool refusal, a provider_error inside the loop, an empty reply, the step cap, the nudge cap, the budget forcing a final answer, the strict override, and the check that the answer key never leaks to the student:</w:t>
+      </w:r>
+    </w:p>
+    <w:p>
+      <w:r>
+        <w:drawing>
+          <wp:inline xmlns:a="http://schemas.openxmlformats.org/drawingml/2006/main" xmlns:pic="http://schemas.openxmlformats.org/drawingml/2006/picture">
+            <wp:extent cx="5760720" cy="2880360"/>
+            <wp:docPr id="1758724916" name="Picture 1758724916"/>
+            <wp:cNvGraphicFramePr>
+              <a:graphicFrameLocks noChangeAspect="1"/>
+            </wp:cNvGraphicFramePr>
+            <a:graphic>
+              <a:graphicData uri="http://schemas.openxmlformats.org/drawingml/2006/picture">
+                <pic:pic>
+                  <pic:nvPicPr>
+                    <pic:cNvPr id="0" name="p17_tests.png"/>
+                    <pic:cNvPicPr/>
+                  </pic:nvPicPr>
+                  <pic:blipFill>
+                    <a:blip r:embed="rId35"/>
+                    <a:stretch>
+                      <a:fillRect/>
+                    </a:stretch>
+                  </pic:blipFill>
+                  <pic:spPr>
+                    <a:xfrm>
+                      <a:off x="0" y="0"/>
+                      <a:ext cx="5760720" cy="2880360"/>
+                    </a:xfrm>
+                    <a:prstGeom prst="rect"/>
+                  </pic:spPr>
+                </pic:pic>
+              </a:graphicData>
+            </a:graphic>
+          </wp:inline>
+        </w:drawing>
+      </w:r>
+    </w:p>
+    <w:p>
+      <w:pPr>
+        <w:keepNext/>
+        <w:keepLines/>
+      </w:pPr>
+      <w:r>
+        <w:rPr>
+          <w:b/>
+        </w:rPr>
+        <w:t>Result:</w:t>
+      </w:r>
+    </w:p>
+    <w:p>
+      <w:pPr/>
+      <w:r>
+        <w:rPr>
+          <w:b w:val="0"/>
+        </w:rPr>
+        <w:t>The adopted judge grades my real answers with quoted evidence through the full batch path, the report is filed with the repo, and the agent's guardrails are pinned by ten green unit tests that run in a millisecond without a model.</w:t>
+      </w:r>
+    </w:p>
+    <w:p>
+      <w:pPr>
+        <w:keepNext/>
+        <w:keepLines/>
+      </w:pPr>
+      <w:r>
+        <w:rPr>
+          <w:b/>
+        </w:rPr>
+        <w:t>Outcome:</w:t>
+      </w:r>
+    </w:p>
+    <w:p>
+      <w:pPr>
+        <w:keepLines/>
+      </w:pPr>
+      <w:r>
+        <w:rPr>
+          <w:b w:val="0"/>
+        </w:rPr>
+        <w:t>The judge is now better at naming my gap than I am at hiding it. The next honest measure is not another tool: re-answer REQ_002 and LOG_001 framework-first and regrade, and see whether the number moves.</w:t>
       </w:r>
     </w:p>
     <w:sectPr>

</xml_diff>

<commit_message>
v1.0 final tests and hardware comparison: pre-registered answer sets (15 of 15 predictions matched, Test A identical on two runs), prompt injection resisted, live agent run with the marking-scheme check firing, hardware comparison (GPU 1 s, mixed 82 s, CPU 365 s), Hugging Face DistilBERT GPU test. Evidence and screenshots in docs/final_tests, README and SPEC updated, Journal Phases 18 and 19
</commit_message>
<xml_diff>
--- a/docs/Project Journal - J_AI.docx
+++ b/docs/Project Journal - J_AI.docx
@@ -3681,6 +3681,265 @@
           <w:b w:val="0"/>
         </w:rPr>
         <w:t>The judge is now better at naming my gap than I am at hiding it. The next honest measure is not another tool: re-answer REQ_002 and LOG_001 framework-first and regrade, and see whether the number moves.</w:t>
+      </w:r>
+    </w:p>
+    <w:p>
+      <w:pPr/>
+      <w:r>
+        <w:rPr>
+          <w:b/>
+        </w:rPr>
+        <w:t xml:space="preserve">Phase 18 — v1.0 Hardening and Pre-registered Final Tests</w:t>
+      </w:r>
+    </w:p>
+    <w:p>
+      <w:pPr/>
+      <w:r>
+        <w:rPr>
+          <w:b w:val="0"/>
+        </w:rPr>
+        <w:t xml:space="preserve">Calling J_AI finished meant a stranger could clone it, install it, and run it, so I tested exactly that. A clean clone following my own install guide failed on its first command: the provider factory imported the optional OpenAI package at startup, so a tool that never touches OpenAI could not start without it. A lazy import and a requirements file fixed it, and a test now guards it. The same day I closed the decision that had been open since the student agent found it: the pass line is a rule, so it moved into the runner as code. A judge "pass" with more required points missing than the case's min_points allows becomes a fail, and the judge's own verdict is kept beside it in the run file. The unit tests grew from 10 to 22, all running without a model.</w:t>
+      </w:r>
+    </w:p>
+    <w:p>
+      <w:pPr/>
+      <w:r>
+        <w:rPr>
+          <w:b w:val="0"/>
+        </w:rPr>
+        <w:t xml:space="preserve">Then the final tests, designed so the result could not be tuned afterwards. I wrote two answer sets in my own answering style: Test A meant to pass three cases and fail two, Test B meant to fail all five. The answers and my predictions were hashed with sha256 at 09:54, before anything was graded, and every run checked the hashes first. Test A scored 9, 2, 8, 9, 2 on two separate runs, identical both times. Test B scored 3, 1, 1, 1, 1. Fifteen of fifteen predictions matched.</w:t>
+      </w:r>
+    </w:p>
+    <w:p>
+      <w:r>
+        <w:drawing>
+          <wp:inline xmlns:a="http://schemas.openxmlformats.org/drawingml/2006/main" xmlns:pic="http://schemas.openxmlformats.org/drawingml/2006/picture">
+            <wp:extent cx="5760720" cy="2902969"/>
+            <wp:docPr id="1758724917" name="Picture 1758724917"/>
+            <wp:cNvGraphicFramePr>
+              <a:graphicFrameLocks noChangeAspect="1"/>
+            </wp:cNvGraphicFramePr>
+            <a:graphic>
+              <a:graphicData uri="http://schemas.openxmlformats.org/drawingml/2006/picture">
+                <pic:pic>
+                  <pic:nvPicPr>
+                    <pic:cNvPr id="0" name="test_a_6_scoreboard.png"/>
+                    <pic:cNvPicPr/>
+                  </pic:nvPicPr>
+                  <pic:blipFill>
+                    <a:blip r:embed="rId36"/>
+                    <a:stretch>
+                      <a:fillRect/>
+                    </a:stretch>
+                  </pic:blipFill>
+                  <pic:spPr>
+                    <a:xfrm>
+                      <a:off x="0" y="0"/>
+                      <a:ext cx="5760720" cy="2902969"/>
+                    </a:xfrm>
+                    <a:prstGeom prst="rect"/>
+                  </pic:spPr>
+                </pic:pic>
+              </a:graphicData>
+            </a:graphic>
+          </wp:inline>
+        </w:drawing>
+      </w:r>
+    </w:p>
+    <w:p>
+      <w:r>
+        <w:drawing>
+          <wp:inline xmlns:a="http://schemas.openxmlformats.org/drawingml/2006/main" xmlns:pic="http://schemas.openxmlformats.org/drawingml/2006/picture">
+            <wp:extent cx="5760720" cy="3139320"/>
+            <wp:docPr id="1758724918" name="Picture 1758724918"/>
+            <wp:cNvGraphicFramePr>
+              <a:graphicFrameLocks noChangeAspect="1"/>
+            </wp:cNvGraphicFramePr>
+            <a:graphic>
+              <a:graphicData uri="http://schemas.openxmlformats.org/drawingml/2006/picture">
+                <pic:pic>
+                  <pic:nvPicPr>
+                    <pic:cNvPr id="0" name="test_b_6_scoreboard.png"/>
+                    <pic:cNvPicPr/>
+                  </pic:nvPicPr>
+                  <pic:blipFill>
+                    <a:blip r:embed="rId37"/>
+                    <a:stretch>
+                      <a:fillRect/>
+                    </a:stretch>
+                  </pic:blipFill>
+                  <pic:spPr>
+                    <a:xfrm>
+                      <a:off x="0" y="0"/>
+                      <a:ext cx="5760720" cy="3139320"/>
+                    </a:xfrm>
+                    <a:prstGeom prst="rect"/>
+                  </pic:spPr>
+                </pic:pic>
+              </a:graphicData>
+            </a:graphic>
+          </wp:inline>
+        </w:drawing>
+      </w:r>
+    </w:p>
+    <w:p>
+      <w:pPr/>
+      <w:r>
+        <w:rPr>
+          <w:b w:val="0"/>
+        </w:rPr>
+        <w:t xml:space="preserve">Two more checks closed it. An answer that told the examiner to ignore the marking scheme and return a 10 scored 0, and the judge listed the injection attempt itself as an error. And the live student agent finally showed the new check doing its job: on the first submission the judge said pass while listing redundancy as missing, the runner turned it into a fail, the agent added redundancy, and the second submission passed at 8.</w:t>
+      </w:r>
+    </w:p>
+    <w:p>
+      <w:pPr>
+        <w:keepNext/>
+        <w:keepLines/>
+      </w:pPr>
+      <w:r>
+        <w:rPr>
+          <w:b/>
+        </w:rPr>
+        <w:t xml:space="preserve">Result:</w:t>
+      </w:r>
+    </w:p>
+    <w:p>
+      <w:pPr/>
+      <w:r>
+        <w:rPr>
+          <w:b w:val="0"/>
+        </w:rPr>
+        <w:t xml:space="preserve">J_AI v1.0 is tagged and released: a clean install, a pass line held in code, 22 unit tests, and pre-registered final tests in which every prediction matched, including a resisted prompt injection and a live agent run that triggered the marking-scheme check.</w:t>
+      </w:r>
+    </w:p>
+    <w:p>
+      <w:pPr>
+        <w:keepNext/>
+        <w:keepLines/>
+      </w:pPr>
+      <w:r>
+        <w:rPr>
+          <w:b/>
+        </w:rPr>
+        <w:t xml:space="preserve">Outcome:</w:t>
+      </w:r>
+    </w:p>
+    <w:p>
+      <w:pPr>
+        <w:keepLines/>
+      </w:pPr>
+      <w:r>
+        <w:rPr>
+          <w:b w:val="0"/>
+        </w:rPr>
+        <w:t xml:space="preserve">A test you can adjust after seeing the result proves nothing. Writing the prediction down and hashing it before grading is what made these results worth showing.</w:t>
+      </w:r>
+    </w:p>
+    <w:p>
+      <w:pPr/>
+      <w:r>
+        <w:rPr>
+          <w:b/>
+        </w:rPr>
+        <w:t xml:space="preserve">Phase 19 — Hardware Comparison and GPU Capability</w:t>
+      </w:r>
+    </w:p>
+    <w:p>
+      <w:pPr/>
+      <w:r>
+        <w:rPr>
+          <w:b w:val="0"/>
+        </w:rPr>
+        <w:t xml:space="preserve">The adopted judge, qwen3.8:27b, is 17 GB and my RTX 5080 has 16 GB, so part of it always runs from system RAM. I measured what that costs with one case, LOG_001, and the same answer graded four ways. The harness changed nothing in J_AI: it only set Ollama's num_gpu option and read Ollama's own timing figures. Mixed, as it runs every day, qwen3.8 graded in 82 seconds at 15.1 tokens a second. Forced onto the CPU alone it took 365 seconds at 3.7 tokens a second, used 18.4 GB of the 23 GB WSL has, and pushed 3 GB into swap. gpt-oss:20b, which fits the card completely, graded in about one second at 165 tokens a second, and the same model on the CPU took 27 seconds at 8.5.</w:t>
+      </w:r>
+    </w:p>
+    <w:p>
+      <w:r>
+        <w:drawing>
+          <wp:inline xmlns:a="http://schemas.openxmlformats.org/drawingml/2006/main" xmlns:pic="http://schemas.openxmlformats.org/drawingml/2006/picture">
+            <wp:extent cx="5760720" cy="3051470"/>
+            <wp:docPr id="1758724919" name="Picture 1758724919"/>
+            <wp:cNvGraphicFramePr>
+              <a:graphicFrameLocks noChangeAspect="1"/>
+            </wp:cNvGraphicFramePr>
+            <a:graphic>
+              <a:graphicData uri="http://schemas.openxmlformats.org/drawingml/2006/picture">
+                <pic:pic>
+                  <pic:nvPicPr>
+                    <pic:cNvPr id="0" name="hardware_results.png"/>
+                    <pic:cNvPicPr/>
+                  </pic:nvPicPr>
+                  <pic:blipFill>
+                    <a:blip r:embed="rId38"/>
+                    <a:stretch>
+                      <a:fillRect/>
+                    </a:stretch>
+                  </pic:blipFill>
+                  <pic:spPr>
+                    <a:xfrm>
+                      <a:off x="0" y="0"/>
+                      <a:ext cx="5760720" cy="3051470"/>
+                    </a:xfrm>
+                    <a:prstGeom prst="rect"/>
+                  </pic:spPr>
+                </pic:pic>
+              </a:graphicData>
+            </a:graphic>
+          </wp:inline>
+        </w:drawing>
+      </w:r>
+    </w:p>
+    <w:p>
+      <w:pPr/>
+      <w:r>
+        <w:rPr>
+          <w:b w:val="0"/>
+        </w:rPr>
+        <w:t xml:space="preserve">The numbers say where the model sits matters more than its size. A model fully on the GPU is about 19 times faster than on the CPU, but a model that spills keeps only a fraction of that advantage, because every token still waits on the part in system RAM. The verdict held on all four setups, while the score moved by one point between the GPU and CPU runs of the same model. Alongside J_AI I also tested the card on a different kind of model: I fine-tuned DistilBERT on the IMDB movie reviews dataset, 25,000 reviews for three epochs, and published it on Hugging Face as Niophy/distilbert-imdb-sentiment. Test accuracy rose from 88.5% to 91.2%, while test loss rose after the first epoch, a sign of mild overfitting that the model card states.</w:t>
+      </w:r>
+    </w:p>
+    <w:p>
+      <w:pPr>
+        <w:keepNext/>
+        <w:keepLines/>
+      </w:pPr>
+      <w:r>
+        <w:rPr>
+          <w:b/>
+        </w:rPr>
+        <w:t xml:space="preserve">Result:</w:t>
+      </w:r>
+    </w:p>
+    <w:p>
+      <w:pPr/>
+      <w:r>
+        <w:rPr>
+          <w:b w:val="0"/>
+        </w:rPr>
+        <w:t xml:space="preserve">Measured on my machine: 1 second on the GPU, 82 seconds mixed, 365 seconds on the CPU, with the verdict unchanged. A separate GPU capability test produced a published DistilBERT sentiment model at 91.2% test accuracy.</w:t>
+      </w:r>
+    </w:p>
+    <w:p>
+      <w:pPr>
+        <w:keepNext/>
+        <w:keepLines/>
+      </w:pPr>
+      <w:r>
+        <w:rPr>
+          <w:b/>
+        </w:rPr>
+        <w:t xml:space="preserve">Outcome:</w:t>
+      </w:r>
+    </w:p>
+    <w:p>
+      <w:pPr>
+        <w:keepLines/>
+      </w:pPr>
+      <w:r>
+        <w:rPr>
+          <w:b w:val="0"/>
+        </w:rPr>
+        <w:t xml:space="preserve">Choosing a model is also choosing hardware. The quality judge costs 82 seconds a grading on this card, and that is now a measured trade-off rather than a feeling.</w:t>
       </w:r>
     </w:p>
     <w:sectPr>

</xml_diff>

<commit_message>
Name and attribution fixes: public name JADE (Jaber's Assessment and Decision Engine, working name J_AI); removed the mistaken ITE 402 course label from the case file, agent prompt and docs (the cases are original scenarios, not coursework); 'local-first' reworded as 'fully offline'; README gains an honest comparison with existing tools; evidence files kept as produced, with a note on their old labels
</commit_message>
<xml_diff>
--- a/docs/Project Journal - J_AI.docx
+++ b/docs/Project Journal - J_AI.docx
@@ -1010,7 +1010,7 @@
           <w:noProof/>
         </w:rPr>
         <w:drawing>
-          <wp:inline distT="0" distB="0" distL="0" distR="0" wp14:anchorId="15C4C12B" wp14:editId="43C50CFC">
+          <wp:inline distT="0" distB="0" distL="0" distR="0" wp14:anchorId="15C4C12B" wp14:editId="12FCB870">
             <wp:extent cx="5943600" cy="1160780"/>
             <wp:effectExtent l="0" t="0" r="0" b="1270"/>
             <wp:docPr id="70966354" name="Picture 2"/>
@@ -1063,7 +1063,7 @@
           <w:noProof/>
         </w:rPr>
         <w:drawing>
-          <wp:inline distT="0" distB="0" distL="0" distR="0" wp14:anchorId="16ECF96D" wp14:editId="2449F191">
+          <wp:inline distT="0" distB="0" distL="0" distR="0" wp14:anchorId="16ECF96D" wp14:editId="1B792E95">
             <wp:extent cx="5943600" cy="1266825"/>
             <wp:effectExtent l="0" t="0" r="0" b="9525"/>
             <wp:docPr id="165149698" name="Picture 3"/>
@@ -2856,55 +2856,224 @@
       </w:r>
     </w:p>
     <w:p>
-      <w:pPr/>
-      <w:r>
-        <w:rPr>
-          <w:b/>
-        </w:rPr>
+      <w:pPr>
+        <w:rPr>
+          <w:b/>
+        </w:rPr>
+      </w:pPr>
+      <w:r>
+        <w:rPr>
+          <w:b/>
+        </w:rPr>
+        <w:br w:type="page"/>
+      </w:r>
+    </w:p>
+    <w:p>
+      <w:r>
+        <w:rPr>
+          <w:b/>
+        </w:rPr>
+        <w:lastRenderedPageBreak/>
         <w:t>Phase 14 — The Student Agent: the Examiner Becomes a Tool</w:t>
       </w:r>
     </w:p>
     <w:p>
-      <w:pPr/>
-      <w:r>
-        <w:rPr>
-          <w:b w:val="0"/>
-        </w:rPr>
+      <w:r>
         <w:t>Built the first agent in J_AI. The OllamaProvider gained a chat method that speaks the chat endpoint with tool definitions, and jai/agent/student.py runs the loop on top of it: the model drafts an answer, calls the submit_answer tool, reads the verdict that comes back, revises, and repeats until it passes or spends its budget of 5 submissions. Guardrails from day one: a step cap so the loop always terminates, a nudge cap for a model that keeps talking instead of calling the tool, refusal of any unknown tool name, and the rule that only a graded submission counts as an attempt.</w:t>
       </w:r>
     </w:p>
     <w:p>
-      <w:pPr/>
-      <w:r>
-        <w:rPr>
-          <w:b w:val="0"/>
-        </w:rPr>
+      <w:r>
         <w:t>Then tried to break it, which is how an agent should be tested. The nudge guard earned its place immediately: in five of the eight counted runs the model tried to answer in plain text without ever calling the tool, and the guard pushed it back every time. A second find: after passing, the model liked to rewrite its answer inside the closing message, so the recorded final answer is now always the best graded attempt, never the unguarded epilogue. One run also derailed into a revision written entirely in Thai, which the strict marking failed on content grounds anyway.</w:t>
       </w:r>
     </w:p>
     <w:p>
-      <w:pPr/>
-      <w:r>
-        <w:rPr>
-          <w:b w:val="0"/>
-        </w:rPr>
+      <w:r>
         <w:t>The biggest finding was about the judge, not the student. On LOG_001 the qwen2.5:14b judge returned a pass verdict while its own verdict listed four of the five required points as missing, with min_points set at 5. The verdict field is simply not tied to the marking scheme the judge was handed:</w:t>
       </w:r>
     </w:p>
     <w:p>
       <w:r>
+        <w:rPr>
+          <w:noProof/>
+        </w:rPr>
         <w:drawing>
-          <wp:inline xmlns:a="http://schemas.openxmlformats.org/drawingml/2006/main" xmlns:pic="http://schemas.openxmlformats.org/drawingml/2006/picture">
+          <wp:inline distT="0" distB="0" distL="0" distR="0" wp14:anchorId="4657390D" wp14:editId="1B348084">
             <wp:extent cx="5760720" cy="1952244"/>
+            <wp:effectExtent l="0" t="0" r="0" b="0"/>
             <wp:docPr id="1758724910" name="Picture 1758724910"/>
             <wp:cNvGraphicFramePr>
-              <a:graphicFrameLocks noChangeAspect="1"/>
+              <a:graphicFrameLocks xmlns:a="http://schemas.openxmlformats.org/drawingml/2006/main" noChangeAspect="1"/>
             </wp:cNvGraphicFramePr>
-            <a:graphic>
+            <a:graphic xmlns:a="http://schemas.openxmlformats.org/drawingml/2006/main">
               <a:graphicData uri="http://schemas.openxmlformats.org/drawingml/2006/picture">
-                <pic:pic>
+                <pic:pic xmlns:pic="http://schemas.openxmlformats.org/drawingml/2006/picture">
                   <pic:nvPicPr>
                     <pic:cNvPr id="0" name="p14_contradiction.png"/>
+                    <pic:cNvPicPr/>
+                  </pic:nvPicPr>
+                  <pic:blipFill>
+                    <a:blip r:embed="rId27"/>
+                    <a:stretch>
+                      <a:fillRect/>
+                    </a:stretch>
+                  </pic:blipFill>
+                  <pic:spPr>
+                    <a:xfrm>
+                      <a:off x="0" y="0"/>
+                      <a:ext cx="5760720" cy="1952244"/>
+                    </a:xfrm>
+                    <a:prstGeom prst="rect">
+                      <a:avLst/>
+                    </a:prstGeom>
+                  </pic:spPr>
+                </pic:pic>
+              </a:graphicData>
+            </a:graphic>
+          </wp:inline>
+        </w:drawing>
+      </w:r>
+    </w:p>
+    <w:p>
+      <w:r>
+        <w:t>Because of that, the agent got a --strict mode that applies the min_points count on the agent side and overrides a lenient judge. Under strict marking the loop behaves honestly: the judge keeps saying pass, strict keeps saying not yet, and the run ends by the guard instead of by flattery:</w:t>
+      </w:r>
+    </w:p>
+    <w:p>
+      <w:r>
+        <w:rPr>
+          <w:noProof/>
+        </w:rPr>
+        <w:lastRenderedPageBreak/>
+        <w:drawing>
+          <wp:inline distT="0" distB="0" distL="0" distR="0" wp14:anchorId="483304CB" wp14:editId="684BCC77">
+            <wp:extent cx="5760720" cy="997048"/>
+            <wp:effectExtent l="0" t="0" r="0" b="0"/>
+            <wp:docPr id="1758724911" name="Picture 1758724911"/>
+            <wp:cNvGraphicFramePr>
+              <a:graphicFrameLocks xmlns:a="http://schemas.openxmlformats.org/drawingml/2006/main" noChangeAspect="1"/>
+            </wp:cNvGraphicFramePr>
+            <a:graphic xmlns:a="http://schemas.openxmlformats.org/drawingml/2006/main">
+              <a:graphicData uri="http://schemas.openxmlformats.org/drawingml/2006/picture">
+                <pic:pic xmlns:pic="http://schemas.openxmlformats.org/drawingml/2006/picture">
+                  <pic:nvPicPr>
+                    <pic:cNvPr id="0" name="p14_strict.png"/>
+                    <pic:cNvPicPr/>
+                  </pic:nvPicPr>
+                  <pic:blipFill>
+                    <a:blip r:embed="rId28"/>
+                    <a:stretch>
+                      <a:fillRect/>
+                    </a:stretch>
+                  </pic:blipFill>
+                  <pic:spPr>
+                    <a:xfrm>
+                      <a:off x="0" y="0"/>
+                      <a:ext cx="5760720" cy="997048"/>
+                    </a:xfrm>
+                    <a:prstGeom prst="rect">
+                      <a:avLst/>
+                    </a:prstGeom>
+                  </pic:spPr>
+                </pic:pic>
+              </a:graphicData>
+            </a:graphic>
+          </wp:inline>
+        </w:drawing>
+      </w:r>
+    </w:p>
+    <w:p>
+      <w:pPr>
+        <w:keepNext/>
+        <w:keepLines/>
+      </w:pPr>
+      <w:r>
+        <w:rPr>
+          <w:b/>
+        </w:rPr>
+        <w:t>Result:</w:t>
+      </w:r>
+    </w:p>
+    <w:p>
+      <w:r>
+        <w:t>J_AI has a working student agent with a step cap, a nudge cap, a submission budget, unknown-tool refusal, and a final answer that is always the best graded attempt. Strict mode applies the min_points check agent-side. Nine run transcripts are saved under runs/agent_misc.</w:t>
+      </w:r>
+    </w:p>
+    <w:p>
+      <w:pPr>
+        <w:keepNext/>
+        <w:keepLines/>
+      </w:pPr>
+      <w:r>
+        <w:rPr>
+          <w:b/>
+        </w:rPr>
+        <w:t>Outcome:</w:t>
+      </w:r>
+    </w:p>
+    <w:p>
+      <w:pPr>
+        <w:keepLines/>
+      </w:pPr>
+      <w:r>
+        <w:t>An agent is tested by trying to break it, and the transcripts indicted the judge more than the student: a verdict that ignores its own marking scheme cannot referee a revision loop. Choosing a better judge became the next session.</w:t>
+      </w:r>
+    </w:p>
+    <w:p>
+      <w:pPr>
+        <w:rPr>
+          <w:b/>
+        </w:rPr>
+      </w:pPr>
+      <w:r>
+        <w:rPr>
+          <w:b/>
+        </w:rPr>
+        <w:br w:type="page"/>
+      </w:r>
+    </w:p>
+    <w:p>
+      <w:r>
+        <w:rPr>
+          <w:b/>
+        </w:rPr>
+        <w:lastRenderedPageBreak/>
+        <w:t>Phase 15 — Model Bake-off Round One: gpt-oss Takes the Chair</w:t>
+      </w:r>
+    </w:p>
+    <w:p>
+      <w:r>
+        <w:t>Asked which local model actually does tool calling well. Research said the Qwen 3.x line leads the open models, but pulling one was refused: they need a newer Ollama than the installed 0.17.0. So round one was fought between what this machine could run: qwen2.5:14b against gpt-oss:20b, a 13GB model with tools, thinking, and structured output that fits the RTX 5080.</w:t>
+      </w:r>
+    </w:p>
+    <w:p>
+      <w:r>
+        <w:t>The architecture was upgraded first so the contest would be fair. The provider factory now understands roles, JAI_JUDGE_MODEL and JAI_STUDENT_MODEL with matching THINK overrides, so the judge and the student can be different models. Verdicts are enforced through VERDICT_SCHEMA passed to Ollama's structured output format, with the old JSON rescue kept as a fallback. Tool messages carry the tool name, and thinking traces flow back into the agent history.</w:t>
+      </w:r>
+    </w:p>
+    <w:p>
+      <w:r>
+        <w:t>The bake-off itself: all 5 cases, strict marking, the same model playing both student and judge. It was not close. qwen2.5:14b passed nothing, burned 17 submissions and 9 nudges, and 16 of its 17 verdicts were inconsistent with the marking scheme it was shown. gpt-oss:20b passed all five, one submission each, zero nudges, zero inconsistent verdicts, in half the wall time:</w:t>
+      </w:r>
+    </w:p>
+    <w:p>
+      <w:r>
+        <w:rPr>
+          <w:noProof/>
+        </w:rPr>
+        <w:drawing>
+          <wp:inline distT="0" distB="0" distL="0" distR="0" wp14:anchorId="3EEFE093" wp14:editId="13873E19">
+            <wp:extent cx="5760720" cy="804425"/>
+            <wp:effectExtent l="0" t="0" r="0" b="0"/>
+            <wp:docPr id="1758724912" name="Picture 1758724912"/>
+            <wp:cNvGraphicFramePr>
+              <a:graphicFrameLocks xmlns:a="http://schemas.openxmlformats.org/drawingml/2006/main" noChangeAspect="1"/>
+            </wp:cNvGraphicFramePr>
+            <a:graphic xmlns:a="http://schemas.openxmlformats.org/drawingml/2006/main">
+              <a:graphicData uri="http://schemas.openxmlformats.org/drawingml/2006/picture">
+                <pic:pic xmlns:pic="http://schemas.openxmlformats.org/drawingml/2006/picture">
+                  <pic:nvPicPr>
+                    <pic:cNvPr id="0" name="p15_tally.png"/>
                     <pic:cNvPicPr/>
                   </pic:nvPicPr>
                   <pic:blipFill>
@@ -2916,9 +3085,11 @@
                   <pic:spPr>
                     <a:xfrm>
                       <a:off x="0" y="0"/>
-                      <a:ext cx="5760720" cy="1952244"/>
+                      <a:ext cx="5760720" cy="804425"/>
                     </a:xfrm>
-                    <a:prstGeom prst="rect"/>
+                    <a:prstGeom prst="rect">
+                      <a:avLst/>
+                    </a:prstGeom>
                   </pic:spPr>
                 </pic:pic>
               </a:graphicData>
@@ -2927,29 +3098,338 @@
         </w:drawing>
       </w:r>
     </w:p>
-    <w:p>
-      <w:pPr/>
-      <w:r>
-        <w:rPr>
-          <w:b w:val="0"/>
-        </w:rPr>
-        <w:t>Because of that, the agent got a --strict mode that applies the min_points count on the agent side and overrides a lenient judge. Under strict marking the loop behaves honestly: the judge keeps saying pass, strict keeps saying not yet, and the run ends by the guard instead of by flattery:</w:t>
-      </w:r>
-    </w:p>
-    <w:p>
-      <w:r>
+    <w:tbl>
+      <w:tblPr>
+        <w:tblW w:w="0" w:type="auto"/>
+        <w:tblBorders>
+          <w:top w:val="single" w:sz="4" w:space="0" w:color="999999"/>
+          <w:left w:val="single" w:sz="4" w:space="0" w:color="999999"/>
+          <w:bottom w:val="single" w:sz="4" w:space="0" w:color="999999"/>
+          <w:right w:val="single" w:sz="4" w:space="0" w:color="999999"/>
+          <w:insideH w:val="single" w:sz="4" w:space="0" w:color="999999"/>
+          <w:insideV w:val="single" w:sz="4" w:space="0" w:color="999999"/>
+        </w:tblBorders>
+        <w:tblLayout w:type="fixed"/>
+        <w:tblLook w:val="04A0" w:firstRow="1" w:lastRow="0" w:firstColumn="1" w:lastColumn="0" w:noHBand="0" w:noVBand="1"/>
+      </w:tblPr>
+      <w:tblGrid>
+        <w:gridCol w:w="3888"/>
+        <w:gridCol w:w="2736"/>
+        <w:gridCol w:w="2736"/>
+      </w:tblGrid>
+      <w:tr>
+        <w:tc>
+          <w:tcPr>
+            <w:tcW w:w="3888" w:type="dxa"/>
+          </w:tcPr>
+          <w:p>
+            <w:r>
+              <w:rPr>
+                <w:b/>
+              </w:rPr>
+              <w:t>Measure</w:t>
+            </w:r>
+          </w:p>
+        </w:tc>
+        <w:tc>
+          <w:tcPr>
+            <w:tcW w:w="2736" w:type="dxa"/>
+          </w:tcPr>
+          <w:p>
+            <w:r>
+              <w:rPr>
+                <w:b/>
+              </w:rPr>
+              <w:t>qwen2.5:14b</w:t>
+            </w:r>
+          </w:p>
+        </w:tc>
+        <w:tc>
+          <w:tcPr>
+            <w:tcW w:w="2736" w:type="dxa"/>
+          </w:tcPr>
+          <w:p>
+            <w:r>
+              <w:rPr>
+                <w:b/>
+              </w:rPr>
+              <w:t>gpt-oss:20b think=low</w:t>
+            </w:r>
+          </w:p>
+        </w:tc>
+      </w:tr>
+      <w:tr>
+        <w:tc>
+          <w:tcPr>
+            <w:tcW w:w="3888" w:type="dxa"/>
+          </w:tcPr>
+          <w:p>
+            <w:r>
+              <w:t>Cases passed (strict)</w:t>
+            </w:r>
+          </w:p>
+        </w:tc>
+        <w:tc>
+          <w:tcPr>
+            <w:tcW w:w="2736" w:type="dxa"/>
+          </w:tcPr>
+          <w:p>
+            <w:r>
+              <w:t>0 of 5</w:t>
+            </w:r>
+          </w:p>
+        </w:tc>
+        <w:tc>
+          <w:tcPr>
+            <w:tcW w:w="2736" w:type="dxa"/>
+          </w:tcPr>
+          <w:p>
+            <w:r>
+              <w:t>5 of 5</w:t>
+            </w:r>
+          </w:p>
+        </w:tc>
+      </w:tr>
+      <w:tr>
+        <w:tc>
+          <w:tcPr>
+            <w:tcW w:w="3888" w:type="dxa"/>
+          </w:tcPr>
+          <w:p>
+            <w:r>
+              <w:t>Submissions used</w:t>
+            </w:r>
+          </w:p>
+        </w:tc>
+        <w:tc>
+          <w:tcPr>
+            <w:tcW w:w="2736" w:type="dxa"/>
+          </w:tcPr>
+          <w:p>
+            <w:r>
+              <w:t>17</w:t>
+            </w:r>
+          </w:p>
+        </w:tc>
+        <w:tc>
+          <w:tcPr>
+            <w:tcW w:w="2736" w:type="dxa"/>
+          </w:tcPr>
+          <w:p>
+            <w:r>
+              <w:t>5</w:t>
+            </w:r>
+          </w:p>
+        </w:tc>
+      </w:tr>
+      <w:tr>
+        <w:tc>
+          <w:tcPr>
+            <w:tcW w:w="3888" w:type="dxa"/>
+          </w:tcPr>
+          <w:p>
+            <w:r>
+              <w:t>Nudges needed</w:t>
+            </w:r>
+          </w:p>
+        </w:tc>
+        <w:tc>
+          <w:tcPr>
+            <w:tcW w:w="2736" w:type="dxa"/>
+          </w:tcPr>
+          <w:p>
+            <w:r>
+              <w:t>9</w:t>
+            </w:r>
+          </w:p>
+        </w:tc>
+        <w:tc>
+          <w:tcPr>
+            <w:tcW w:w="2736" w:type="dxa"/>
+          </w:tcPr>
+          <w:p>
+            <w:r>
+              <w:t>0</w:t>
+            </w:r>
+          </w:p>
+        </w:tc>
+      </w:tr>
+      <w:tr>
+        <w:tc>
+          <w:tcPr>
+            <w:tcW w:w="3888" w:type="dxa"/>
+          </w:tcPr>
+          <w:p>
+            <w:r>
+              <w:t>Verdicts inconsistent with scheme</w:t>
+            </w:r>
+          </w:p>
+        </w:tc>
+        <w:tc>
+          <w:tcPr>
+            <w:tcW w:w="2736" w:type="dxa"/>
+          </w:tcPr>
+          <w:p>
+            <w:r>
+              <w:t>16 of 17</w:t>
+            </w:r>
+          </w:p>
+        </w:tc>
+        <w:tc>
+          <w:tcPr>
+            <w:tcW w:w="2736" w:type="dxa"/>
+          </w:tcPr>
+          <w:p>
+            <w:r>
+              <w:t>0</w:t>
+            </w:r>
+          </w:p>
+        </w:tc>
+      </w:tr>
+      <w:tr>
+        <w:tc>
+          <w:tcPr>
+            <w:tcW w:w="3888" w:type="dxa"/>
+          </w:tcPr>
+          <w:p>
+            <w:r>
+              <w:t>Wall time, all 5 cases</w:t>
+            </w:r>
+          </w:p>
+        </w:tc>
+        <w:tc>
+          <w:tcPr>
+            <w:tcW w:w="2736" w:type="dxa"/>
+          </w:tcPr>
+          <w:p>
+            <w:r>
+              <w:t>373 s</w:t>
+            </w:r>
+          </w:p>
+        </w:tc>
+        <w:tc>
+          <w:tcPr>
+            <w:tcW w:w="2736" w:type="dxa"/>
+          </w:tcPr>
+          <w:p>
+            <w:r>
+              <w:t>196 s</w:t>
+            </w:r>
+          </w:p>
+        </w:tc>
+      </w:tr>
+    </w:tbl>
+    <w:p/>
+    <w:p>
+      <w:r>
+        <w:t xml:space="preserve">Before believing the row of tens, the winners were cross-graded: gpt-oss's verdicts followed the scheme on qwen's answers and gave one honest fail, and weak control answers scored 0 with every point listed missing. qwen graded the other direction by passing every gpt-oss answer while still listing a missing point each time, the same contradiction as Phase 14. </w:t>
+      </w:r>
+      <w:r>
+        <w:lastRenderedPageBreak/>
+        <w:t>One caveat went straight into the log: gpt-oss's scores run generous, many tens, so the verdicts are trustworthy but the scores need calibration.</w:t>
+      </w:r>
+    </w:p>
+    <w:p>
+      <w:pPr>
+        <w:keepNext/>
+        <w:keepLines/>
+      </w:pPr>
+      <w:r>
+        <w:rPr>
+          <w:b/>
+        </w:rPr>
+        <w:t>Result:</w:t>
+      </w:r>
+    </w:p>
+    <w:p>
+      <w:r>
+        <w:t>gpt-oss:20b with think=low became the default for both roles. Judge and student roles live in the provider factory, verdicts are schema-enforced through Ollama's structured output with the JSON rescue as fallback, and the README and USAGE carry the bake-off evidence and the roles section.</w:t>
+      </w:r>
+    </w:p>
+    <w:p>
+      <w:pPr>
+        <w:keepNext/>
+        <w:keepLines/>
+      </w:pPr>
+      <w:r>
+        <w:rPr>
+          <w:b/>
+        </w:rPr>
+        <w:t>Outcome:</w:t>
+      </w:r>
+    </w:p>
+    <w:p>
+      <w:pPr>
+        <w:keepLines/>
+      </w:pPr>
+      <w:r>
+        <w:t>The contest decides, not the spec sheet. Measured on my own cases, the smaller model was unusable as a revision-loop judge while gpt-oss ran the whole ladder cleanly at half the time. The same bake-off format is now the entry exam for any new model.</w:t>
+      </w:r>
+    </w:p>
+    <w:p>
+      <w:pPr>
+        <w:rPr>
+          <w:b/>
+        </w:rPr>
+      </w:pPr>
+      <w:r>
+        <w:rPr>
+          <w:b/>
+        </w:rPr>
+        <w:br w:type="page"/>
+      </w:r>
+    </w:p>
+    <w:p>
+      <w:r>
+        <w:rPr>
+          <w:b/>
+        </w:rPr>
+        <w:lastRenderedPageBreak/>
+        <w:t xml:space="preserve">Phase 16 — </w:t>
+      </w:r>
+      <w:proofErr w:type="spellStart"/>
+      <w:r>
+        <w:rPr>
+          <w:b/>
+        </w:rPr>
+        <w:t>Ollama</w:t>
+      </w:r>
+      <w:proofErr w:type="spellEnd"/>
+      <w:r>
+        <w:rPr>
+          <w:b/>
+        </w:rPr>
+        <w:t xml:space="preserve"> Upgrade and Bake-off Round Two: qwen3.8:27b</w:t>
+      </w:r>
+    </w:p>
+    <w:p>
+      <w:r>
+        <w:t>The round-one research left an open door: the Qwen 3.x models needed a newer Ollama, and system installs are mine to run. I ran the upgrade myself, 0.17.0 to 0.34.0 with sudo, and pulled qwen3.8:27b, a 17GB model with tools, thinking, and vision. Then the exact same bake-off, no favoritism: 5 cases, strict, both roles.</w:t>
+      </w:r>
+    </w:p>
+    <w:p>
+      <w:r>
+        <w:t>It passed 5 of 5 with zero nudges, but the number that mattered was a 3. On LOG_001 it was the only judge in three rounds that failed a genuinely decent first draft, and it said precisely why: no hierarchical layer model, no addressing plan, no redundancy. That is a marking scheme doing its job:</w:t>
+      </w:r>
+    </w:p>
+    <w:p>
+      <w:r>
+        <w:rPr>
+          <w:noProof/>
+        </w:rPr>
         <w:drawing>
-          <wp:inline xmlns:a="http://schemas.openxmlformats.org/drawingml/2006/main" xmlns:pic="http://schemas.openxmlformats.org/drawingml/2006/picture">
-            <wp:extent cx="5760720" cy="997048"/>
-            <wp:docPr id="1758724911" name="Picture 1758724911"/>
+          <wp:inline distT="0" distB="0" distL="0" distR="0" wp14:anchorId="4665FEA0" wp14:editId="51E62D25">
+            <wp:extent cx="5760720" cy="2175591"/>
+            <wp:effectExtent l="0" t="0" r="0" b="0"/>
+            <wp:docPr id="1758724913" name="Picture 1758724913"/>
             <wp:cNvGraphicFramePr>
-              <a:graphicFrameLocks noChangeAspect="1"/>
+              <a:graphicFrameLocks xmlns:a="http://schemas.openxmlformats.org/drawingml/2006/main" noChangeAspect="1"/>
             </wp:cNvGraphicFramePr>
-            <a:graphic>
+            <a:graphic xmlns:a="http://schemas.openxmlformats.org/drawingml/2006/main">
               <a:graphicData uri="http://schemas.openxmlformats.org/drawingml/2006/picture">
-                <pic:pic>
+                <pic:pic xmlns:pic="http://schemas.openxmlformats.org/drawingml/2006/picture">
                   <pic:nvPicPr>
-                    <pic:cNvPr id="0" name="p14_strict.png"/>
+                    <pic:cNvPr id="0" name="p16_firstfail.png"/>
                     <pic:cNvPicPr/>
                   </pic:nvPicPr>
                   <pic:blipFill>
@@ -2961,9 +3441,11 @@
                   <pic:spPr>
                     <a:xfrm>
                       <a:off x="0" y="0"/>
-                      <a:ext cx="5760720" cy="997048"/>
+                      <a:ext cx="5760720" cy="2175591"/>
                     </a:xfrm>
-                    <a:prstGeom prst="rect"/>
+                    <a:prstGeom prst="rect">
+                      <a:avLst/>
+                    </a:prstGeom>
                   </pic:spPr>
                 </pic:pic>
               </a:graphicData>
@@ -2973,99 +3455,28 @@
       </w:r>
     </w:p>
     <w:p>
-      <w:pPr>
-        <w:keepNext/>
-        <w:keepLines/>
-      </w:pPr>
-      <w:r>
-        <w:rPr>
-          <w:b/>
-        </w:rPr>
-        <w:t>Result:</w:t>
-      </w:r>
-    </w:p>
-    <w:p>
-      <w:pPr/>
-      <w:r>
-        <w:rPr>
-          <w:b w:val="0"/>
-        </w:rPr>
-        <w:t>J_AI has a working student agent with a step cap, a nudge cap, a submission budget, unknown-tool refusal, and a final answer that is always the best graded attempt. Strict mode applies the min_points check agent-side. Nine run transcripts are saved under runs/agent_misc.</w:t>
-      </w:r>
-    </w:p>
-    <w:p>
-      <w:pPr>
-        <w:keepNext/>
-        <w:keepLines/>
-      </w:pPr>
-      <w:r>
-        <w:rPr>
-          <w:b/>
-        </w:rPr>
-        <w:t>Outcome:</w:t>
-      </w:r>
-    </w:p>
-    <w:p>
-      <w:pPr>
-        <w:keepLines/>
-      </w:pPr>
-      <w:r>
-        <w:rPr>
-          <w:b w:val="0"/>
-        </w:rPr>
-        <w:t>An agent is tested by trying to break it, and the transcripts indicted the judge more than the student: a verdict that ignores its own marking scheme cannot referee a revision loop. Choosing a better judge became the next session.</w:t>
-      </w:r>
-    </w:p>
-    <w:p>
-      <w:pPr/>
-      <w:r>
-        <w:rPr>
-          <w:b/>
-        </w:rPr>
-        <w:t>Phase 15 — Model Bake-off Round One: gpt-oss Takes the Chair</w:t>
-      </w:r>
-    </w:p>
-    <w:p>
-      <w:pPr/>
-      <w:r>
-        <w:rPr>
-          <w:b w:val="0"/>
-        </w:rPr>
-        <w:t>Asked which local model actually does tool calling well. Research said the Qwen 3.x line leads the open models, but pulling one was refused: they need a newer Ollama than the installed 0.17.0. So round one was fought between what this machine could run: qwen2.5:14b against gpt-oss:20b, a 13GB model with tools, thinking, and structured output that fits the RTX 5080.</w:t>
-      </w:r>
-    </w:p>
-    <w:p>
-      <w:pPr/>
-      <w:r>
-        <w:rPr>
-          <w:b w:val="0"/>
-        </w:rPr>
-        <w:t>The architecture was upgraded first so the contest would be fair. The provider factory now understands roles, JAI_JUDGE_MODEL and JAI_STUDENT_MODEL with matching THINK overrides, so the judge and the student can be different models. Verdicts are enforced through VERDICT_SCHEMA passed to Ollama's structured output format, with the old JSON rescue kept as a fallback. Tool messages carry the tool name, and thinking traces flow back into the agent history.</w:t>
-      </w:r>
-    </w:p>
-    <w:p>
-      <w:pPr/>
-      <w:r>
-        <w:rPr>
-          <w:b w:val="0"/>
-        </w:rPr>
-        <w:t>The bake-off itself: all 5 cases, strict marking, the same model playing both student and judge. It was not close. qwen2.5:14b passed nothing, burned 17 submissions and 9 nudges, and 16 of its 17 verdicts were inconsistent with the marking scheme it was shown. gpt-oss:20b passed all five, one submission each, zero nudges, zero inconsistent verdicts, in half the wall time:</w:t>
-      </w:r>
-    </w:p>
-    <w:p>
-      <w:r>
+      <w:r>
+        <w:t>The revision that followed built the three-tier model, a tabulated addressing plan, and LACP, VRRP/HSRP and RSTP redundancy, and the judge raised it to 8 while still catching a subtle inaccuracy in the revised text, with the quote to prove it:</w:t>
+      </w:r>
+    </w:p>
+    <w:p>
+      <w:r>
+        <w:rPr>
+          <w:noProof/>
+        </w:rPr>
         <w:drawing>
-          <wp:inline xmlns:a="http://schemas.openxmlformats.org/drawingml/2006/main" xmlns:pic="http://schemas.openxmlformats.org/drawingml/2006/picture">
-            <wp:extent cx="5760720" cy="804425"/>
-            <wp:docPr id="1758724912" name="Picture 1758724912"/>
+          <wp:inline distT="0" distB="0" distL="0" distR="0" wp14:anchorId="065EC94C" wp14:editId="7D5D2ED0">
+            <wp:extent cx="5760720" cy="1472184"/>
+            <wp:effectExtent l="0" t="0" r="0" b="0"/>
+            <wp:docPr id="1758724914" name="Picture 1758724914"/>
             <wp:cNvGraphicFramePr>
-              <a:graphicFrameLocks noChangeAspect="1"/>
+              <a:graphicFrameLocks xmlns:a="http://schemas.openxmlformats.org/drawingml/2006/main" noChangeAspect="1"/>
             </wp:cNvGraphicFramePr>
-            <a:graphic>
+            <a:graphic xmlns:a="http://schemas.openxmlformats.org/drawingml/2006/main">
               <a:graphicData uri="http://schemas.openxmlformats.org/drawingml/2006/picture">
-                <pic:pic>
+                <pic:pic xmlns:pic="http://schemas.openxmlformats.org/drawingml/2006/picture">
                   <pic:nvPicPr>
-                    <pic:cNvPr id="0" name="p15_tally.png"/>
+                    <pic:cNvPr id="0" name="p16_revision.png"/>
                     <pic:cNvPicPr/>
                   </pic:nvPicPr>
                   <pic:blipFill>
@@ -3077,9 +3488,11 @@
                   <pic:spPr>
                     <a:xfrm>
                       <a:off x="0" y="0"/>
-                      <a:ext cx="5760720" cy="804425"/>
+                      <a:ext cx="5760720" cy="1472184"/>
                     </a:xfrm>
-                    <a:prstGeom prst="rect"/>
+                    <a:prstGeom prst="rect">
+                      <a:avLst/>
+                    </a:prstGeom>
                   </pic:spPr>
                 </pic:pic>
               </a:graphicData>
@@ -3088,242 +3501,13 @@
         </w:drawing>
       </w:r>
     </w:p>
-    <w:tbl>
-      <w:tblPr>
-        <w:tblW w:type="auto" w:w="0"/>
-        <w:tblLayout w:type="fixed"/>
-        <w:tblLook w:firstColumn="1" w:firstRow="1" w:lastColumn="0" w:lastRow="0" w:noHBand="0" w:noVBand="1" w:val="04A0"/>
-        <w:tblBorders>
-          <w:top w:val="single" w:sz="4" w:space="0" w:color="999999"/>
-          <w:left w:val="single" w:sz="4" w:space="0" w:color="999999"/>
-          <w:bottom w:val="single" w:sz="4" w:space="0" w:color="999999"/>
-          <w:right w:val="single" w:sz="4" w:space="0" w:color="999999"/>
-          <w:insideH w:val="single" w:sz="4" w:space="0" w:color="999999"/>
-          <w:insideV w:val="single" w:sz="4" w:space="0" w:color="999999"/>
-        </w:tblBorders>
-      </w:tblPr>
-      <w:tblGrid>
-        <w:gridCol w:w="3120"/>
-        <w:gridCol w:w="3120"/>
-        <w:gridCol w:w="3120"/>
-      </w:tblGrid>
-      <w:tr>
-        <w:tc>
-          <w:tcPr>
-            <w:tcW w:type="dxa" w:w="3888"/>
-          </w:tcPr>
-          <w:p>
-            <w:r>
-              <w:rPr>
-                <w:b/>
-              </w:rPr>
-              <w:t>Measure</w:t>
-            </w:r>
-          </w:p>
-        </w:tc>
-        <w:tc>
-          <w:tcPr>
-            <w:tcW w:type="dxa" w:w="2736"/>
-          </w:tcPr>
-          <w:p>
-            <w:r>
-              <w:rPr>
-                <w:b/>
-              </w:rPr>
-              <w:t>qwen2.5:14b</w:t>
-            </w:r>
-          </w:p>
-        </w:tc>
-        <w:tc>
-          <w:tcPr>
-            <w:tcW w:type="dxa" w:w="2736"/>
-          </w:tcPr>
-          <w:p>
-            <w:r>
-              <w:rPr>
-                <w:b/>
-              </w:rPr>
-              <w:t>gpt-oss:20b think=low</w:t>
-            </w:r>
-          </w:p>
-        </w:tc>
-      </w:tr>
-      <w:tr>
-        <w:tc>
-          <w:tcPr>
-            <w:tcW w:type="dxa" w:w="3888"/>
-          </w:tcPr>
-          <w:p>
-            <w:r>
-              <w:t>Cases passed (strict)</w:t>
-            </w:r>
-          </w:p>
-        </w:tc>
-        <w:tc>
-          <w:tcPr>
-            <w:tcW w:type="dxa" w:w="2736"/>
-          </w:tcPr>
-          <w:p>
-            <w:r>
-              <w:t>0 of 5</w:t>
-            </w:r>
-          </w:p>
-        </w:tc>
-        <w:tc>
-          <w:tcPr>
-            <w:tcW w:type="dxa" w:w="2736"/>
-          </w:tcPr>
-          <w:p>
-            <w:r>
-              <w:t>5 of 5</w:t>
-            </w:r>
-          </w:p>
-        </w:tc>
-      </w:tr>
-      <w:tr>
-        <w:tc>
-          <w:tcPr>
-            <w:tcW w:type="dxa" w:w="3888"/>
-          </w:tcPr>
-          <w:p>
-            <w:r>
-              <w:t>Submissions used</w:t>
-            </w:r>
-          </w:p>
-        </w:tc>
-        <w:tc>
-          <w:tcPr>
-            <w:tcW w:type="dxa" w:w="2736"/>
-          </w:tcPr>
-          <w:p>
-            <w:r>
-              <w:t>17</w:t>
-            </w:r>
-          </w:p>
-        </w:tc>
-        <w:tc>
-          <w:tcPr>
-            <w:tcW w:type="dxa" w:w="2736"/>
-          </w:tcPr>
-          <w:p>
-            <w:r>
-              <w:t>5</w:t>
-            </w:r>
-          </w:p>
-        </w:tc>
-      </w:tr>
-      <w:tr>
-        <w:tc>
-          <w:tcPr>
-            <w:tcW w:type="dxa" w:w="3888"/>
-          </w:tcPr>
-          <w:p>
-            <w:r>
-              <w:t>Nudges needed</w:t>
-            </w:r>
-          </w:p>
-        </w:tc>
-        <w:tc>
-          <w:tcPr>
-            <w:tcW w:type="dxa" w:w="2736"/>
-          </w:tcPr>
-          <w:p>
-            <w:r>
-              <w:t>9</w:t>
-            </w:r>
-          </w:p>
-        </w:tc>
-        <w:tc>
-          <w:tcPr>
-            <w:tcW w:type="dxa" w:w="2736"/>
-          </w:tcPr>
-          <w:p>
-            <w:r>
-              <w:t>0</w:t>
-            </w:r>
-          </w:p>
-        </w:tc>
-      </w:tr>
-      <w:tr>
-        <w:tc>
-          <w:tcPr>
-            <w:tcW w:type="dxa" w:w="3888"/>
-          </w:tcPr>
-          <w:p>
-            <w:r>
-              <w:t>Verdicts inconsistent with scheme</w:t>
-            </w:r>
-          </w:p>
-        </w:tc>
-        <w:tc>
-          <w:tcPr>
-            <w:tcW w:type="dxa" w:w="2736"/>
-          </w:tcPr>
-          <w:p>
-            <w:r>
-              <w:t>16 of 17</w:t>
-            </w:r>
-          </w:p>
-        </w:tc>
-        <w:tc>
-          <w:tcPr>
-            <w:tcW w:type="dxa" w:w="2736"/>
-          </w:tcPr>
-          <w:p>
-            <w:r>
-              <w:t>0</w:t>
-            </w:r>
-          </w:p>
-        </w:tc>
-      </w:tr>
-      <w:tr>
-        <w:tc>
-          <w:tcPr>
-            <w:tcW w:type="dxa" w:w="3888"/>
-          </w:tcPr>
-          <w:p>
-            <w:r>
-              <w:t>Wall time, all 5 cases</w:t>
-            </w:r>
-          </w:p>
-        </w:tc>
-        <w:tc>
-          <w:tcPr>
-            <w:tcW w:type="dxa" w:w="2736"/>
-          </w:tcPr>
-          <w:p>
-            <w:r>
-              <w:t>373 s</w:t>
-            </w:r>
-          </w:p>
-        </w:tc>
-        <w:tc>
-          <w:tcPr>
-            <w:tcW w:type="dxa" w:w="2736"/>
-          </w:tcPr>
-          <w:p>
-            <w:r>
-              <w:t>196 s</w:t>
-            </w:r>
-          </w:p>
-        </w:tc>
-      </w:tr>
-    </w:tbl>
-    <w:p>
-      <w:pPr/>
-      <w:r>
-        <w:rPr>
-          <w:b w:val="0"/>
-        </w:rPr>
-      </w:r>
-    </w:p>
-    <w:p>
-      <w:pPr/>
-      <w:r>
-        <w:rPr>
-          <w:b w:val="0"/>
-        </w:rPr>
-        <w:t>Before believing the row of tens, the winners were cross-graded: gpt-oss's verdicts followed the scheme on qwen's answers and gave one honest fail, and weak control answers scored 0 with every point listed missing. qwen graded the other direction by passing every gpt-oss answer while still listing a missing point each time, the same contradiction as Phase 14. One caveat went straight into the log: gpt-oss's scores run generous, many tens, so the verdicts are trustworthy but the scores need calibration.</w:t>
+    <w:p>
+      <w:r>
+        <w:t xml:space="preserve">Cross-grading sealed it. Handed a gpt-oss answer that gpt-oss had scored 10, qwen3.8 found a counting error, a misused spine-leaf term, and a ports-versus-uplinks confusion, each backed by a quote from the answer. Weak control answers moved from 0 to 1, partial controls from 1 to 4, all fails, which is the score spread the generous judge could not produce. One real bug surfaced and was fixed on the spot: 3 of 17 verdicts came back as provider_error because thinking tokens ate the 1024-token structured budget before the </w:t>
+      </w:r>
+      <w:r>
+        <w:lastRenderedPageBreak/>
+        <w:t>JSON appeared, so JAI_STRUCTURED_MAX_TOKENS is now 4096 and the timeout guidance is 600 seconds.</w:t>
       </w:r>
     </w:p>
     <w:p>
@@ -3339,12 +3523,8 @@
       </w:r>
     </w:p>
     <w:p>
-      <w:pPr/>
-      <w:r>
-        <w:rPr>
-          <w:b w:val="0"/>
-        </w:rPr>
-        <w:t>gpt-oss:20b with think=low became the default for both roles. Judge and student roles live in the provider factory, verdicts are schema-enforced through Ollama's structured output with the JSON rescue as fallback, and the README and USAGE carry the bake-off evidence and the roles section.</w:t>
+      <w:r>
+        <w:t>qwen3.8:27b with think=low is the default judge and student in .env, with gpt-oss:20b kept as the fast judge, about five times quicker. The structured output budget is 4096 tokens, the timeout 600 seconds, and the price is real: 17GB on a 16GB card means 50 to 140 seconds per grading, acceptable for quality runs, wrong for batches.</w:t>
       </w:r>
     </w:p>
     <w:p>
@@ -3364,53 +3544,54 @@
         <w:keepLines/>
       </w:pPr>
       <w:r>
-        <w:rPr>
-          <w:b w:val="0"/>
-        </w:rPr>
-        <w:t>The contest decides, not the spec sheet. Measured on my own cases, the smaller model was unusable as a revision-loop judge while gpt-oss ran the whole ladder cleanly at half the time. The same bake-off format is now the entry exam for any new model.</w:t>
-      </w:r>
-    </w:p>
-    <w:p>
-      <w:pPr/>
-      <w:r>
-        <w:rPr>
-          <w:b/>
-        </w:rPr>
-        <w:t>Phase 16 — Ollama Upgrade and Bake-off Round Two: qwen3.8:27b</w:t>
-      </w:r>
-    </w:p>
-    <w:p>
-      <w:pPr/>
-      <w:r>
-        <w:rPr>
-          <w:b w:val="0"/>
-        </w:rPr>
-        <w:t>The round-one research left an open door: the Qwen 3.x models needed a newer Ollama, and system installs are mine to run. I ran the upgrade myself, 0.17.0 to 0.34.0 with sudo, and pulled qwen3.8:27b, a 17GB model with tools, thinking, and vision. Then the exact same bake-off, no favoritism: 5 cases, strict, both roles.</w:t>
-      </w:r>
-    </w:p>
-    <w:p>
-      <w:pPr/>
-      <w:r>
-        <w:rPr>
-          <w:b w:val="0"/>
-        </w:rPr>
-        <w:t>It passed 5 of 5 with zero nudges, but the number that mattered was a 3. On LOG_001 it was the only judge in three rounds that failed a genuinely decent first draft, and it said precisely why: no hierarchical layer model, no addressing plan, no redundancy. That is a marking scheme doing its job:</w:t>
-      </w:r>
-    </w:p>
-    <w:p>
-      <w:r>
+        <w:t>Round two only happened because round one recorded its method. Upgrade the infrastructure, rerun the identical exam, adopt the winner, keep the runner-up for speed: judge selection in J_AI is now a repeatable procedure instead of a preference.</w:t>
+      </w:r>
+    </w:p>
+    <w:p>
+      <w:pPr>
+        <w:rPr>
+          <w:b/>
+        </w:rPr>
+      </w:pPr>
+      <w:r>
+        <w:rPr>
+          <w:b/>
+        </w:rPr>
+        <w:br w:type="page"/>
+      </w:r>
+    </w:p>
+    <w:p>
+      <w:r>
+        <w:rPr>
+          <w:b/>
+        </w:rPr>
+        <w:lastRenderedPageBreak/>
+        <w:t>Phase 17 — Grading Myself with the Adopted Judge</w:t>
+      </w:r>
+    </w:p>
+    <w:p>
+      <w:r>
+        <w:t>The setup proves itself on my own work. My three ITE402 answers from September 3 went through the real batch path, eval mode into the scoreboard into the report writer, graded by qwen3.8:27b. REQ_001 4/10, REQ_002 1/10, LOG_001 1/10, every verdict a fail, both blank cases stopped by the guard, zero provider errors, and the run file records exactly which judge graded it:</w:t>
+      </w:r>
+    </w:p>
+    <w:p>
+      <w:r>
+        <w:rPr>
+          <w:noProof/>
+        </w:rPr>
         <w:drawing>
-          <wp:inline xmlns:a="http://schemas.openxmlformats.org/drawingml/2006/main" xmlns:pic="http://schemas.openxmlformats.org/drawingml/2006/picture">
-            <wp:extent cx="5760720" cy="2175591"/>
-            <wp:docPr id="1758724913" name="Picture 1758724913"/>
+          <wp:inline distT="0" distB="0" distL="0" distR="0" wp14:anchorId="7AD9E954" wp14:editId="14D940D1">
+            <wp:extent cx="5760720" cy="1836230"/>
+            <wp:effectExtent l="0" t="0" r="0" b="0"/>
+            <wp:docPr id="1758724915" name="Picture 1758724915"/>
             <wp:cNvGraphicFramePr>
-              <a:graphicFrameLocks noChangeAspect="1"/>
+              <a:graphicFrameLocks xmlns:a="http://schemas.openxmlformats.org/drawingml/2006/main" noChangeAspect="1"/>
             </wp:cNvGraphicFramePr>
-            <a:graphic>
+            <a:graphic xmlns:a="http://schemas.openxmlformats.org/drawingml/2006/main">
               <a:graphicData uri="http://schemas.openxmlformats.org/drawingml/2006/picture">
-                <pic:pic>
+                <pic:pic xmlns:pic="http://schemas.openxmlformats.org/drawingml/2006/picture">
                   <pic:nvPicPr>
-                    <pic:cNvPr id="0" name="p16_firstfail.png"/>
+                    <pic:cNvPr id="0" name="p17_scoreboard.png"/>
                     <pic:cNvPicPr/>
                   </pic:nvPicPr>
                   <pic:blipFill>
@@ -3422,9 +3603,11 @@
                   <pic:spPr>
                     <a:xfrm>
                       <a:off x="0" y="0"/>
-                      <a:ext cx="5760720" cy="2175591"/>
+                      <a:ext cx="5760720" cy="1836230"/>
                     </a:xfrm>
-                    <a:prstGeom prst="rect"/>
+                    <a:prstGeom prst="rect">
+                      <a:avLst/>
+                    </a:prstGeom>
                   </pic:spPr>
                 </pic:pic>
               </a:graphicData>
@@ -3434,28 +3617,34 @@
       </w:r>
     </w:p>
     <w:p>
-      <w:pPr/>
-      <w:r>
-        <w:rPr>
-          <w:b w:val="0"/>
-        </w:rPr>
-        <w:t>The revision that followed built the three-tier model, a tabulated addressing plan, and LACP, VRRP/HSRP and RSTP redundancy, and the judge raised it to 8 while still catching a subtle inaccuracy in the revised text, with the quote to prove it:</w:t>
-      </w:r>
-    </w:p>
-    <w:p>
-      <w:r>
+      <w:r>
+        <w:t>The verdicts agree with llama3 and qwen2.5 on the outcome but finally state the reasons with evidence. I described staff rosters instead of a network. I conflated a server with a switch, and the judge quoted me doing it: a server does not connect PCs to a network, switches and routers perform that role. I wrote portal where segmentation was needed. The recall gap from September 3 is unchanged, but it is now named precisely: answer the engineering framework, goals, constraints, segmentation, addressing, routing, redundancy, not the operation.</w:t>
+      </w:r>
+    </w:p>
+    <w:p>
+      <w:r>
+        <w:t>The session closed with the agent getting a proper test suite: tests/test_student_agent.py, ten tests driven by a scripted fake provider so no model is needed, covering the unknown-tool refusal, a provider_error inside the loop, an empty reply, the step cap, the nudge cap, the budget forcing a final answer, the strict override, and the check that the answer key never leaks to the student:</w:t>
+      </w:r>
+    </w:p>
+    <w:p>
+      <w:r>
+        <w:rPr>
+          <w:noProof/>
+        </w:rPr>
+        <w:lastRenderedPageBreak/>
         <w:drawing>
-          <wp:inline xmlns:a="http://schemas.openxmlformats.org/drawingml/2006/main" xmlns:pic="http://schemas.openxmlformats.org/drawingml/2006/picture">
-            <wp:extent cx="5760720" cy="1472184"/>
-            <wp:docPr id="1758724914" name="Picture 1758724914"/>
+          <wp:inline distT="0" distB="0" distL="0" distR="0" wp14:anchorId="6D984ACB" wp14:editId="067A48C8">
+            <wp:extent cx="5760720" cy="2880360"/>
+            <wp:effectExtent l="0" t="0" r="0" b="0"/>
+            <wp:docPr id="1758724916" name="Picture 1758724916"/>
             <wp:cNvGraphicFramePr>
-              <a:graphicFrameLocks noChangeAspect="1"/>
+              <a:graphicFrameLocks xmlns:a="http://schemas.openxmlformats.org/drawingml/2006/main" noChangeAspect="1"/>
             </wp:cNvGraphicFramePr>
-            <a:graphic>
+            <a:graphic xmlns:a="http://schemas.openxmlformats.org/drawingml/2006/main">
               <a:graphicData uri="http://schemas.openxmlformats.org/drawingml/2006/picture">
-                <pic:pic>
+                <pic:pic xmlns:pic="http://schemas.openxmlformats.org/drawingml/2006/picture">
                   <pic:nvPicPr>
-                    <pic:cNvPr id="0" name="p16_revision.png"/>
+                    <pic:cNvPr id="0" name="p17_tests.png"/>
                     <pic:cNvPicPr/>
                   </pic:nvPicPr>
                   <pic:blipFill>
@@ -3467,9 +3656,11 @@
                   <pic:spPr>
                     <a:xfrm>
                       <a:off x="0" y="0"/>
-                      <a:ext cx="5760720" cy="1472184"/>
+                      <a:ext cx="5760720" cy="2880360"/>
                     </a:xfrm>
-                    <a:prstGeom prst="rect"/>
+                    <a:prstGeom prst="rect">
+                      <a:avLst/>
+                    </a:prstGeom>
                   </pic:spPr>
                 </pic:pic>
               </a:graphicData>
@@ -3479,15 +3670,6 @@
       </w:r>
     </w:p>
     <w:p>
-      <w:pPr/>
-      <w:r>
-        <w:rPr>
-          <w:b w:val="0"/>
-        </w:rPr>
-        <w:t>Cross-grading sealed it. Handed a gpt-oss answer that gpt-oss had scored 10, qwen3.8 found a counting error, a misused spine-leaf term, and a ports-versus-uplinks confusion, each backed by a quote from the answer. Weak control answers moved from 0 to 1, partial controls from 1 to 4, all fails, which is the score spread the generous judge could not produce. One real bug surfaced and was fixed on the spot: 3 of 17 verdicts came back as provider_error because thinking tokens ate the 1024-token structured budget before the JSON appeared, so JAI_STRUCTURED_MAX_TOKENS is now 4096 and the timeout guidance is 600 seconds.</w:t>
-      </w:r>
-    </w:p>
-    <w:p>
       <w:pPr>
         <w:keepNext/>
         <w:keepLines/>
@@ -3500,12 +3682,8 @@
       </w:r>
     </w:p>
     <w:p>
-      <w:pPr/>
-      <w:r>
-        <w:rPr>
-          <w:b w:val="0"/>
-        </w:rPr>
-        <w:t>qwen3.8:27b with think=low is the default judge and student in .env, with gpt-oss:20b kept as the fast judge, about five times quicker. The structured output budget is 4096 tokens, the timeout 600 seconds, and the price is real: 17GB on a 16GB card means 50 to 140 seconds per grading, acceptable for quality runs, wrong for batches.</w:t>
+      <w:r>
+        <w:t>The adopted judge grades my real answers with quoted evidence through the full batch path, the report is filed with the repo, and the agent's guardrails are pinned by ten green unit tests that run in a millisecond without a model.</w:t>
       </w:r>
     </w:p>
     <w:p>
@@ -3525,44 +3703,59 @@
         <w:keepLines/>
       </w:pPr>
       <w:r>
-        <w:rPr>
-          <w:b w:val="0"/>
-        </w:rPr>
-        <w:t>Round two only happened because round one recorded its method. Upgrade the infrastructure, rerun the identical exam, adopt the winner, keep the runner-up for speed: judge selection in J_AI is now a repeatable procedure instead of a preference.</w:t>
-      </w:r>
-    </w:p>
-    <w:p>
-      <w:pPr/>
-      <w:r>
-        <w:rPr>
-          <w:b/>
-        </w:rPr>
-        <w:t>Phase 17 — Grading Myself with the Adopted Judge</w:t>
-      </w:r>
-    </w:p>
-    <w:p>
-      <w:pPr/>
-      <w:r>
-        <w:rPr>
-          <w:b w:val="0"/>
-        </w:rPr>
-        <w:t>The setup proves itself on my own work. My three ITE402 answers from September 3 went through the real batch path, eval mode into the scoreboard into the report writer, graded by qwen3.8:27b. REQ_001 4/10, REQ_002 1/10, LOG_001 1/10, every verdict a fail, both blank cases stopped by the guard, zero provider errors, and the run file records exactly which judge graded it:</w:t>
-      </w:r>
-    </w:p>
-    <w:p>
-      <w:r>
+        <w:t>The judge is now better at naming my gap than I am at hiding it. The next honest measure is not another tool: re-answer REQ_002 and LOG_001 framework-first and regrade, and see whether the number moves.</w:t>
+      </w:r>
+    </w:p>
+    <w:p>
+      <w:pPr>
+        <w:rPr>
+          <w:b/>
+        </w:rPr>
+      </w:pPr>
+      <w:r>
+        <w:rPr>
+          <w:b/>
+        </w:rPr>
+        <w:br w:type="page"/>
+      </w:r>
+    </w:p>
+    <w:p>
+      <w:r>
+        <w:rPr>
+          <w:b/>
+        </w:rPr>
+        <w:lastRenderedPageBreak/>
+        <w:t>Phase 18 — v1.0 Hardening and Pre-registered Final Tests</w:t>
+      </w:r>
+    </w:p>
+    <w:p>
+      <w:r>
+        <w:t>Calling J_AI finished meant a stranger could clone it, install it, and run it, so I tested exactly that. A clean clone following my own install guide failed on its first command: the provider factory imported the optional OpenAI package at startup, so a tool that never touches OpenAI could not start without it. A lazy import and a requirements file fixed it, and a test now guards it. The same day I closed the decision that had been open since the student agent found it: the pass line is a rule, so it moved into the runner as code. A judge "pass" with more required points missing than the case's min_points allows becomes a fail, and the judge's own verdict is kept beside it in the run file. The unit tests grew from 10 to 22, all running without a model.</w:t>
+      </w:r>
+    </w:p>
+    <w:p>
+      <w:r>
+        <w:t>Then the final tests, designed so the result could not be tuned afterwards. I wrote two answer sets in my own answering style: Test A meant to pass three cases and fail two, Test B meant to fail all five. The answers and my predictions were hashed with sha256 at 09:54, before anything was graded, and every run checked the hashes first. Test A scored 9, 2, 8, 9, 2 on two separate runs, identical both times. Test B scored 3, 1, 1, 1, 1. Fifteen of fifteen predictions matched.</w:t>
+      </w:r>
+    </w:p>
+    <w:p>
+      <w:r>
+        <w:rPr>
+          <w:noProof/>
+        </w:rPr>
         <w:drawing>
-          <wp:inline xmlns:a="http://schemas.openxmlformats.org/drawingml/2006/main" xmlns:pic="http://schemas.openxmlformats.org/drawingml/2006/picture">
-            <wp:extent cx="5760720" cy="1836230"/>
-            <wp:docPr id="1758724915" name="Picture 1758724915"/>
+          <wp:inline distT="0" distB="0" distL="0" distR="0" wp14:anchorId="1C46DE06" wp14:editId="65C05CF3">
+            <wp:extent cx="5760720" cy="2902969"/>
+            <wp:effectExtent l="0" t="0" r="0" b="0"/>
+            <wp:docPr id="1758724917" name="Picture 1758724917"/>
             <wp:cNvGraphicFramePr>
-              <a:graphicFrameLocks noChangeAspect="1"/>
+              <a:graphicFrameLocks xmlns:a="http://schemas.openxmlformats.org/drawingml/2006/main" noChangeAspect="1"/>
             </wp:cNvGraphicFramePr>
-            <a:graphic>
+            <a:graphic xmlns:a="http://schemas.openxmlformats.org/drawingml/2006/main">
               <a:graphicData uri="http://schemas.openxmlformats.org/drawingml/2006/picture">
-                <pic:pic>
+                <pic:pic xmlns:pic="http://schemas.openxmlformats.org/drawingml/2006/picture">
                   <pic:nvPicPr>
-                    <pic:cNvPr id="0" name="p17_scoreboard.png"/>
+                    <pic:cNvPr id="0" name="test_a_6_scoreboard.png"/>
                     <pic:cNvPicPr/>
                   </pic:nvPicPr>
                   <pic:blipFill>
@@ -3574,9 +3767,11 @@
                   <pic:spPr>
                     <a:xfrm>
                       <a:off x="0" y="0"/>
-                      <a:ext cx="5760720" cy="1836230"/>
+                      <a:ext cx="5760720" cy="2902969"/>
                     </a:xfrm>
-                    <a:prstGeom prst="rect"/>
+                    <a:prstGeom prst="rect">
+                      <a:avLst/>
+                    </a:prstGeom>
                   </pic:spPr>
                 </pic:pic>
               </a:graphicData>
@@ -3586,37 +3781,24 @@
       </w:r>
     </w:p>
     <w:p>
-      <w:pPr/>
-      <w:r>
-        <w:rPr>
-          <w:b w:val="0"/>
-        </w:rPr>
-        <w:t>The verdicts agree with llama3 and qwen2.5 on the outcome but finally state the reasons with evidence. I described staff rosters instead of a network. I conflated a server with a switch, and the judge quoted me doing it: a server does not connect PCs to a network, switches and routers perform that role. I wrote portal where segmentation was needed. The recall gap from September 3 is unchanged, but it is now named precisely: answer the engineering framework, goals, constraints, segmentation, addressing, routing, redundancy, not the operation.</w:t>
-      </w:r>
-    </w:p>
-    <w:p>
-      <w:pPr/>
-      <w:r>
-        <w:rPr>
-          <w:b w:val="0"/>
-        </w:rPr>
-        <w:t>The session closed with the agent getting a proper test suite: tests/test_student_agent.py, ten tests driven by a scripted fake provider so no model is needed, covering the unknown-tool refusal, a provider_error inside the loop, an empty reply, the step cap, the nudge cap, the budget forcing a final answer, the strict override, and the check that the answer key never leaks to the student:</w:t>
-      </w:r>
-    </w:p>
-    <w:p>
-      <w:r>
+      <w:r>
+        <w:rPr>
+          <w:noProof/>
+        </w:rPr>
+        <w:lastRenderedPageBreak/>
         <w:drawing>
-          <wp:inline xmlns:a="http://schemas.openxmlformats.org/drawingml/2006/main" xmlns:pic="http://schemas.openxmlformats.org/drawingml/2006/picture">
-            <wp:extent cx="5760720" cy="2880360"/>
-            <wp:docPr id="1758724916" name="Picture 1758724916"/>
+          <wp:inline distT="0" distB="0" distL="0" distR="0" wp14:anchorId="1FBACF24" wp14:editId="5CA94B07">
+            <wp:extent cx="5760720" cy="3139320"/>
+            <wp:effectExtent l="0" t="0" r="0" b="0"/>
+            <wp:docPr id="1758724918" name="Picture 1758724918"/>
             <wp:cNvGraphicFramePr>
-              <a:graphicFrameLocks noChangeAspect="1"/>
+              <a:graphicFrameLocks xmlns:a="http://schemas.openxmlformats.org/drawingml/2006/main" noChangeAspect="1"/>
             </wp:cNvGraphicFramePr>
-            <a:graphic>
+            <a:graphic xmlns:a="http://schemas.openxmlformats.org/drawingml/2006/main">
               <a:graphicData uri="http://schemas.openxmlformats.org/drawingml/2006/picture">
-                <pic:pic>
+                <pic:pic xmlns:pic="http://schemas.openxmlformats.org/drawingml/2006/picture">
                   <pic:nvPicPr>
-                    <pic:cNvPr id="0" name="p17_tests.png"/>
+                    <pic:cNvPr id="0" name="test_b_6_scoreboard.png"/>
                     <pic:cNvPicPr/>
                   </pic:nvPicPr>
                   <pic:blipFill>
@@ -3628,9 +3810,11 @@
                   <pic:spPr>
                     <a:xfrm>
                       <a:off x="0" y="0"/>
-                      <a:ext cx="5760720" cy="2880360"/>
+                      <a:ext cx="5760720" cy="3139320"/>
                     </a:xfrm>
-                    <a:prstGeom prst="rect"/>
+                    <a:prstGeom prst="rect">
+                      <a:avLst/>
+                    </a:prstGeom>
                   </pic:spPr>
                 </pic:pic>
               </a:graphicData>
@@ -3640,6 +3824,11 @@
       </w:r>
     </w:p>
     <w:p>
+      <w:r>
+        <w:t>Two more checks closed it. An answer that told the examiner to ignore the marking scheme and return a 10 scored 0, and the judge listed the injection attempt itself as an error. And the live student agent finally showed the new check doing its job: on the first submission the judge said pass while listing redundancy as missing, the runner turned it into a fail, the agent added redundancy, and the second submission passed at 8.</w:t>
+      </w:r>
+    </w:p>
+    <w:p>
       <w:pPr>
         <w:keepNext/>
         <w:keepLines/>
@@ -3652,12 +3841,8 @@
       </w:r>
     </w:p>
     <w:p>
-      <w:pPr/>
-      <w:r>
-        <w:rPr>
-          <w:b w:val="0"/>
-        </w:rPr>
-        <w:t>The adopted judge grades my real answers with quoted evidence through the full batch path, the report is filed with the repo, and the agent's guardrails are pinned by ten green unit tests that run in a millisecond without a model.</w:t>
+      <w:r>
+        <w:t>J_AI v1.0 is tagged and released: a clean install, a pass line held in code, 22 unit tests, and pre-registered final tests in which every prediction matched, including a resisted prompt injection and a live agent run that triggered the marking-scheme check.</w:t>
       </w:r>
     </w:p>
     <w:p>
@@ -3677,53 +3862,54 @@
         <w:keepLines/>
       </w:pPr>
       <w:r>
-        <w:rPr>
-          <w:b w:val="0"/>
-        </w:rPr>
-        <w:t>The judge is now better at naming my gap than I am at hiding it. The next honest measure is not another tool: re-answer REQ_002 and LOG_001 framework-first and regrade, and see whether the number moves.</w:t>
-      </w:r>
-    </w:p>
-    <w:p>
-      <w:pPr/>
-      <w:r>
-        <w:rPr>
-          <w:b/>
-        </w:rPr>
-        <w:t xml:space="preserve">Phase 18 — v1.0 Hardening and Pre-registered Final Tests</w:t>
-      </w:r>
-    </w:p>
-    <w:p>
-      <w:pPr/>
-      <w:r>
-        <w:rPr>
-          <w:b w:val="0"/>
-        </w:rPr>
-        <w:t xml:space="preserve">Calling J_AI finished meant a stranger could clone it, install it, and run it, so I tested exactly that. A clean clone following my own install guide failed on its first command: the provider factory imported the optional OpenAI package at startup, so a tool that never touches OpenAI could not start without it. A lazy import and a requirements file fixed it, and a test now guards it. The same day I closed the decision that had been open since the student agent found it: the pass line is a rule, so it moved into the runner as code. A judge "pass" with more required points missing than the case's min_points allows becomes a fail, and the judge's own verdict is kept beside it in the run file. The unit tests grew from 10 to 22, all running without a model.</w:t>
-      </w:r>
-    </w:p>
-    <w:p>
-      <w:pPr/>
-      <w:r>
-        <w:rPr>
-          <w:b w:val="0"/>
-        </w:rPr>
-        <w:t xml:space="preserve">Then the final tests, designed so the result could not be tuned afterwards. I wrote two answer sets in my own answering style: Test A meant to pass three cases and fail two, Test B meant to fail all five. The answers and my predictions were hashed with sha256 at 09:54, before anything was graded, and every run checked the hashes first. Test A scored 9, 2, 8, 9, 2 on two separate runs, identical both times. Test B scored 3, 1, 1, 1, 1. Fifteen of fifteen predictions matched.</w:t>
-      </w:r>
-    </w:p>
-    <w:p>
-      <w:r>
+        <w:t>A test you can adjust after seeing the result proves nothing. Writing the prediction down and hashing it before grading is what made these results worth showing.</w:t>
+      </w:r>
+    </w:p>
+    <w:p>
+      <w:pPr>
+        <w:rPr>
+          <w:b/>
+        </w:rPr>
+      </w:pPr>
+      <w:r>
+        <w:rPr>
+          <w:b/>
+        </w:rPr>
+        <w:br w:type="page"/>
+      </w:r>
+    </w:p>
+    <w:p>
+      <w:r>
+        <w:rPr>
+          <w:b/>
+        </w:rPr>
+        <w:lastRenderedPageBreak/>
+        <w:t>Phase 19 — Hardware Comparison and GPU Capability</w:t>
+      </w:r>
+    </w:p>
+    <w:p>
+      <w:r>
+        <w:t>The adopted judge, qwen3.8:27b, is 17 GB and my RTX 5080 has 16 GB, so part of it always runs from system RAM. I measured what that costs with one case, LOG_001, and the same answer graded four ways. The harness changed nothing in J_AI: it only set Ollama's num_gpu option and read Ollama's own timing figures. Mixed, as it runs every day, qwen3.8 graded in 82 seconds at 15.1 tokens a second. Forced onto the CPU alone it took 365 seconds at 3.7 tokens a second, used 18.4 GB of the 23 GB WSL has, and pushed 3 GB into swap. gpt-oss:20b, which fits the card completely, graded in about one second at 165 tokens a second, and the same model on the CPU took 27 seconds at 8.5.</w:t>
+      </w:r>
+    </w:p>
+    <w:p>
+      <w:r>
+        <w:rPr>
+          <w:noProof/>
+        </w:rPr>
         <w:drawing>
-          <wp:inline xmlns:a="http://schemas.openxmlformats.org/drawingml/2006/main" xmlns:pic="http://schemas.openxmlformats.org/drawingml/2006/picture">
-            <wp:extent cx="5760720" cy="2902969"/>
-            <wp:docPr id="1758724917" name="Picture 1758724917"/>
+          <wp:inline distT="0" distB="0" distL="0" distR="0" wp14:anchorId="65B03929" wp14:editId="348DD022">
+            <wp:extent cx="5760720" cy="3051470"/>
+            <wp:effectExtent l="0" t="0" r="0" b="0"/>
+            <wp:docPr id="1758724919" name="Picture 1758724919"/>
             <wp:cNvGraphicFramePr>
-              <a:graphicFrameLocks noChangeAspect="1"/>
+              <a:graphicFrameLocks xmlns:a="http://schemas.openxmlformats.org/drawingml/2006/main" noChangeAspect="1"/>
             </wp:cNvGraphicFramePr>
-            <a:graphic>
+            <a:graphic xmlns:a="http://schemas.openxmlformats.org/drawingml/2006/main">
               <a:graphicData uri="http://schemas.openxmlformats.org/drawingml/2006/picture">
-                <pic:pic>
+                <pic:pic xmlns:pic="http://schemas.openxmlformats.org/drawingml/2006/picture">
                   <pic:nvPicPr>
-                    <pic:cNvPr id="0" name="test_a_6_scoreboard.png"/>
+                    <pic:cNvPr id="0" name="hardware_results.png"/>
                     <pic:cNvPicPr/>
                   </pic:nvPicPr>
                   <pic:blipFill>
@@ -3735,9 +3921,11 @@
                   <pic:spPr>
                     <a:xfrm>
                       <a:off x="0" y="0"/>
-                      <a:ext cx="5760720" cy="2902969"/>
+                      <a:ext cx="5760720" cy="3051470"/>
                     </a:xfrm>
-                    <a:prstGeom prst="rect"/>
+                    <a:prstGeom prst="rect">
+                      <a:avLst/>
+                    </a:prstGeom>
                   </pic:spPr>
                 </pic:pic>
               </a:graphicData>
@@ -3748,47 +3936,7 @@
     </w:p>
     <w:p>
       <w:r>
-        <w:drawing>
-          <wp:inline xmlns:a="http://schemas.openxmlformats.org/drawingml/2006/main" xmlns:pic="http://schemas.openxmlformats.org/drawingml/2006/picture">
-            <wp:extent cx="5760720" cy="3139320"/>
-            <wp:docPr id="1758724918" name="Picture 1758724918"/>
-            <wp:cNvGraphicFramePr>
-              <a:graphicFrameLocks noChangeAspect="1"/>
-            </wp:cNvGraphicFramePr>
-            <a:graphic>
-              <a:graphicData uri="http://schemas.openxmlformats.org/drawingml/2006/picture">
-                <pic:pic>
-                  <pic:nvPicPr>
-                    <pic:cNvPr id="0" name="test_b_6_scoreboard.png"/>
-                    <pic:cNvPicPr/>
-                  </pic:nvPicPr>
-                  <pic:blipFill>
-                    <a:blip r:embed="rId37"/>
-                    <a:stretch>
-                      <a:fillRect/>
-                    </a:stretch>
-                  </pic:blipFill>
-                  <pic:spPr>
-                    <a:xfrm>
-                      <a:off x="0" y="0"/>
-                      <a:ext cx="5760720" cy="3139320"/>
-                    </a:xfrm>
-                    <a:prstGeom prst="rect"/>
-                  </pic:spPr>
-                </pic:pic>
-              </a:graphicData>
-            </a:graphic>
-          </wp:inline>
-        </w:drawing>
-      </w:r>
-    </w:p>
-    <w:p>
-      <w:pPr/>
-      <w:r>
-        <w:rPr>
-          <w:b w:val="0"/>
-        </w:rPr>
-        <w:t xml:space="preserve">Two more checks closed it. An answer that told the examiner to ignore the marking scheme and return a 10 scored 0, and the judge listed the injection attempt itself as an error. And the live student agent finally showed the new check doing its job: on the first submission the judge said pass while listing redundancy as missing, the runner turned it into a fail, the agent added redundancy, and the second submission passed at 8.</w:t>
+        <w:t>The numbers say where the model sits matters more than its size. A model fully on the GPU is about 19 times faster than on the CPU, but a model that spills keeps only a fraction of that advantage, because every token still waits on the part in system RAM. The verdict held on all four setups, while the score moved by one point between the GPU and CPU runs of the same model. Alongside J_AI I also tested the card on a different kind of model: I fine-tuned DistilBERT on the IMDB movie reviews dataset, 25,000 reviews for three epochs, and published it on Hugging Face as Niophy/distilbert-imdb-sentiment. Test accuracy rose from 88.5% to 91.2%, while test loss rose after the first epoch, a sign of mild overfitting that the model card states.</w:t>
       </w:r>
     </w:p>
     <w:p>
@@ -3800,16 +3948,13 @@
         <w:rPr>
           <w:b/>
         </w:rPr>
-        <w:t xml:space="preserve">Result:</w:t>
-      </w:r>
-    </w:p>
-    <w:p>
-      <w:pPr/>
-      <w:r>
-        <w:rPr>
-          <w:b w:val="0"/>
-        </w:rPr>
-        <w:t xml:space="preserve">J_AI v1.0 is tagged and released: a clean install, a pass line held in code, 22 unit tests, and pre-registered final tests in which every prediction matched, including a resisted prompt injection and a live agent run that triggered the marking-scheme check.</w:t>
+        <w:lastRenderedPageBreak/>
+        <w:t>Result:</w:t>
+      </w:r>
+    </w:p>
+    <w:p>
+      <w:r>
+        <w:t>Measured on my machine: 1 second on the GPU, 82 seconds mixed, 365 seconds on the CPU, with the verdict unchanged. A separate GPU capability test produced a published DistilBERT sentiment model at 91.2% test accuracy.</w:t>
       </w:r>
     </w:p>
     <w:p>
@@ -3821,125 +3966,15 @@
         <w:rPr>
           <w:b/>
         </w:rPr>
-        <w:t xml:space="preserve">Outcome:</w:t>
-      </w:r>
-    </w:p>
-    <w:p>
-      <w:pPr>
-        <w:keepLines/>
-      </w:pPr>
-      <w:r>
-        <w:rPr>
-          <w:b w:val="0"/>
-        </w:rPr>
-        <w:t xml:space="preserve">A test you can adjust after seeing the result proves nothing. Writing the prediction down and hashing it before grading is what made these results worth showing.</w:t>
-      </w:r>
-    </w:p>
-    <w:p>
-      <w:pPr/>
-      <w:r>
-        <w:rPr>
-          <w:b/>
-        </w:rPr>
-        <w:t xml:space="preserve">Phase 19 — Hardware Comparison and GPU Capability</w:t>
-      </w:r>
-    </w:p>
-    <w:p>
-      <w:pPr/>
-      <w:r>
-        <w:rPr>
-          <w:b w:val="0"/>
-        </w:rPr>
-        <w:t xml:space="preserve">The adopted judge, qwen3.8:27b, is 17 GB and my RTX 5080 has 16 GB, so part of it always runs from system RAM. I measured what that costs with one case, LOG_001, and the same answer graded four ways. The harness changed nothing in J_AI: it only set Ollama's num_gpu option and read Ollama's own timing figures. Mixed, as it runs every day, qwen3.8 graded in 82 seconds at 15.1 tokens a second. Forced onto the CPU alone it took 365 seconds at 3.7 tokens a second, used 18.4 GB of the 23 GB WSL has, and pushed 3 GB into swap. gpt-oss:20b, which fits the card completely, graded in about one second at 165 tokens a second, and the same model on the CPU took 27 seconds at 8.5.</w:t>
-      </w:r>
-    </w:p>
-    <w:p>
-      <w:r>
-        <w:drawing>
-          <wp:inline xmlns:a="http://schemas.openxmlformats.org/drawingml/2006/main" xmlns:pic="http://schemas.openxmlformats.org/drawingml/2006/picture">
-            <wp:extent cx="5760720" cy="3051470"/>
-            <wp:docPr id="1758724919" name="Picture 1758724919"/>
-            <wp:cNvGraphicFramePr>
-              <a:graphicFrameLocks noChangeAspect="1"/>
-            </wp:cNvGraphicFramePr>
-            <a:graphic>
-              <a:graphicData uri="http://schemas.openxmlformats.org/drawingml/2006/picture">
-                <pic:pic>
-                  <pic:nvPicPr>
-                    <pic:cNvPr id="0" name="hardware_results.png"/>
-                    <pic:cNvPicPr/>
-                  </pic:nvPicPr>
-                  <pic:blipFill>
-                    <a:blip r:embed="rId38"/>
-                    <a:stretch>
-                      <a:fillRect/>
-                    </a:stretch>
-                  </pic:blipFill>
-                  <pic:spPr>
-                    <a:xfrm>
-                      <a:off x="0" y="0"/>
-                      <a:ext cx="5760720" cy="3051470"/>
-                    </a:xfrm>
-                    <a:prstGeom prst="rect"/>
-                  </pic:spPr>
-                </pic:pic>
-              </a:graphicData>
-            </a:graphic>
-          </wp:inline>
-        </w:drawing>
-      </w:r>
-    </w:p>
-    <w:p>
-      <w:pPr/>
-      <w:r>
-        <w:rPr>
-          <w:b w:val="0"/>
-        </w:rPr>
-        <w:t xml:space="preserve">The numbers say where the model sits matters more than its size. A model fully on the GPU is about 19 times faster than on the CPU, but a model that spills keeps only a fraction of that advantage, because every token still waits on the part in system RAM. The verdict held on all four setups, while the score moved by one point between the GPU and CPU runs of the same model. Alongside J_AI I also tested the card on a different kind of model: I fine-tuned DistilBERT on the IMDB movie reviews dataset, 25,000 reviews for three epochs, and published it on Hugging Face as Niophy/distilbert-imdb-sentiment. Test accuracy rose from 88.5% to 91.2%, while test loss rose after the first epoch, a sign of mild overfitting that the model card states.</w:t>
-      </w:r>
-    </w:p>
-    <w:p>
-      <w:pPr>
-        <w:keepNext/>
-        <w:keepLines/>
-      </w:pPr>
-      <w:r>
-        <w:rPr>
-          <w:b/>
-        </w:rPr>
-        <w:t xml:space="preserve">Result:</w:t>
-      </w:r>
-    </w:p>
-    <w:p>
-      <w:pPr/>
-      <w:r>
-        <w:rPr>
-          <w:b w:val="0"/>
-        </w:rPr>
-        <w:t xml:space="preserve">Measured on my machine: 1 second on the GPU, 82 seconds mixed, 365 seconds on the CPU, with the verdict unchanged. A separate GPU capability test produced a published DistilBERT sentiment model at 91.2% test accuracy.</w:t>
-      </w:r>
-    </w:p>
-    <w:p>
-      <w:pPr>
-        <w:keepNext/>
-        <w:keepLines/>
-      </w:pPr>
-      <w:r>
-        <w:rPr>
-          <w:b/>
-        </w:rPr>
-        <w:t xml:space="preserve">Outcome:</w:t>
-      </w:r>
-    </w:p>
-    <w:p>
-      <w:pPr>
-        <w:keepLines/>
-      </w:pPr>
-      <w:r>
-        <w:rPr>
-          <w:b w:val="0"/>
-        </w:rPr>
-        <w:t xml:space="preserve">Choosing a model is also choosing hardware. The quality judge costs 82 seconds a grading on this card, and that is now a measured trade-off rather than a feeling.</w:t>
+        <w:t>Outcome:</w:t>
+      </w:r>
+    </w:p>
+    <w:p>
+      <w:pPr>
+        <w:keepLines/>
+      </w:pPr>
+      <w:r>
+        <w:t>Choosing a model is also choosing hardware. The quality judge costs 82 seconds a grading on this card, and that is now a measured trade-off rather than a feeling.</w:t>
       </w:r>
     </w:p>
     <w:sectPr>

</xml_diff>

<commit_message>
JADE v2.1: score computed from the marking scheme; bias check round 3
- runner: apply_points_score sets score = 10 x required points covered / required (half up); judge score kept in score_check; judge 0 kept; verdict never touched; JAI_SCORE_FROM_POINTS=0 switches it off
- Why: the v2.0 bias check showed strong answers with 0 points missing still losing 1 to 2 points in rough English, so the bias sat in the judge's free score
- Bias check round 3, registered before grading: 8 of 8 gradings matched the prediction; strong pairs now 10/10 (gap 0); criterion still fails on SEC_001 (2 polished, 4 rough) because the judge misses one absent point in the rough version in every round; documented, including where the registered explanation was wrong
- Regression: stored Test A and B judge outputs re-scored with the rule, 10 of 10 predictions still match
- 42 tests (7 new); README, USAGE, SPEC, .env.example, bias_check README, Journal Phase 21
</commit_message>
<xml_diff>
--- a/docs/Project Journal - J_AI.docx
+++ b/docs/Project Journal - J_AI.docx
@@ -4037,6 +4037,63 @@
       </w:pPr>
       <w:r>
         <w:t xml:space="preserve">A test that can fail, and did, is worth more than one that only passes. Registering the prediction first is what turned an uncomfortable result into a fix and an honest limitation.</w:t>
+      </w:r>
+    </w:p>
+    <w:p>
+      <w:r>
+        <w:rPr>
+          <w:b/>
+        </w:rPr>
+        <w:lastRenderedPageBreak/>
+        <w:t xml:space="preserve">Phase 21 — JADE v2.1: Moving the Score into Code</w:t>
+      </w:r>
+    </w:p>
+    <w:p>
+      <w:r>
+        <w:t xml:space="preserve">The v2.0 bias check left one answer losing 2 points in rough English. Before fixing it I looked at where the points went: in all three strong pairs both versions had zero required points missing, yet the rough one scored lower. The penalty was not in what the judge found but in the number it chose. So the score followed the pass line into code: 10 times the share of required points covered, with the judge's own number kept beside it and the verdict left alone.</w:t>
+      </w:r>
+    </w:p>
+    <w:p>
+      <w:r>
+        <w:t xml:space="preserve">I registered a third round before grading, with a prediction worked out from round two: strong pairs at 10 and 10, and the criterion still failing on the weak security answer, 2 against 4, because the judge had counted one point differently there. All 8 gradings matched. Reading the two answers side by side afterwards, neither isolates the public website, and the judge misses that only in the rough version, in every round. My registered explanation called it point counting rather than language; because it repeats, that part was wrong, and the report says so. Test A and B outputs re-scored under the rule still match 10 of 10.</w:t>
+      </w:r>
+    </w:p>
+    <w:p>
+      <w:pPr>
+        <w:keepNext/>
+        <w:keepLines/>
+      </w:pPr>
+      <w:r>
+        <w:rPr>
+          <w:b/>
+        </w:rPr>
+        <w:lastRenderedPageBreak/>
+        <w:t xml:space="preserve">Result:</w:t>
+      </w:r>
+    </w:p>
+    <w:p>
+      <w:r>
+        <w:t xml:space="preserve">JADE v2.1 is released with a points-based score and 42 unit tests. The language penalty on strong answers is gone; one weak answer still gains 2 points in rough English because the judge overlooks a missing point, and that is documented.</w:t>
+      </w:r>
+    </w:p>
+    <w:p>
+      <w:pPr>
+        <w:keepNext/>
+        <w:keepLines/>
+      </w:pPr>
+      <w:r>
+        <w:rPr>
+          <w:b/>
+        </w:rPr>
+        <w:t xml:space="preserve">Outcome:</w:t>
+      </w:r>
+    </w:p>
+    <w:p>
+      <w:pPr>
+        <w:keepLines/>
+      </w:pPr>
+      <w:r>
+        <w:t xml:space="preserve">Find where a bias lives before fixing it. The data put it in the judge's free score, so the score became a rule in code, the same move that fixed the pass line in v1.0.</w:t>
       </w:r>
     </w:p>
     <w:sectPr>

</xml_diff>